<commit_message>
fix dbclick failed to open techno dlg in flat mode
</commit_message>
<xml_diff>
--- a/Supplementary/文档/FA2SP HDM Edition说明文档.docx
+++ b/Supplementary/文档/FA2SP HDM Edition说明文档.docx
@@ -167,7 +167,7 @@
           <w:rFonts w:ascii="宋体" w:eastAsia="宋体" w:hAnsi="宋体" w:hint="eastAsia"/>
           <w:sz w:val="24"/>
         </w:rPr>
-        <w:t>5</w:t>
+        <w:t>6</w:t>
       </w:r>
     </w:p>
     <w:p>
@@ -249,17 +249,7 @@
           <w:sz w:val="28"/>
           <w:szCs w:val="32"/>
         </w:rPr>
-        <w:t>0</w:t>
-      </w:r>
-      <w:r>
-        <w:rPr>
-          <w:rFonts w:ascii="Times New Roman" w:eastAsia="宋体" w:hAnsi="Times New Roman" w:cs="Times New Roman" w:hint="eastAsia"/>
-          <w:b/>
-          <w:bCs/>
-          <w:sz w:val="28"/>
-          <w:szCs w:val="32"/>
-        </w:rPr>
-        <w:t>5</w:t>
+        <w:t>06</w:t>
       </w:r>
       <w:r>
         <w:rPr>
@@ -580,6 +570,42 @@
         <w:pStyle w:val="a9"/>
         <w:numPr>
           <w:ilvl w:val="0"/>
+          <w:numId w:val="11"/>
+        </w:numPr>
+        <w:rPr>
+          <w:rFonts w:ascii="Times New Roman" w:eastAsia="宋体" w:hAnsi="Times New Roman" w:cs="Times New Roman"/>
+        </w:rPr>
+      </w:pPr>
+      <w:r>
+        <w:rPr>
+          <w:rFonts w:ascii="Times New Roman" w:eastAsia="宋体" w:hAnsi="Times New Roman" w:cs="Times New Roman" w:hint="eastAsia"/>
+        </w:rPr>
+        <w:t>修复在开启平面显示且开启高</w:t>
+      </w:r>
+      <w:r>
+        <w:rPr>
+          <w:rFonts w:ascii="Times New Roman" w:eastAsia="宋体" w:hAnsi="Times New Roman" w:cs="Times New Roman" w:hint="eastAsia"/>
+        </w:rPr>
+        <w:t>DPI</w:t>
+      </w:r>
+      <w:r>
+        <w:rPr>
+          <w:rFonts w:ascii="Times New Roman" w:eastAsia="宋体" w:hAnsi="Times New Roman" w:cs="Times New Roman" w:hint="eastAsia"/>
+        </w:rPr>
+        <w:t>的情况下双击单位无法打开属性窗口的</w:t>
+      </w:r>
+      <w:r>
+        <w:rPr>
+          <w:rFonts w:ascii="Times New Roman" w:eastAsia="宋体" w:hAnsi="Times New Roman" w:cs="Times New Roman" w:hint="eastAsia"/>
+        </w:rPr>
+        <w:t>bug</w:t>
+      </w:r>
+    </w:p>
+    <w:p>
+      <w:pPr>
+        <w:pStyle w:val="a9"/>
+        <w:numPr>
+          <w:ilvl w:val="0"/>
           <w:numId w:val="10"/>
         </w:numPr>
         <w:rPr>
@@ -1084,859 +1110,860 @@
         <w:rPr>
           <w:rFonts w:ascii="Times New Roman" w:eastAsia="宋体" w:hAnsi="Times New Roman" w:cs="Times New Roman" w:hint="eastAsia"/>
         </w:rPr>
+        <w:lastRenderedPageBreak/>
         <w:t>可以记录不同鼠标操作的笔刷大小，并在切换时自动还原，详见</w:t>
       </w:r>
       <w:r>
         <w:rPr>
           <w:rFonts w:ascii="Times New Roman" w:eastAsia="宋体" w:hAnsi="Times New Roman" w:cs="Times New Roman" w:hint="eastAsia"/>
         </w:rPr>
+        <w:t>RecordBrushSizeHistory</w:t>
+      </w:r>
+    </w:p>
+    <w:p>
+      <w:pPr>
+        <w:pStyle w:val="a9"/>
+        <w:numPr>
+          <w:ilvl w:val="0"/>
+          <w:numId w:val="50"/>
+        </w:numPr>
+        <w:rPr>
+          <w:rFonts w:ascii="Times New Roman" w:eastAsia="宋体" w:hAnsi="Times New Roman" w:cs="Times New Roman"/>
+        </w:rPr>
+      </w:pPr>
+      <w:r>
+        <w:rPr>
+          <w:rFonts w:ascii="Times New Roman" w:eastAsia="宋体" w:hAnsi="Times New Roman" w:cs="Times New Roman" w:hint="eastAsia"/>
+        </w:rPr>
+        <w:t>增加</w:t>
+      </w:r>
+      <w:r>
+        <w:rPr>
+          <w:rFonts w:ascii="Times New Roman" w:eastAsia="宋体" w:hAnsi="Times New Roman" w:cs="Times New Roman" w:hint="eastAsia"/>
+        </w:rPr>
+        <w:t>/</w:t>
+      </w:r>
+      <w:r>
+        <w:rPr>
+          <w:rFonts w:ascii="Times New Roman" w:eastAsia="宋体" w:hAnsi="Times New Roman" w:cs="Times New Roman" w:hint="eastAsia"/>
+        </w:rPr>
+        <w:t>减少矿石支持调整笔刷大小</w:t>
+      </w:r>
+    </w:p>
+    <w:p>
+      <w:pPr>
+        <w:pStyle w:val="a9"/>
+        <w:numPr>
+          <w:ilvl w:val="0"/>
+          <w:numId w:val="50"/>
+        </w:numPr>
+        <w:rPr>
+          <w:rFonts w:ascii="Times New Roman" w:eastAsia="宋体" w:hAnsi="Times New Roman" w:cs="Times New Roman"/>
+        </w:rPr>
+      </w:pPr>
+      <w:r>
+        <w:rPr>
+          <w:rFonts w:ascii="Times New Roman" w:eastAsia="宋体" w:hAnsi="Times New Roman" w:cs="Times New Roman" w:hint="eastAsia"/>
+        </w:rPr>
+        <w:t>新增</w:t>
+      </w:r>
+      <w:r>
+        <w:rPr>
+          <w:rFonts w:ascii="Times New Roman" w:eastAsia="宋体" w:hAnsi="Times New Roman" w:cs="Times New Roman" w:hint="eastAsia"/>
+        </w:rPr>
+        <w:t>LuaDialog</w:t>
+      </w:r>
+      <w:r>
+        <w:rPr>
+          <w:rFonts w:ascii="Times New Roman" w:eastAsia="宋体" w:hAnsi="Times New Roman" w:cs="Times New Roman" w:hint="eastAsia"/>
+        </w:rPr>
+        <w:t>，可以在</w:t>
+      </w:r>
+      <w:r>
+        <w:rPr>
+          <w:rFonts w:ascii="Times New Roman" w:eastAsia="宋体" w:hAnsi="Times New Roman" w:cs="Times New Roman" w:hint="eastAsia"/>
+        </w:rPr>
+        <w:t>lua</w:t>
+      </w:r>
+      <w:r>
+        <w:rPr>
+          <w:rFonts w:ascii="Times New Roman" w:eastAsia="宋体" w:hAnsi="Times New Roman" w:cs="Times New Roman" w:hint="eastAsia"/>
+        </w:rPr>
+        <w:t>脚本内动态创建自定义窗口</w:t>
+      </w:r>
+    </w:p>
+    <w:p>
+      <w:pPr>
+        <w:pStyle w:val="a9"/>
+        <w:numPr>
+          <w:ilvl w:val="0"/>
+          <w:numId w:val="50"/>
+        </w:numPr>
+        <w:rPr>
+          <w:rFonts w:ascii="Times New Roman" w:eastAsia="宋体" w:hAnsi="Times New Roman" w:cs="Times New Roman"/>
+        </w:rPr>
+      </w:pPr>
+      <w:r>
+        <w:rPr>
+          <w:rFonts w:ascii="Times New Roman" w:eastAsia="宋体" w:hAnsi="Times New Roman" w:cs="Times New Roman" w:hint="eastAsia"/>
+        </w:rPr>
+        <w:t>修复改变地图大小后建筑灯光没有刷新的</w:t>
+      </w:r>
+      <w:r>
+        <w:rPr>
+          <w:rFonts w:ascii="Times New Roman" w:eastAsia="宋体" w:hAnsi="Times New Roman" w:cs="Times New Roman" w:hint="eastAsia"/>
+        </w:rPr>
+        <w:t>bug</w:t>
+      </w:r>
+    </w:p>
+    <w:p>
+      <w:pPr>
+        <w:pStyle w:val="a9"/>
+        <w:numPr>
+          <w:ilvl w:val="0"/>
+          <w:numId w:val="50"/>
+        </w:numPr>
+        <w:rPr>
+          <w:rFonts w:ascii="Times New Roman" w:eastAsia="宋体" w:hAnsi="Times New Roman" w:cs="Times New Roman"/>
+        </w:rPr>
+      </w:pPr>
+      <w:r>
+        <w:rPr>
+          <w:rFonts w:ascii="Times New Roman" w:eastAsia="宋体" w:hAnsi="Times New Roman" w:cs="Times New Roman" w:hint="eastAsia"/>
+        </w:rPr>
+        <w:t>多选模式可以显示不同矿石类型的价格</w:t>
+      </w:r>
+    </w:p>
+    <w:p>
+      <w:pPr>
+        <w:pStyle w:val="a9"/>
+        <w:numPr>
+          <w:ilvl w:val="0"/>
+          <w:numId w:val="50"/>
+        </w:numPr>
+        <w:rPr>
+          <w:rFonts w:ascii="Times New Roman" w:eastAsia="宋体" w:hAnsi="Times New Roman" w:cs="Times New Roman"/>
+        </w:rPr>
+      </w:pPr>
+      <w:r>
+        <w:rPr>
+          <w:rFonts w:ascii="Times New Roman" w:eastAsia="宋体" w:hAnsi="Times New Roman" w:cs="Times New Roman" w:hint="eastAsia"/>
+        </w:rPr>
+        <w:t>优化了绘图界面缩小时的渲染性能</w:t>
+      </w:r>
+    </w:p>
+    <w:p>
+      <w:pPr>
+        <w:pStyle w:val="a9"/>
+        <w:numPr>
+          <w:ilvl w:val="0"/>
+          <w:numId w:val="50"/>
+        </w:numPr>
+        <w:rPr>
+          <w:rFonts w:ascii="Times New Roman" w:eastAsia="宋体" w:hAnsi="Times New Roman" w:cs="Times New Roman"/>
+        </w:rPr>
+      </w:pPr>
+      <w:r>
+        <w:rPr>
+          <w:rFonts w:ascii="Times New Roman" w:eastAsia="宋体" w:hAnsi="Times New Roman" w:cs="Times New Roman" w:hint="eastAsia"/>
+        </w:rPr>
+        <w:t>修复使用触发编辑器拖拽小点为步兵关联标签时，已关联标记没有依据步兵子单元格显示的</w:t>
+      </w:r>
+      <w:r>
+        <w:rPr>
+          <w:rFonts w:ascii="Times New Roman" w:eastAsia="宋体" w:hAnsi="Times New Roman" w:cs="Times New Roman" w:hint="eastAsia"/>
+        </w:rPr>
+        <w:t>bug</w:t>
+      </w:r>
+    </w:p>
+    <w:p>
+      <w:pPr>
+        <w:pStyle w:val="a9"/>
+        <w:numPr>
+          <w:ilvl w:val="0"/>
+          <w:numId w:val="50"/>
+        </w:numPr>
+        <w:rPr>
+          <w:rFonts w:ascii="Times New Roman" w:eastAsia="宋体" w:hAnsi="Times New Roman" w:cs="Times New Roman"/>
+        </w:rPr>
+      </w:pPr>
+      <w:r>
+        <w:rPr>
+          <w:rFonts w:ascii="Times New Roman" w:eastAsia="宋体" w:hAnsi="Times New Roman" w:cs="Times New Roman" w:hint="eastAsia"/>
+        </w:rPr>
+        <w:t>Lua</w:t>
+      </w:r>
+      <w:r>
+        <w:rPr>
+          <w:rFonts w:ascii="Times New Roman" w:eastAsia="宋体" w:hAnsi="Times New Roman" w:cs="Times New Roman" w:hint="eastAsia"/>
+        </w:rPr>
+        <w:t>脚本终端可以开启</w:t>
+      </w:r>
+      <w:r>
+        <w:rPr>
+          <w:rFonts w:ascii="Times New Roman" w:eastAsia="宋体" w:hAnsi="Times New Roman" w:cs="Times New Roman" w:hint="eastAsia"/>
+        </w:rPr>
+        <w:t>MCP</w:t>
+      </w:r>
+      <w:r>
+        <w:rPr>
+          <w:rFonts w:ascii="Times New Roman" w:eastAsia="宋体" w:hAnsi="Times New Roman" w:cs="Times New Roman" w:hint="eastAsia"/>
+        </w:rPr>
+        <w:t>服务器，接入大语言模型调用</w:t>
+      </w:r>
+      <w:r>
+        <w:rPr>
+          <w:rFonts w:ascii="Times New Roman" w:eastAsia="宋体" w:hAnsi="Times New Roman" w:cs="Times New Roman" w:hint="eastAsia"/>
+        </w:rPr>
+        <w:t>lua</w:t>
+      </w:r>
+      <w:r>
+        <w:rPr>
+          <w:rFonts w:ascii="Times New Roman" w:eastAsia="宋体" w:hAnsi="Times New Roman" w:cs="Times New Roman" w:hint="eastAsia"/>
+        </w:rPr>
+        <w:t>脚本</w:t>
+      </w:r>
+      <w:r>
+        <w:rPr>
+          <w:rFonts w:ascii="Times New Roman" w:eastAsia="宋体" w:hAnsi="Times New Roman" w:cs="Times New Roman" w:hint="eastAsia"/>
+        </w:rPr>
+        <w:t>。详见</w:t>
+      </w:r>
+      <w:r>
+        <w:rPr>
+          <w:rFonts w:ascii="Times New Roman" w:eastAsia="宋体" w:hAnsi="Times New Roman" w:cs="Times New Roman" w:hint="eastAsia"/>
+        </w:rPr>
+        <w:t>MCP.Enable</w:t>
+      </w:r>
+    </w:p>
+    <w:p>
+      <w:pPr>
+        <w:pStyle w:val="a9"/>
+        <w:numPr>
+          <w:ilvl w:val="0"/>
+          <w:numId w:val="50"/>
+        </w:numPr>
+        <w:rPr>
+          <w:rFonts w:ascii="Times New Roman" w:eastAsia="宋体" w:hAnsi="Times New Roman" w:cs="Times New Roman"/>
+        </w:rPr>
+      </w:pPr>
+      <w:r>
+        <w:rPr>
+          <w:rFonts w:ascii="Times New Roman" w:eastAsia="宋体" w:hAnsi="Times New Roman" w:cs="Times New Roman" w:hint="eastAsia"/>
+        </w:rPr>
+        <w:t>修复渲染部分</w:t>
+      </w:r>
+      <w:r>
+        <w:rPr>
+          <w:rFonts w:ascii="Times New Roman" w:eastAsia="宋体" w:hAnsi="Times New Roman" w:cs="Times New Roman" w:hint="eastAsia"/>
+        </w:rPr>
+        <w:t>vxl</w:t>
+      </w:r>
+      <w:r>
+        <w:rPr>
+          <w:rFonts w:ascii="Times New Roman" w:eastAsia="宋体" w:hAnsi="Times New Roman" w:cs="Times New Roman" w:hint="eastAsia"/>
+        </w:rPr>
+        <w:t>时崩溃的</w:t>
+      </w:r>
+      <w:r>
+        <w:rPr>
+          <w:rFonts w:ascii="Times New Roman" w:eastAsia="宋体" w:hAnsi="Times New Roman" w:cs="Times New Roman" w:hint="eastAsia"/>
+        </w:rPr>
+        <w:t>bug</w:t>
+      </w:r>
+    </w:p>
+    <w:p>
+      <w:pPr>
+        <w:pStyle w:val="a9"/>
+        <w:numPr>
+          <w:ilvl w:val="0"/>
+          <w:numId w:val="50"/>
+        </w:numPr>
+        <w:rPr>
+          <w:rFonts w:ascii="Times New Roman" w:eastAsia="宋体" w:hAnsi="Times New Roman" w:cs="Times New Roman"/>
+        </w:rPr>
+      </w:pPr>
+      <w:r>
+        <w:rPr>
+          <w:rFonts w:ascii="Times New Roman" w:eastAsia="宋体" w:hAnsi="Times New Roman" w:cs="Times New Roman" w:hint="eastAsia"/>
+        </w:rPr>
+        <w:t>基本设置窗口增加背景音乐和载入界面背景音乐选项</w:t>
+      </w:r>
+    </w:p>
+    <w:p>
+      <w:pPr>
+        <w:pStyle w:val="a9"/>
+        <w:numPr>
+          <w:ilvl w:val="0"/>
+          <w:numId w:val="50"/>
+        </w:numPr>
+        <w:rPr>
+          <w:rFonts w:ascii="Times New Roman" w:eastAsia="宋体" w:hAnsi="Times New Roman" w:cs="Times New Roman"/>
+        </w:rPr>
+      </w:pPr>
+      <w:r>
+        <w:rPr>
+          <w:rFonts w:ascii="Times New Roman" w:eastAsia="宋体" w:hAnsi="Times New Roman" w:cs="Times New Roman" w:hint="eastAsia"/>
+        </w:rPr>
+        <w:t>单人任务设置</w:t>
+      </w:r>
+      <w:r>
+        <w:rPr>
+          <w:rFonts w:ascii="Times New Roman" w:eastAsia="宋体" w:hAnsi="Times New Roman" w:cs="Times New Roman" w:hint="eastAsia"/>
+        </w:rPr>
+        <w:t>-</w:t>
+      </w:r>
+      <w:r>
+        <w:rPr>
+          <w:rFonts w:ascii="Times New Roman" w:eastAsia="宋体" w:hAnsi="Times New Roman" w:cs="Times New Roman" w:hint="eastAsia"/>
+        </w:rPr>
+        <w:t>幻影伪装树木可以使用绘制随机树木窗口进行选择</w:t>
+      </w:r>
+    </w:p>
+    <w:p>
+      <w:pPr>
+        <w:pStyle w:val="a9"/>
+        <w:numPr>
+          <w:ilvl w:val="0"/>
+          <w:numId w:val="50"/>
+        </w:numPr>
+        <w:rPr>
+          <w:rFonts w:ascii="Times New Roman" w:eastAsia="宋体" w:hAnsi="Times New Roman" w:cs="Times New Roman"/>
+        </w:rPr>
+      </w:pPr>
+      <w:r>
+        <w:rPr>
+          <w:rFonts w:ascii="Times New Roman" w:eastAsia="宋体" w:hAnsi="Times New Roman" w:cs="Times New Roman" w:hint="eastAsia"/>
+        </w:rPr>
+        <w:t>放置高架桥头时，可以显示辅助参考线</w:t>
+      </w:r>
+    </w:p>
+    <w:p>
+      <w:pPr>
+        <w:pStyle w:val="a9"/>
+        <w:numPr>
+          <w:ilvl w:val="0"/>
+          <w:numId w:val="50"/>
+        </w:numPr>
+        <w:rPr>
+          <w:rFonts w:ascii="Times New Roman" w:eastAsia="宋体" w:hAnsi="Times New Roman" w:cs="Times New Roman"/>
+        </w:rPr>
+      </w:pPr>
+      <w:r>
+        <w:rPr>
+          <w:rFonts w:ascii="Times New Roman" w:eastAsia="宋体" w:hAnsi="Times New Roman" w:cs="Times New Roman" w:hint="eastAsia"/>
+        </w:rPr>
+        <w:t>为触发编辑器检查下级触发是否是自身添加开关，详见</w:t>
+      </w:r>
+      <w:r>
+        <w:rPr>
+          <w:rFonts w:ascii="Times New Roman" w:eastAsia="宋体" w:hAnsi="Times New Roman" w:cs="Times New Roman" w:hint="eastAsia"/>
+        </w:rPr>
+        <w:t>AttachedTriggerIsSelfCheck</w:t>
+      </w:r>
+    </w:p>
+    <w:p>
+      <w:pPr>
+        <w:pStyle w:val="a9"/>
+        <w:numPr>
+          <w:ilvl w:val="0"/>
+          <w:numId w:val="50"/>
+        </w:numPr>
+        <w:rPr>
+          <w:rFonts w:ascii="Times New Roman" w:eastAsia="宋体" w:hAnsi="Times New Roman" w:cs="Times New Roman"/>
+        </w:rPr>
+      </w:pPr>
+      <w:r>
+        <w:rPr>
+          <w:rFonts w:ascii="Times New Roman" w:eastAsia="宋体" w:hAnsi="Times New Roman" w:cs="Times New Roman" w:hint="eastAsia"/>
+        </w:rPr>
+        <w:t>修复遭遇战地图预览渲染时没有正确标记高架桥的</w:t>
+      </w:r>
+      <w:r>
+        <w:rPr>
+          <w:rFonts w:ascii="Times New Roman" w:eastAsia="宋体" w:hAnsi="Times New Roman" w:cs="Times New Roman" w:hint="eastAsia"/>
+        </w:rPr>
+        <w:t>bug</w:t>
+      </w:r>
+    </w:p>
+    <w:p>
+      <w:pPr>
+        <w:pStyle w:val="a9"/>
+        <w:numPr>
+          <w:ilvl w:val="0"/>
+          <w:numId w:val="50"/>
+        </w:numPr>
+        <w:rPr>
+          <w:rFonts w:ascii="Times New Roman" w:eastAsia="宋体" w:hAnsi="Times New Roman" w:cs="Times New Roman"/>
+        </w:rPr>
+      </w:pPr>
+      <w:r>
+        <w:rPr>
+          <w:rFonts w:ascii="Times New Roman" w:eastAsia="宋体" w:hAnsi="Times New Roman" w:cs="Times New Roman" w:hint="eastAsia"/>
+        </w:rPr>
+        <w:t>为</w:t>
+      </w:r>
+      <w:r>
+        <w:rPr>
+          <w:rFonts w:ascii="Times New Roman" w:eastAsia="宋体" w:hAnsi="Times New Roman" w:cs="Times New Roman" w:hint="eastAsia"/>
+        </w:rPr>
+        <w:t>Lua</w:t>
+      </w:r>
+      <w:r>
+        <w:rPr>
+          <w:rFonts w:ascii="Times New Roman" w:eastAsia="宋体" w:hAnsi="Times New Roman" w:cs="Times New Roman" w:hint="eastAsia"/>
+        </w:rPr>
+        <w:t>脚本终端添加安全检查，会在执行前静态检查高危操作，详见</w:t>
+      </w:r>
+      <w:r>
+        <w:rPr>
+          <w:rFonts w:ascii="Times New Roman" w:eastAsia="宋体" w:hAnsi="Times New Roman" w:cs="Times New Roman" w:hint="eastAsia"/>
+        </w:rPr>
+        <w:t>DisableLuaConsoleSafetyCheck</w:t>
+      </w:r>
+    </w:p>
+    <w:p>
+      <w:pPr>
+        <w:pStyle w:val="a9"/>
+        <w:numPr>
+          <w:ilvl w:val="0"/>
+          <w:numId w:val="50"/>
+        </w:numPr>
+        <w:rPr>
+          <w:rFonts w:ascii="Times New Roman" w:eastAsia="宋体" w:hAnsi="Times New Roman" w:cs="Times New Roman"/>
+        </w:rPr>
+      </w:pPr>
+      <w:r>
+        <w:rPr>
+          <w:rFonts w:ascii="Times New Roman" w:eastAsia="宋体" w:hAnsi="Times New Roman" w:cs="Times New Roman" w:hint="eastAsia"/>
+        </w:rPr>
+        <w:t>可以在地图视图内按方向键调节视角，同时按住</w:t>
+      </w:r>
+      <w:r>
+        <w:rPr>
+          <w:rFonts w:ascii="Times New Roman" w:eastAsia="宋体" w:hAnsi="Times New Roman" w:cs="Times New Roman" w:hint="eastAsia"/>
+        </w:rPr>
+        <w:t>ctrl</w:t>
+      </w:r>
+      <w:r>
+        <w:rPr>
+          <w:rFonts w:ascii="Times New Roman" w:eastAsia="宋体" w:hAnsi="Times New Roman" w:cs="Times New Roman" w:hint="eastAsia"/>
+        </w:rPr>
+        <w:t>键加速移动</w:t>
+      </w:r>
+    </w:p>
+    <w:p>
+      <w:pPr>
+        <w:pStyle w:val="a9"/>
+        <w:numPr>
+          <w:ilvl w:val="0"/>
+          <w:numId w:val="50"/>
+        </w:numPr>
+        <w:rPr>
+          <w:rFonts w:ascii="Times New Roman" w:eastAsia="宋体" w:hAnsi="Times New Roman" w:cs="Times New Roman"/>
+        </w:rPr>
+      </w:pPr>
+      <w:r>
+        <w:rPr>
+          <w:rFonts w:ascii="Times New Roman" w:eastAsia="宋体" w:hAnsi="Times New Roman" w:cs="Times New Roman" w:hint="eastAsia"/>
+        </w:rPr>
+        <w:t>修复部分遭遇战地图所属方选项重复的</w:t>
+      </w:r>
+      <w:r>
+        <w:rPr>
+          <w:rFonts w:ascii="Times New Roman" w:eastAsia="宋体" w:hAnsi="Times New Roman" w:cs="Times New Roman" w:hint="eastAsia"/>
+        </w:rPr>
+        <w:t>bug</w:t>
+      </w:r>
+    </w:p>
+    <w:p>
+      <w:pPr>
+        <w:pStyle w:val="a9"/>
+        <w:numPr>
+          <w:ilvl w:val="0"/>
+          <w:numId w:val="50"/>
+        </w:numPr>
+        <w:rPr>
+          <w:rFonts w:ascii="Times New Roman" w:eastAsia="宋体" w:hAnsi="Times New Roman" w:cs="Times New Roman"/>
+        </w:rPr>
+      </w:pPr>
+      <w:r>
+        <w:rPr>
+          <w:rFonts w:ascii="Times New Roman" w:eastAsia="宋体" w:hAnsi="Times New Roman" w:cs="Times New Roman" w:hint="eastAsia"/>
+        </w:rPr>
+        <w:t>重写单位属性对话框，标签支持搜索，所属方可以显示颜色</w:t>
+      </w:r>
+    </w:p>
+    <w:p>
+      <w:pPr>
+        <w:pStyle w:val="a9"/>
+        <w:numPr>
+          <w:ilvl w:val="0"/>
+          <w:numId w:val="50"/>
+        </w:numPr>
+        <w:rPr>
+          <w:rFonts w:ascii="Times New Roman" w:eastAsia="宋体" w:hAnsi="Times New Roman" w:cs="Times New Roman"/>
+        </w:rPr>
+      </w:pPr>
+      <w:r>
+        <w:rPr>
+          <w:rFonts w:ascii="Times New Roman" w:eastAsia="宋体" w:hAnsi="Times New Roman" w:cs="Times New Roman" w:hint="eastAsia"/>
+        </w:rPr>
+        <w:t>支持将</w:t>
+      </w:r>
+      <w:r>
+        <w:rPr>
+          <w:rFonts w:ascii="Times New Roman" w:eastAsia="宋体" w:hAnsi="Times New Roman" w:cs="Times New Roman" w:hint="eastAsia"/>
+        </w:rPr>
+        <w:t>物品浏览器和</w:t>
+      </w:r>
+      <w:r>
+        <w:rPr>
+          <w:rFonts w:ascii="Times New Roman" w:eastAsia="宋体" w:hAnsi="Times New Roman" w:cs="Times New Roman" w:hint="eastAsia"/>
+        </w:rPr>
+        <w:t>地形浏览器作为一个独立窗口显示</w:t>
+      </w:r>
+      <w:r>
+        <w:rPr>
+          <w:rFonts w:ascii="Times New Roman" w:eastAsia="宋体" w:hAnsi="Times New Roman" w:cs="Times New Roman" w:hint="eastAsia"/>
+        </w:rPr>
+        <w:t>，可以调节透明度</w:t>
+      </w:r>
+      <w:r>
+        <w:rPr>
+          <w:rFonts w:ascii="Times New Roman" w:eastAsia="宋体" w:hAnsi="Times New Roman" w:cs="Times New Roman" w:hint="eastAsia"/>
+        </w:rPr>
+        <w:t>，详见</w:t>
+      </w:r>
+      <w:r>
+        <w:rPr>
+          <w:rFonts w:ascii="Times New Roman" w:eastAsia="宋体" w:hAnsi="Times New Roman" w:cs="Times New Roman" w:hint="eastAsia"/>
+        </w:rPr>
+        <w:t>ViewObjectsFloating</w:t>
+      </w:r>
+      <w:r>
+        <w:rPr>
+          <w:rFonts w:ascii="Times New Roman" w:eastAsia="宋体" w:hAnsi="Times New Roman" w:cs="Times New Roman" w:hint="eastAsia"/>
+        </w:rPr>
+        <w:t>和</w:t>
+      </w:r>
+      <w:r>
+        <w:rPr>
+          <w:rFonts w:ascii="Times New Roman" w:eastAsia="宋体" w:hAnsi="Times New Roman" w:cs="Times New Roman" w:hint="eastAsia"/>
+        </w:rPr>
+        <w:t>TileSetBrowserFloating</w:t>
+      </w:r>
+    </w:p>
+    <w:p>
+      <w:pPr>
+        <w:pStyle w:val="a9"/>
+        <w:numPr>
+          <w:ilvl w:val="0"/>
+          <w:numId w:val="50"/>
+        </w:numPr>
+        <w:rPr>
+          <w:rFonts w:ascii="Times New Roman" w:eastAsia="宋体" w:hAnsi="Times New Roman" w:cs="Times New Roman"/>
+        </w:rPr>
+      </w:pPr>
+      <w:r>
+        <w:rPr>
+          <w:rFonts w:ascii="Times New Roman" w:eastAsia="宋体" w:hAnsi="Times New Roman" w:cs="Times New Roman" w:hint="eastAsia"/>
+        </w:rPr>
+        <w:t>绝大多数窗口可以调节透明度</w:t>
+      </w:r>
+    </w:p>
+    <w:p>
+      <w:pPr>
+        <w:pStyle w:val="a9"/>
+        <w:numPr>
+          <w:ilvl w:val="0"/>
+          <w:numId w:val="50"/>
+        </w:numPr>
+        <w:rPr>
+          <w:rFonts w:ascii="Times New Roman" w:eastAsia="宋体" w:hAnsi="Times New Roman" w:cs="Times New Roman"/>
+        </w:rPr>
+      </w:pPr>
+      <w:r>
+        <w:rPr>
+          <w:rFonts w:ascii="Times New Roman" w:eastAsia="宋体" w:hAnsi="Times New Roman" w:cs="Times New Roman" w:hint="eastAsia"/>
+        </w:rPr>
+        <w:t>修复部分情况下按工具栏擦除覆盖物等按钮不生效的</w:t>
+      </w:r>
+      <w:r>
+        <w:rPr>
+          <w:rFonts w:ascii="Times New Roman" w:eastAsia="宋体" w:hAnsi="Times New Roman" w:cs="Times New Roman" w:hint="eastAsia"/>
+        </w:rPr>
+        <w:t>bug</w:t>
+      </w:r>
+    </w:p>
+    <w:p>
+      <w:pPr>
+        <w:pStyle w:val="a9"/>
+        <w:numPr>
+          <w:ilvl w:val="0"/>
+          <w:numId w:val="50"/>
+        </w:numPr>
+        <w:rPr>
+          <w:rFonts w:ascii="Times New Roman" w:eastAsia="宋体" w:hAnsi="Times New Roman" w:cs="Times New Roman"/>
+        </w:rPr>
+      </w:pPr>
+      <w:r>
+        <w:rPr>
+          <w:rFonts w:ascii="Times New Roman" w:eastAsia="宋体" w:hAnsi="Times New Roman" w:cs="Times New Roman" w:hint="eastAsia"/>
+        </w:rPr>
+        <w:t>修复暗色模式下非主程序菜单的背景色被错误填充的</w:t>
+      </w:r>
+      <w:r>
+        <w:rPr>
+          <w:rFonts w:ascii="Times New Roman" w:eastAsia="宋体" w:hAnsi="Times New Roman" w:cs="Times New Roman" w:hint="eastAsia"/>
+        </w:rPr>
+        <w:t>bug</w:t>
+      </w:r>
+    </w:p>
+    <w:p>
+      <w:pPr>
+        <w:pStyle w:val="a9"/>
+        <w:numPr>
+          <w:ilvl w:val="0"/>
+          <w:numId w:val="50"/>
+        </w:numPr>
+        <w:rPr>
+          <w:rFonts w:ascii="Times New Roman" w:eastAsia="宋体" w:hAnsi="Times New Roman" w:cs="Times New Roman"/>
+        </w:rPr>
+      </w:pPr>
+      <w:r>
+        <w:rPr>
+          <w:rFonts w:ascii="Times New Roman" w:eastAsia="宋体" w:hAnsi="Times New Roman" w:cs="Times New Roman" w:hint="eastAsia"/>
+        </w:rPr>
+        <w:t>为触发编辑器、</w:t>
+      </w:r>
+      <w:r>
+        <w:rPr>
+          <w:rFonts w:ascii="Times New Roman" w:eastAsia="宋体" w:hAnsi="Times New Roman" w:cs="Times New Roman" w:hint="eastAsia"/>
+        </w:rPr>
+        <w:t>AI</w:t>
+      </w:r>
+      <w:r>
+        <w:rPr>
+          <w:rFonts w:ascii="Times New Roman" w:eastAsia="宋体" w:hAnsi="Times New Roman" w:cs="Times New Roman" w:hint="eastAsia"/>
+        </w:rPr>
+        <w:t>触发编辑器增加跳转按钮，可以跳转到参数对应的路径点、小队等位置</w:t>
+      </w:r>
+    </w:p>
+    <w:p>
+      <w:pPr>
+        <w:pStyle w:val="a9"/>
+        <w:numPr>
+          <w:ilvl w:val="0"/>
+          <w:numId w:val="50"/>
+        </w:numPr>
+        <w:rPr>
+          <w:rFonts w:ascii="Times New Roman" w:eastAsia="宋体" w:hAnsi="Times New Roman" w:cs="Times New Roman"/>
+        </w:rPr>
+      </w:pPr>
+      <w:r>
+        <w:rPr>
+          <w:rFonts w:ascii="Times New Roman" w:eastAsia="宋体" w:hAnsi="Times New Roman" w:cs="Times New Roman" w:hint="eastAsia"/>
+        </w:rPr>
+        <w:t>受损火焰能正确被其他单位遮挡</w:t>
+      </w:r>
+      <w:r>
+        <w:rPr>
+          <w:rFonts w:ascii="Times New Roman" w:eastAsia="宋体" w:hAnsi="Times New Roman" w:cs="Times New Roman" w:hint="eastAsia"/>
+        </w:rPr>
+        <w:t>，可以读取</w:t>
+      </w:r>
+      <w:r>
+        <w:rPr>
+          <w:rFonts w:ascii="Times New Roman" w:eastAsia="宋体" w:hAnsi="Times New Roman" w:cs="Times New Roman" w:hint="eastAsia"/>
+        </w:rPr>
+        <w:t>Next=</w:t>
+      </w:r>
+      <w:r>
+        <w:rPr>
+          <w:rFonts w:ascii="Times New Roman" w:eastAsia="宋体" w:hAnsi="Times New Roman" w:cs="Times New Roman" w:hint="eastAsia"/>
+        </w:rPr>
+        <w:t>最终的</w:t>
+      </w:r>
+      <w:r>
+        <w:rPr>
+          <w:rFonts w:ascii="Times New Roman" w:eastAsia="宋体" w:hAnsi="Times New Roman" w:cs="Times New Roman" w:hint="eastAsia"/>
+        </w:rPr>
+        <w:t>图像</w:t>
+      </w:r>
+    </w:p>
+    <w:p>
+      <w:pPr>
+        <w:pStyle w:val="a9"/>
+        <w:numPr>
+          <w:ilvl w:val="0"/>
+          <w:numId w:val="50"/>
+        </w:numPr>
+        <w:rPr>
+          <w:rFonts w:ascii="Times New Roman" w:eastAsia="宋体" w:hAnsi="Times New Roman" w:cs="Times New Roman"/>
+        </w:rPr>
+      </w:pPr>
+      <w:r>
+        <w:rPr>
+          <w:rFonts w:ascii="Times New Roman" w:eastAsia="宋体" w:hAnsi="Times New Roman" w:cs="Times New Roman" w:hint="eastAsia"/>
+        </w:rPr>
+        <w:t>抬升、降低、平坦地表工具增加顶点模式，切换后可以直接修改顶点高度，生成更精细的斜坡</w:t>
+      </w:r>
+    </w:p>
+    <w:p>
+      <w:pPr>
+        <w:pStyle w:val="a9"/>
+        <w:numPr>
+          <w:ilvl w:val="0"/>
+          <w:numId w:val="50"/>
+        </w:numPr>
+        <w:rPr>
+          <w:rFonts w:ascii="Times New Roman" w:eastAsia="宋体" w:hAnsi="Times New Roman" w:cs="Times New Roman"/>
+        </w:rPr>
+      </w:pPr>
+      <w:r>
+        <w:rPr>
+          <w:rFonts w:ascii="Times New Roman" w:eastAsia="宋体" w:hAnsi="Times New Roman" w:cs="Times New Roman" w:hint="eastAsia"/>
+        </w:rPr>
+        <w:t>支持在打开地图时重新加载游戏</w:t>
+      </w:r>
+      <w:r>
+        <w:rPr>
+          <w:rFonts w:ascii="Times New Roman" w:eastAsia="宋体" w:hAnsi="Times New Roman" w:cs="Times New Roman" w:hint="eastAsia"/>
+        </w:rPr>
+        <w:t>ini</w:t>
+      </w:r>
+      <w:r>
+        <w:rPr>
+          <w:rFonts w:ascii="Times New Roman" w:eastAsia="宋体" w:hAnsi="Times New Roman" w:cs="Times New Roman" w:hint="eastAsia"/>
+        </w:rPr>
+        <w:t>，详见</w:t>
+      </w:r>
+      <w:r>
+        <w:rPr>
+          <w:rFonts w:ascii="Times New Roman" w:eastAsia="宋体" w:hAnsi="Times New Roman" w:cs="Times New Roman" w:hint="eastAsia"/>
+        </w:rPr>
+        <w:t>ReloadIniWhenOpeningMap</w:t>
+      </w:r>
+    </w:p>
+    <w:p>
+      <w:pPr>
+        <w:pStyle w:val="a9"/>
+        <w:numPr>
+          <w:ilvl w:val="0"/>
+          <w:numId w:val="50"/>
+        </w:numPr>
+        <w:rPr>
+          <w:rFonts w:ascii="Times New Roman" w:eastAsia="宋体" w:hAnsi="Times New Roman" w:cs="Times New Roman"/>
+        </w:rPr>
+      </w:pPr>
+      <w:r>
+        <w:rPr>
+          <w:rFonts w:ascii="Times New Roman" w:eastAsia="宋体" w:hAnsi="Times New Roman" w:cs="Times New Roman" w:hint="eastAsia"/>
+        </w:rPr>
+        <w:t>修复按</w:t>
+      </w:r>
+      <w:r>
+        <w:rPr>
+          <w:rFonts w:ascii="Times New Roman" w:eastAsia="宋体" w:hAnsi="Times New Roman" w:cs="Times New Roman" w:hint="eastAsia"/>
+        </w:rPr>
+        <w:t>delete</w:t>
+      </w:r>
+      <w:r>
+        <w:rPr>
+          <w:rFonts w:ascii="Times New Roman" w:eastAsia="宋体" w:hAnsi="Times New Roman" w:cs="Times New Roman" w:hint="eastAsia"/>
+        </w:rPr>
+        <w:t>无法删除游戏对象的</w:t>
+      </w:r>
+      <w:r>
+        <w:rPr>
+          <w:rFonts w:ascii="Times New Roman" w:eastAsia="宋体" w:hAnsi="Times New Roman" w:cs="Times New Roman" w:hint="eastAsia"/>
+        </w:rPr>
+        <w:t>bug</w:t>
+      </w:r>
+    </w:p>
+    <w:p>
+      <w:pPr>
+        <w:pStyle w:val="a9"/>
+        <w:numPr>
+          <w:ilvl w:val="0"/>
+          <w:numId w:val="50"/>
+        </w:numPr>
+        <w:rPr>
+          <w:rFonts w:ascii="Times New Roman" w:eastAsia="宋体" w:hAnsi="Times New Roman" w:cs="Times New Roman"/>
+        </w:rPr>
+      </w:pPr>
+      <w:r>
+        <w:rPr>
+          <w:rFonts w:ascii="Times New Roman" w:eastAsia="宋体" w:hAnsi="Times New Roman" w:cs="Times New Roman" w:hint="eastAsia"/>
+        </w:rPr>
+        <w:t>修复查找引用窗口的跟随活动的窗口不随窗口大小移动的</w:t>
+      </w:r>
+      <w:r>
+        <w:rPr>
+          <w:rFonts w:ascii="Times New Roman" w:eastAsia="宋体" w:hAnsi="Times New Roman" w:cs="Times New Roman" w:hint="eastAsia"/>
+        </w:rPr>
+        <w:t>bug</w:t>
+      </w:r>
+    </w:p>
+    <w:p>
+      <w:pPr>
+        <w:pStyle w:val="a9"/>
+        <w:numPr>
+          <w:ilvl w:val="0"/>
+          <w:numId w:val="50"/>
+        </w:numPr>
+        <w:rPr>
+          <w:rFonts w:ascii="Times New Roman" w:eastAsia="宋体" w:hAnsi="Times New Roman" w:cs="Times New Roman"/>
+        </w:rPr>
+      </w:pPr>
+      <w:r>
+        <w:rPr>
+          <w:rFonts w:ascii="Times New Roman" w:eastAsia="宋体" w:hAnsi="Times New Roman" w:cs="Times New Roman" w:hint="eastAsia"/>
+        </w:rPr>
+        <w:t>为重载地图增加了确认对话框</w:t>
+      </w:r>
+    </w:p>
+    <w:p>
+      <w:pPr>
+        <w:pStyle w:val="a9"/>
+        <w:numPr>
+          <w:ilvl w:val="0"/>
+          <w:numId w:val="50"/>
+        </w:numPr>
+        <w:rPr>
+          <w:rFonts w:ascii="Times New Roman" w:eastAsia="宋体" w:hAnsi="Times New Roman" w:cs="Times New Roman"/>
+        </w:rPr>
+      </w:pPr>
+      <w:r>
+        <w:rPr>
+          <w:rFonts w:ascii="Times New Roman" w:eastAsia="宋体" w:hAnsi="Times New Roman" w:cs="Times New Roman" w:hint="eastAsia"/>
+        </w:rPr>
+        <w:t>可以调节多选模式选中单元格的染色透明度，详见</w:t>
+      </w:r>
+      <w:r>
+        <w:rPr>
+          <w:rFonts w:ascii="Times New Roman" w:eastAsia="宋体" w:hAnsi="Times New Roman" w:cs="Times New Roman" w:hint="eastAsia"/>
+        </w:rPr>
+        <w:t>MultiSelect.Opacity</w:t>
+      </w:r>
+    </w:p>
+    <w:p>
+      <w:pPr>
+        <w:pStyle w:val="a9"/>
+        <w:numPr>
+          <w:ilvl w:val="0"/>
+          <w:numId w:val="50"/>
+        </w:numPr>
+        <w:rPr>
+          <w:rFonts w:ascii="Times New Roman" w:eastAsia="宋体" w:hAnsi="Times New Roman" w:cs="Times New Roman"/>
+        </w:rPr>
+      </w:pPr>
+      <w:r>
+        <w:rPr>
+          <w:rFonts w:ascii="Times New Roman" w:eastAsia="宋体" w:hAnsi="Times New Roman" w:cs="Times New Roman" w:hint="eastAsia"/>
+        </w:rPr>
         <w:lastRenderedPageBreak/>
-        <w:t>RecordBrushSizeHistory</w:t>
-      </w:r>
-    </w:p>
-    <w:p>
-      <w:pPr>
-        <w:pStyle w:val="a9"/>
-        <w:numPr>
-          <w:ilvl w:val="0"/>
-          <w:numId w:val="50"/>
-        </w:numPr>
-        <w:rPr>
-          <w:rFonts w:ascii="Times New Roman" w:eastAsia="宋体" w:hAnsi="Times New Roman" w:cs="Times New Roman"/>
-        </w:rPr>
-      </w:pPr>
-      <w:r>
-        <w:rPr>
-          <w:rFonts w:ascii="Times New Roman" w:eastAsia="宋体" w:hAnsi="Times New Roman" w:cs="Times New Roman" w:hint="eastAsia"/>
-        </w:rPr>
-        <w:t>增加</w:t>
-      </w:r>
-      <w:r>
-        <w:rPr>
-          <w:rFonts w:ascii="Times New Roman" w:eastAsia="宋体" w:hAnsi="Times New Roman" w:cs="Times New Roman" w:hint="eastAsia"/>
-        </w:rPr>
-        <w:t>/</w:t>
-      </w:r>
-      <w:r>
-        <w:rPr>
-          <w:rFonts w:ascii="Times New Roman" w:eastAsia="宋体" w:hAnsi="Times New Roman" w:cs="Times New Roman" w:hint="eastAsia"/>
-        </w:rPr>
-        <w:t>减少矿石支持调整笔刷大小</w:t>
-      </w:r>
-    </w:p>
-    <w:p>
-      <w:pPr>
-        <w:pStyle w:val="a9"/>
-        <w:numPr>
-          <w:ilvl w:val="0"/>
-          <w:numId w:val="50"/>
-        </w:numPr>
-        <w:rPr>
-          <w:rFonts w:ascii="Times New Roman" w:eastAsia="宋体" w:hAnsi="Times New Roman" w:cs="Times New Roman"/>
-        </w:rPr>
-      </w:pPr>
-      <w:r>
-        <w:rPr>
-          <w:rFonts w:ascii="Times New Roman" w:eastAsia="宋体" w:hAnsi="Times New Roman" w:cs="Times New Roman" w:hint="eastAsia"/>
-        </w:rPr>
-        <w:t>新增</w:t>
-      </w:r>
-      <w:r>
-        <w:rPr>
-          <w:rFonts w:ascii="Times New Roman" w:eastAsia="宋体" w:hAnsi="Times New Roman" w:cs="Times New Roman" w:hint="eastAsia"/>
-        </w:rPr>
-        <w:t>LuaDialog</w:t>
-      </w:r>
-      <w:r>
-        <w:rPr>
-          <w:rFonts w:ascii="Times New Roman" w:eastAsia="宋体" w:hAnsi="Times New Roman" w:cs="Times New Roman" w:hint="eastAsia"/>
-        </w:rPr>
-        <w:t>，可以在</w:t>
-      </w:r>
-      <w:r>
-        <w:rPr>
-          <w:rFonts w:ascii="Times New Roman" w:eastAsia="宋体" w:hAnsi="Times New Roman" w:cs="Times New Roman" w:hint="eastAsia"/>
-        </w:rPr>
-        <w:t>lua</w:t>
-      </w:r>
-      <w:r>
-        <w:rPr>
-          <w:rFonts w:ascii="Times New Roman" w:eastAsia="宋体" w:hAnsi="Times New Roman" w:cs="Times New Roman" w:hint="eastAsia"/>
-        </w:rPr>
-        <w:t>脚本内动态创建自定义窗口</w:t>
-      </w:r>
-    </w:p>
-    <w:p>
-      <w:pPr>
-        <w:pStyle w:val="a9"/>
-        <w:numPr>
-          <w:ilvl w:val="0"/>
-          <w:numId w:val="50"/>
-        </w:numPr>
-        <w:rPr>
-          <w:rFonts w:ascii="Times New Roman" w:eastAsia="宋体" w:hAnsi="Times New Roman" w:cs="Times New Roman"/>
-        </w:rPr>
-      </w:pPr>
-      <w:r>
-        <w:rPr>
-          <w:rFonts w:ascii="Times New Roman" w:eastAsia="宋体" w:hAnsi="Times New Roman" w:cs="Times New Roman" w:hint="eastAsia"/>
-        </w:rPr>
-        <w:t>修复改变地图大小后建筑灯光没有刷新的</w:t>
-      </w:r>
-      <w:r>
-        <w:rPr>
-          <w:rFonts w:ascii="Times New Roman" w:eastAsia="宋体" w:hAnsi="Times New Roman" w:cs="Times New Roman" w:hint="eastAsia"/>
-        </w:rPr>
-        <w:t>bug</w:t>
-      </w:r>
-    </w:p>
-    <w:p>
-      <w:pPr>
-        <w:pStyle w:val="a9"/>
-        <w:numPr>
-          <w:ilvl w:val="0"/>
-          <w:numId w:val="50"/>
-        </w:numPr>
-        <w:rPr>
-          <w:rFonts w:ascii="Times New Roman" w:eastAsia="宋体" w:hAnsi="Times New Roman" w:cs="Times New Roman"/>
-        </w:rPr>
-      </w:pPr>
-      <w:r>
-        <w:rPr>
-          <w:rFonts w:ascii="Times New Roman" w:eastAsia="宋体" w:hAnsi="Times New Roman" w:cs="Times New Roman" w:hint="eastAsia"/>
-        </w:rPr>
-        <w:t>多选模式可以显示不同矿石类型的价格</w:t>
-      </w:r>
-    </w:p>
-    <w:p>
-      <w:pPr>
-        <w:pStyle w:val="a9"/>
-        <w:numPr>
-          <w:ilvl w:val="0"/>
-          <w:numId w:val="50"/>
-        </w:numPr>
-        <w:rPr>
-          <w:rFonts w:ascii="Times New Roman" w:eastAsia="宋体" w:hAnsi="Times New Roman" w:cs="Times New Roman"/>
-        </w:rPr>
-      </w:pPr>
-      <w:r>
-        <w:rPr>
-          <w:rFonts w:ascii="Times New Roman" w:eastAsia="宋体" w:hAnsi="Times New Roman" w:cs="Times New Roman" w:hint="eastAsia"/>
-        </w:rPr>
-        <w:t>优化了绘图界面缩小时的渲染性能</w:t>
-      </w:r>
-    </w:p>
-    <w:p>
-      <w:pPr>
-        <w:pStyle w:val="a9"/>
-        <w:numPr>
-          <w:ilvl w:val="0"/>
-          <w:numId w:val="50"/>
-        </w:numPr>
-        <w:rPr>
-          <w:rFonts w:ascii="Times New Roman" w:eastAsia="宋体" w:hAnsi="Times New Roman" w:cs="Times New Roman"/>
-        </w:rPr>
-      </w:pPr>
-      <w:r>
-        <w:rPr>
-          <w:rFonts w:ascii="Times New Roman" w:eastAsia="宋体" w:hAnsi="Times New Roman" w:cs="Times New Roman" w:hint="eastAsia"/>
-        </w:rPr>
-        <w:t>修复使用触发编辑器拖拽小点为步兵关联标签时，已关联标记没有依据步兵子单元格显示的</w:t>
-      </w:r>
-      <w:r>
-        <w:rPr>
-          <w:rFonts w:ascii="Times New Roman" w:eastAsia="宋体" w:hAnsi="Times New Roman" w:cs="Times New Roman" w:hint="eastAsia"/>
-        </w:rPr>
-        <w:t>bug</w:t>
-      </w:r>
-    </w:p>
-    <w:p>
-      <w:pPr>
-        <w:pStyle w:val="a9"/>
-        <w:numPr>
-          <w:ilvl w:val="0"/>
-          <w:numId w:val="50"/>
-        </w:numPr>
-        <w:rPr>
-          <w:rFonts w:ascii="Times New Roman" w:eastAsia="宋体" w:hAnsi="Times New Roman" w:cs="Times New Roman"/>
-        </w:rPr>
-      </w:pPr>
-      <w:r>
-        <w:rPr>
-          <w:rFonts w:ascii="Times New Roman" w:eastAsia="宋体" w:hAnsi="Times New Roman" w:cs="Times New Roman" w:hint="eastAsia"/>
-        </w:rPr>
-        <w:t>Lua</w:t>
-      </w:r>
-      <w:r>
-        <w:rPr>
-          <w:rFonts w:ascii="Times New Roman" w:eastAsia="宋体" w:hAnsi="Times New Roman" w:cs="Times New Roman" w:hint="eastAsia"/>
-        </w:rPr>
-        <w:t>脚本终端可以开启</w:t>
-      </w:r>
-      <w:r>
-        <w:rPr>
-          <w:rFonts w:ascii="Times New Roman" w:eastAsia="宋体" w:hAnsi="Times New Roman" w:cs="Times New Roman" w:hint="eastAsia"/>
-        </w:rPr>
-        <w:t>MCP</w:t>
-      </w:r>
-      <w:r>
-        <w:rPr>
-          <w:rFonts w:ascii="Times New Roman" w:eastAsia="宋体" w:hAnsi="Times New Roman" w:cs="Times New Roman" w:hint="eastAsia"/>
-        </w:rPr>
-        <w:t>服务器，接入大语言模型调用</w:t>
-      </w:r>
-      <w:r>
-        <w:rPr>
-          <w:rFonts w:ascii="Times New Roman" w:eastAsia="宋体" w:hAnsi="Times New Roman" w:cs="Times New Roman" w:hint="eastAsia"/>
-        </w:rPr>
-        <w:t>lua</w:t>
-      </w:r>
-      <w:r>
-        <w:rPr>
-          <w:rFonts w:ascii="Times New Roman" w:eastAsia="宋体" w:hAnsi="Times New Roman" w:cs="Times New Roman" w:hint="eastAsia"/>
-        </w:rPr>
-        <w:t>脚本</w:t>
-      </w:r>
-      <w:r>
-        <w:rPr>
-          <w:rFonts w:ascii="Times New Roman" w:eastAsia="宋体" w:hAnsi="Times New Roman" w:cs="Times New Roman" w:hint="eastAsia"/>
-        </w:rPr>
-        <w:t>。详见</w:t>
-      </w:r>
-      <w:r>
-        <w:rPr>
-          <w:rFonts w:ascii="Times New Roman" w:eastAsia="宋体" w:hAnsi="Times New Roman" w:cs="Times New Roman" w:hint="eastAsia"/>
-        </w:rPr>
-        <w:t>MCP.Enable</w:t>
-      </w:r>
-    </w:p>
-    <w:p>
-      <w:pPr>
-        <w:pStyle w:val="a9"/>
-        <w:numPr>
-          <w:ilvl w:val="0"/>
-          <w:numId w:val="50"/>
-        </w:numPr>
-        <w:rPr>
-          <w:rFonts w:ascii="Times New Roman" w:eastAsia="宋体" w:hAnsi="Times New Roman" w:cs="Times New Roman"/>
-        </w:rPr>
-      </w:pPr>
-      <w:r>
-        <w:rPr>
-          <w:rFonts w:ascii="Times New Roman" w:eastAsia="宋体" w:hAnsi="Times New Roman" w:cs="Times New Roman" w:hint="eastAsia"/>
-        </w:rPr>
-        <w:t>修复渲染部分</w:t>
-      </w:r>
-      <w:r>
-        <w:rPr>
-          <w:rFonts w:ascii="Times New Roman" w:eastAsia="宋体" w:hAnsi="Times New Roman" w:cs="Times New Roman" w:hint="eastAsia"/>
-        </w:rPr>
-        <w:t>vxl</w:t>
-      </w:r>
-      <w:r>
-        <w:rPr>
-          <w:rFonts w:ascii="Times New Roman" w:eastAsia="宋体" w:hAnsi="Times New Roman" w:cs="Times New Roman" w:hint="eastAsia"/>
-        </w:rPr>
-        <w:t>时崩溃的</w:t>
-      </w:r>
-      <w:r>
-        <w:rPr>
-          <w:rFonts w:ascii="Times New Roman" w:eastAsia="宋体" w:hAnsi="Times New Roman" w:cs="Times New Roman" w:hint="eastAsia"/>
-        </w:rPr>
-        <w:t>bug</w:t>
-      </w:r>
-    </w:p>
-    <w:p>
-      <w:pPr>
-        <w:pStyle w:val="a9"/>
-        <w:numPr>
-          <w:ilvl w:val="0"/>
-          <w:numId w:val="50"/>
-        </w:numPr>
-        <w:rPr>
-          <w:rFonts w:ascii="Times New Roman" w:eastAsia="宋体" w:hAnsi="Times New Roman" w:cs="Times New Roman"/>
-        </w:rPr>
-      </w:pPr>
-      <w:r>
-        <w:rPr>
-          <w:rFonts w:ascii="Times New Roman" w:eastAsia="宋体" w:hAnsi="Times New Roman" w:cs="Times New Roman" w:hint="eastAsia"/>
-        </w:rPr>
-        <w:t>基本设置窗口增加背景音乐和载入界面背景音乐选项</w:t>
-      </w:r>
-    </w:p>
-    <w:p>
-      <w:pPr>
-        <w:pStyle w:val="a9"/>
-        <w:numPr>
-          <w:ilvl w:val="0"/>
-          <w:numId w:val="50"/>
-        </w:numPr>
-        <w:rPr>
-          <w:rFonts w:ascii="Times New Roman" w:eastAsia="宋体" w:hAnsi="Times New Roman" w:cs="Times New Roman"/>
-        </w:rPr>
-      </w:pPr>
-      <w:r>
-        <w:rPr>
-          <w:rFonts w:ascii="Times New Roman" w:eastAsia="宋体" w:hAnsi="Times New Roman" w:cs="Times New Roman" w:hint="eastAsia"/>
-        </w:rPr>
-        <w:t>单人任务设置</w:t>
-      </w:r>
-      <w:r>
-        <w:rPr>
-          <w:rFonts w:ascii="Times New Roman" w:eastAsia="宋体" w:hAnsi="Times New Roman" w:cs="Times New Roman" w:hint="eastAsia"/>
-        </w:rPr>
-        <w:t>-</w:t>
-      </w:r>
-      <w:r>
-        <w:rPr>
-          <w:rFonts w:ascii="Times New Roman" w:eastAsia="宋体" w:hAnsi="Times New Roman" w:cs="Times New Roman" w:hint="eastAsia"/>
-        </w:rPr>
-        <w:t>幻影伪装树木可以使用绘制随机树木窗口进行选择</w:t>
-      </w:r>
-    </w:p>
-    <w:p>
-      <w:pPr>
-        <w:pStyle w:val="a9"/>
-        <w:numPr>
-          <w:ilvl w:val="0"/>
-          <w:numId w:val="50"/>
-        </w:numPr>
-        <w:rPr>
-          <w:rFonts w:ascii="Times New Roman" w:eastAsia="宋体" w:hAnsi="Times New Roman" w:cs="Times New Roman"/>
-        </w:rPr>
-      </w:pPr>
-      <w:r>
-        <w:rPr>
-          <w:rFonts w:ascii="Times New Roman" w:eastAsia="宋体" w:hAnsi="Times New Roman" w:cs="Times New Roman" w:hint="eastAsia"/>
-        </w:rPr>
-        <w:t>放置高架桥头时，可以显示辅助参考线</w:t>
-      </w:r>
-    </w:p>
-    <w:p>
-      <w:pPr>
-        <w:pStyle w:val="a9"/>
-        <w:numPr>
-          <w:ilvl w:val="0"/>
-          <w:numId w:val="50"/>
-        </w:numPr>
-        <w:rPr>
-          <w:rFonts w:ascii="Times New Roman" w:eastAsia="宋体" w:hAnsi="Times New Roman" w:cs="Times New Roman"/>
-        </w:rPr>
-      </w:pPr>
-      <w:r>
-        <w:rPr>
-          <w:rFonts w:ascii="Times New Roman" w:eastAsia="宋体" w:hAnsi="Times New Roman" w:cs="Times New Roman" w:hint="eastAsia"/>
-        </w:rPr>
-        <w:t>为触发编辑器检查下级触发是否是自身添加开关，详见</w:t>
-      </w:r>
-      <w:r>
-        <w:rPr>
-          <w:rFonts w:ascii="Times New Roman" w:eastAsia="宋体" w:hAnsi="Times New Roman" w:cs="Times New Roman" w:hint="eastAsia"/>
-        </w:rPr>
-        <w:t>AttachedTriggerIsSelfCheck</w:t>
-      </w:r>
-    </w:p>
-    <w:p>
-      <w:pPr>
-        <w:pStyle w:val="a9"/>
-        <w:numPr>
-          <w:ilvl w:val="0"/>
-          <w:numId w:val="50"/>
-        </w:numPr>
-        <w:rPr>
-          <w:rFonts w:ascii="Times New Roman" w:eastAsia="宋体" w:hAnsi="Times New Roman" w:cs="Times New Roman"/>
-        </w:rPr>
-      </w:pPr>
-      <w:r>
-        <w:rPr>
-          <w:rFonts w:ascii="Times New Roman" w:eastAsia="宋体" w:hAnsi="Times New Roman" w:cs="Times New Roman" w:hint="eastAsia"/>
-        </w:rPr>
-        <w:t>修复遭遇战地图预览渲染时没有正确标记高架桥的</w:t>
-      </w:r>
-      <w:r>
-        <w:rPr>
-          <w:rFonts w:ascii="Times New Roman" w:eastAsia="宋体" w:hAnsi="Times New Roman" w:cs="Times New Roman" w:hint="eastAsia"/>
-        </w:rPr>
-        <w:t>bug</w:t>
-      </w:r>
-    </w:p>
-    <w:p>
-      <w:pPr>
-        <w:pStyle w:val="a9"/>
-        <w:numPr>
-          <w:ilvl w:val="0"/>
-          <w:numId w:val="50"/>
-        </w:numPr>
-        <w:rPr>
-          <w:rFonts w:ascii="Times New Roman" w:eastAsia="宋体" w:hAnsi="Times New Roman" w:cs="Times New Roman"/>
-        </w:rPr>
-      </w:pPr>
-      <w:r>
-        <w:rPr>
-          <w:rFonts w:ascii="Times New Roman" w:eastAsia="宋体" w:hAnsi="Times New Roman" w:cs="Times New Roman" w:hint="eastAsia"/>
-        </w:rPr>
-        <w:t>为</w:t>
-      </w:r>
-      <w:r>
-        <w:rPr>
-          <w:rFonts w:ascii="Times New Roman" w:eastAsia="宋体" w:hAnsi="Times New Roman" w:cs="Times New Roman" w:hint="eastAsia"/>
-        </w:rPr>
-        <w:t>Lua</w:t>
-      </w:r>
-      <w:r>
-        <w:rPr>
-          <w:rFonts w:ascii="Times New Roman" w:eastAsia="宋体" w:hAnsi="Times New Roman" w:cs="Times New Roman" w:hint="eastAsia"/>
-        </w:rPr>
-        <w:t>脚本终端添加安全检查，会在执行前静态检查高危操作，详见</w:t>
-      </w:r>
-      <w:r>
-        <w:rPr>
-          <w:rFonts w:ascii="Times New Roman" w:eastAsia="宋体" w:hAnsi="Times New Roman" w:cs="Times New Roman" w:hint="eastAsia"/>
-        </w:rPr>
-        <w:t>DisableLuaConsoleSafetyCheck</w:t>
-      </w:r>
-    </w:p>
-    <w:p>
-      <w:pPr>
-        <w:pStyle w:val="a9"/>
-        <w:numPr>
-          <w:ilvl w:val="0"/>
-          <w:numId w:val="50"/>
-        </w:numPr>
-        <w:rPr>
-          <w:rFonts w:ascii="Times New Roman" w:eastAsia="宋体" w:hAnsi="Times New Roman" w:cs="Times New Roman"/>
-        </w:rPr>
-      </w:pPr>
-      <w:r>
-        <w:rPr>
-          <w:rFonts w:ascii="Times New Roman" w:eastAsia="宋体" w:hAnsi="Times New Roman" w:cs="Times New Roman" w:hint="eastAsia"/>
-        </w:rPr>
-        <w:t>可以在地图视图内按方向键调节视角，同时按住</w:t>
-      </w:r>
-      <w:r>
-        <w:rPr>
-          <w:rFonts w:ascii="Times New Roman" w:eastAsia="宋体" w:hAnsi="Times New Roman" w:cs="Times New Roman" w:hint="eastAsia"/>
-        </w:rPr>
-        <w:t>ctrl</w:t>
-      </w:r>
-      <w:r>
-        <w:rPr>
-          <w:rFonts w:ascii="Times New Roman" w:eastAsia="宋体" w:hAnsi="Times New Roman" w:cs="Times New Roman" w:hint="eastAsia"/>
-        </w:rPr>
-        <w:t>键加速移动</w:t>
-      </w:r>
-    </w:p>
-    <w:p>
-      <w:pPr>
-        <w:pStyle w:val="a9"/>
-        <w:numPr>
-          <w:ilvl w:val="0"/>
-          <w:numId w:val="50"/>
-        </w:numPr>
-        <w:rPr>
-          <w:rFonts w:ascii="Times New Roman" w:eastAsia="宋体" w:hAnsi="Times New Roman" w:cs="Times New Roman"/>
-        </w:rPr>
-      </w:pPr>
-      <w:r>
-        <w:rPr>
-          <w:rFonts w:ascii="Times New Roman" w:eastAsia="宋体" w:hAnsi="Times New Roman" w:cs="Times New Roman" w:hint="eastAsia"/>
-        </w:rPr>
-        <w:t>修复部分遭遇战地图所属方选项重复的</w:t>
-      </w:r>
-      <w:r>
-        <w:rPr>
-          <w:rFonts w:ascii="Times New Roman" w:eastAsia="宋体" w:hAnsi="Times New Roman" w:cs="Times New Roman" w:hint="eastAsia"/>
-        </w:rPr>
-        <w:t>bug</w:t>
-      </w:r>
-    </w:p>
-    <w:p>
-      <w:pPr>
-        <w:pStyle w:val="a9"/>
-        <w:numPr>
-          <w:ilvl w:val="0"/>
-          <w:numId w:val="50"/>
-        </w:numPr>
-        <w:rPr>
-          <w:rFonts w:ascii="Times New Roman" w:eastAsia="宋体" w:hAnsi="Times New Roman" w:cs="Times New Roman"/>
-        </w:rPr>
-      </w:pPr>
-      <w:r>
-        <w:rPr>
-          <w:rFonts w:ascii="Times New Roman" w:eastAsia="宋体" w:hAnsi="Times New Roman" w:cs="Times New Roman" w:hint="eastAsia"/>
-        </w:rPr>
-        <w:t>重写单位属性对话框，标签支持搜索，所属方可以显示颜色</w:t>
-      </w:r>
-    </w:p>
-    <w:p>
-      <w:pPr>
-        <w:pStyle w:val="a9"/>
-        <w:numPr>
-          <w:ilvl w:val="0"/>
-          <w:numId w:val="50"/>
-        </w:numPr>
-        <w:rPr>
-          <w:rFonts w:ascii="Times New Roman" w:eastAsia="宋体" w:hAnsi="Times New Roman" w:cs="Times New Roman"/>
-        </w:rPr>
-      </w:pPr>
-      <w:r>
-        <w:rPr>
-          <w:rFonts w:ascii="Times New Roman" w:eastAsia="宋体" w:hAnsi="Times New Roman" w:cs="Times New Roman" w:hint="eastAsia"/>
-        </w:rPr>
-        <w:t>支持将</w:t>
-      </w:r>
-      <w:r>
-        <w:rPr>
-          <w:rFonts w:ascii="Times New Roman" w:eastAsia="宋体" w:hAnsi="Times New Roman" w:cs="Times New Roman" w:hint="eastAsia"/>
-        </w:rPr>
-        <w:t>物品浏览器和</w:t>
-      </w:r>
-      <w:r>
-        <w:rPr>
-          <w:rFonts w:ascii="Times New Roman" w:eastAsia="宋体" w:hAnsi="Times New Roman" w:cs="Times New Roman" w:hint="eastAsia"/>
-        </w:rPr>
-        <w:t>地形浏览器作为一个独立窗口显示</w:t>
-      </w:r>
-      <w:r>
-        <w:rPr>
-          <w:rFonts w:ascii="Times New Roman" w:eastAsia="宋体" w:hAnsi="Times New Roman" w:cs="Times New Roman" w:hint="eastAsia"/>
-        </w:rPr>
-        <w:t>，可以调节透明度</w:t>
-      </w:r>
-      <w:r>
-        <w:rPr>
-          <w:rFonts w:ascii="Times New Roman" w:eastAsia="宋体" w:hAnsi="Times New Roman" w:cs="Times New Roman" w:hint="eastAsia"/>
-        </w:rPr>
-        <w:t>，详见</w:t>
-      </w:r>
-      <w:r>
-        <w:rPr>
-          <w:rFonts w:ascii="Times New Roman" w:eastAsia="宋体" w:hAnsi="Times New Roman" w:cs="Times New Roman" w:hint="eastAsia"/>
-        </w:rPr>
-        <w:t>ViewObjectsFloating</w:t>
-      </w:r>
-      <w:r>
-        <w:rPr>
-          <w:rFonts w:ascii="Times New Roman" w:eastAsia="宋体" w:hAnsi="Times New Roman" w:cs="Times New Roman" w:hint="eastAsia"/>
-        </w:rPr>
-        <w:t>和</w:t>
-      </w:r>
-      <w:r>
-        <w:rPr>
-          <w:rFonts w:ascii="Times New Roman" w:eastAsia="宋体" w:hAnsi="Times New Roman" w:cs="Times New Roman" w:hint="eastAsia"/>
-        </w:rPr>
-        <w:t>TileSetBrowserFloating</w:t>
-      </w:r>
-    </w:p>
-    <w:p>
-      <w:pPr>
-        <w:pStyle w:val="a9"/>
-        <w:numPr>
-          <w:ilvl w:val="0"/>
-          <w:numId w:val="50"/>
-        </w:numPr>
-        <w:rPr>
-          <w:rFonts w:ascii="Times New Roman" w:eastAsia="宋体" w:hAnsi="Times New Roman" w:cs="Times New Roman"/>
-        </w:rPr>
-      </w:pPr>
-      <w:r>
-        <w:rPr>
-          <w:rFonts w:ascii="Times New Roman" w:eastAsia="宋体" w:hAnsi="Times New Roman" w:cs="Times New Roman" w:hint="eastAsia"/>
-        </w:rPr>
-        <w:t>绝大多数窗口可以调节透明度</w:t>
-      </w:r>
-    </w:p>
-    <w:p>
-      <w:pPr>
-        <w:pStyle w:val="a9"/>
-        <w:numPr>
-          <w:ilvl w:val="0"/>
-          <w:numId w:val="50"/>
-        </w:numPr>
-        <w:rPr>
-          <w:rFonts w:ascii="Times New Roman" w:eastAsia="宋体" w:hAnsi="Times New Roman" w:cs="Times New Roman"/>
-        </w:rPr>
-      </w:pPr>
-      <w:r>
-        <w:rPr>
-          <w:rFonts w:ascii="Times New Roman" w:eastAsia="宋体" w:hAnsi="Times New Roman" w:cs="Times New Roman" w:hint="eastAsia"/>
-        </w:rPr>
-        <w:t>修复部分情况下按工具栏擦除覆盖物等按钮不生效的</w:t>
-      </w:r>
-      <w:r>
-        <w:rPr>
-          <w:rFonts w:ascii="Times New Roman" w:eastAsia="宋体" w:hAnsi="Times New Roman" w:cs="Times New Roman" w:hint="eastAsia"/>
-        </w:rPr>
-        <w:t>bug</w:t>
-      </w:r>
-    </w:p>
-    <w:p>
-      <w:pPr>
-        <w:pStyle w:val="a9"/>
-        <w:numPr>
-          <w:ilvl w:val="0"/>
-          <w:numId w:val="50"/>
-        </w:numPr>
-        <w:rPr>
-          <w:rFonts w:ascii="Times New Roman" w:eastAsia="宋体" w:hAnsi="Times New Roman" w:cs="Times New Roman"/>
-        </w:rPr>
-      </w:pPr>
-      <w:r>
-        <w:rPr>
-          <w:rFonts w:ascii="Times New Roman" w:eastAsia="宋体" w:hAnsi="Times New Roman" w:cs="Times New Roman" w:hint="eastAsia"/>
-        </w:rPr>
-        <w:t>修复暗色模式下非主程序菜单的背景色被错误填充的</w:t>
-      </w:r>
-      <w:r>
-        <w:rPr>
-          <w:rFonts w:ascii="Times New Roman" w:eastAsia="宋体" w:hAnsi="Times New Roman" w:cs="Times New Roman" w:hint="eastAsia"/>
-        </w:rPr>
-        <w:t>bug</w:t>
-      </w:r>
-    </w:p>
-    <w:p>
-      <w:pPr>
-        <w:pStyle w:val="a9"/>
-        <w:numPr>
-          <w:ilvl w:val="0"/>
-          <w:numId w:val="50"/>
-        </w:numPr>
-        <w:rPr>
-          <w:rFonts w:ascii="Times New Roman" w:eastAsia="宋体" w:hAnsi="Times New Roman" w:cs="Times New Roman"/>
-        </w:rPr>
-      </w:pPr>
-      <w:r>
-        <w:rPr>
-          <w:rFonts w:ascii="Times New Roman" w:eastAsia="宋体" w:hAnsi="Times New Roman" w:cs="Times New Roman" w:hint="eastAsia"/>
-        </w:rPr>
-        <w:t>为触发编辑器、</w:t>
-      </w:r>
-      <w:r>
-        <w:rPr>
-          <w:rFonts w:ascii="Times New Roman" w:eastAsia="宋体" w:hAnsi="Times New Roman" w:cs="Times New Roman" w:hint="eastAsia"/>
-        </w:rPr>
-        <w:t>AI</w:t>
-      </w:r>
-      <w:r>
-        <w:rPr>
-          <w:rFonts w:ascii="Times New Roman" w:eastAsia="宋体" w:hAnsi="Times New Roman" w:cs="Times New Roman" w:hint="eastAsia"/>
-        </w:rPr>
-        <w:t>触发编辑器增加跳转按钮，可以跳转到参数对应的路径点、小队等位置</w:t>
-      </w:r>
-    </w:p>
-    <w:p>
-      <w:pPr>
-        <w:pStyle w:val="a9"/>
-        <w:numPr>
-          <w:ilvl w:val="0"/>
-          <w:numId w:val="50"/>
-        </w:numPr>
-        <w:rPr>
-          <w:rFonts w:ascii="Times New Roman" w:eastAsia="宋体" w:hAnsi="Times New Roman" w:cs="Times New Roman"/>
-        </w:rPr>
-      </w:pPr>
-      <w:r>
-        <w:rPr>
-          <w:rFonts w:ascii="Times New Roman" w:eastAsia="宋体" w:hAnsi="Times New Roman" w:cs="Times New Roman" w:hint="eastAsia"/>
-        </w:rPr>
-        <w:t>受损火焰能正确被其他单位遮挡</w:t>
-      </w:r>
-      <w:r>
-        <w:rPr>
-          <w:rFonts w:ascii="Times New Roman" w:eastAsia="宋体" w:hAnsi="Times New Roman" w:cs="Times New Roman" w:hint="eastAsia"/>
-        </w:rPr>
-        <w:t>，可以读取</w:t>
-      </w:r>
-      <w:r>
-        <w:rPr>
-          <w:rFonts w:ascii="Times New Roman" w:eastAsia="宋体" w:hAnsi="Times New Roman" w:cs="Times New Roman" w:hint="eastAsia"/>
-        </w:rPr>
-        <w:t>Next=</w:t>
-      </w:r>
-      <w:r>
-        <w:rPr>
-          <w:rFonts w:ascii="Times New Roman" w:eastAsia="宋体" w:hAnsi="Times New Roman" w:cs="Times New Roman" w:hint="eastAsia"/>
-        </w:rPr>
-        <w:t>最终的</w:t>
-      </w:r>
-      <w:r>
-        <w:rPr>
-          <w:rFonts w:ascii="Times New Roman" w:eastAsia="宋体" w:hAnsi="Times New Roman" w:cs="Times New Roman" w:hint="eastAsia"/>
-        </w:rPr>
-        <w:t>图像</w:t>
-      </w:r>
-    </w:p>
-    <w:p>
-      <w:pPr>
-        <w:pStyle w:val="a9"/>
-        <w:numPr>
-          <w:ilvl w:val="0"/>
-          <w:numId w:val="50"/>
-        </w:numPr>
-        <w:rPr>
-          <w:rFonts w:ascii="Times New Roman" w:eastAsia="宋体" w:hAnsi="Times New Roman" w:cs="Times New Roman"/>
-        </w:rPr>
-      </w:pPr>
-      <w:r>
-        <w:rPr>
-          <w:rFonts w:ascii="Times New Roman" w:eastAsia="宋体" w:hAnsi="Times New Roman" w:cs="Times New Roman" w:hint="eastAsia"/>
-        </w:rPr>
-        <w:t>抬升、降低、平坦地表工具增加顶点模式，切换后可以直接修改顶点高度，生成更精细的斜坡</w:t>
-      </w:r>
-    </w:p>
-    <w:p>
-      <w:pPr>
-        <w:pStyle w:val="a9"/>
-        <w:numPr>
-          <w:ilvl w:val="0"/>
-          <w:numId w:val="50"/>
-        </w:numPr>
-        <w:rPr>
-          <w:rFonts w:ascii="Times New Roman" w:eastAsia="宋体" w:hAnsi="Times New Roman" w:cs="Times New Roman"/>
-        </w:rPr>
-      </w:pPr>
-      <w:r>
-        <w:rPr>
-          <w:rFonts w:ascii="Times New Roman" w:eastAsia="宋体" w:hAnsi="Times New Roman" w:cs="Times New Roman" w:hint="eastAsia"/>
-        </w:rPr>
-        <w:t>支持在打开地图时重新加载游戏</w:t>
-      </w:r>
-      <w:r>
-        <w:rPr>
-          <w:rFonts w:ascii="Times New Roman" w:eastAsia="宋体" w:hAnsi="Times New Roman" w:cs="Times New Roman" w:hint="eastAsia"/>
-        </w:rPr>
-        <w:t>ini</w:t>
-      </w:r>
-      <w:r>
-        <w:rPr>
-          <w:rFonts w:ascii="Times New Roman" w:eastAsia="宋体" w:hAnsi="Times New Roman" w:cs="Times New Roman" w:hint="eastAsia"/>
-        </w:rPr>
-        <w:t>，详见</w:t>
-      </w:r>
-      <w:r>
-        <w:rPr>
-          <w:rFonts w:ascii="Times New Roman" w:eastAsia="宋体" w:hAnsi="Times New Roman" w:cs="Times New Roman" w:hint="eastAsia"/>
-        </w:rPr>
-        <w:t>ReloadIniWhenOpeningMap</w:t>
-      </w:r>
-    </w:p>
-    <w:p>
-      <w:pPr>
-        <w:pStyle w:val="a9"/>
-        <w:numPr>
-          <w:ilvl w:val="0"/>
-          <w:numId w:val="50"/>
-        </w:numPr>
-        <w:rPr>
-          <w:rFonts w:ascii="Times New Roman" w:eastAsia="宋体" w:hAnsi="Times New Roman" w:cs="Times New Roman"/>
-        </w:rPr>
-      </w:pPr>
-      <w:r>
-        <w:rPr>
-          <w:rFonts w:ascii="Times New Roman" w:eastAsia="宋体" w:hAnsi="Times New Roman" w:cs="Times New Roman" w:hint="eastAsia"/>
-        </w:rPr>
-        <w:t>修复按</w:t>
-      </w:r>
-      <w:r>
-        <w:rPr>
-          <w:rFonts w:ascii="Times New Roman" w:eastAsia="宋体" w:hAnsi="Times New Roman" w:cs="Times New Roman" w:hint="eastAsia"/>
-        </w:rPr>
-        <w:t>delete</w:t>
-      </w:r>
-      <w:r>
-        <w:rPr>
-          <w:rFonts w:ascii="Times New Roman" w:eastAsia="宋体" w:hAnsi="Times New Roman" w:cs="Times New Roman" w:hint="eastAsia"/>
-        </w:rPr>
-        <w:t>无法删除游戏对象的</w:t>
-      </w:r>
-      <w:r>
-        <w:rPr>
-          <w:rFonts w:ascii="Times New Roman" w:eastAsia="宋体" w:hAnsi="Times New Roman" w:cs="Times New Roman" w:hint="eastAsia"/>
-        </w:rPr>
-        <w:t>bug</w:t>
-      </w:r>
-    </w:p>
-    <w:p>
-      <w:pPr>
-        <w:pStyle w:val="a9"/>
-        <w:numPr>
-          <w:ilvl w:val="0"/>
-          <w:numId w:val="50"/>
-        </w:numPr>
-        <w:rPr>
-          <w:rFonts w:ascii="Times New Roman" w:eastAsia="宋体" w:hAnsi="Times New Roman" w:cs="Times New Roman"/>
-        </w:rPr>
-      </w:pPr>
-      <w:r>
-        <w:rPr>
-          <w:rFonts w:ascii="Times New Roman" w:eastAsia="宋体" w:hAnsi="Times New Roman" w:cs="Times New Roman" w:hint="eastAsia"/>
-        </w:rPr>
-        <w:t>修复查找引用窗口的跟随活动的窗口不随窗口大小移动的</w:t>
-      </w:r>
-      <w:r>
-        <w:rPr>
-          <w:rFonts w:ascii="Times New Roman" w:eastAsia="宋体" w:hAnsi="Times New Roman" w:cs="Times New Roman" w:hint="eastAsia"/>
-        </w:rPr>
-        <w:t>bug</w:t>
-      </w:r>
-    </w:p>
-    <w:p>
-      <w:pPr>
-        <w:pStyle w:val="a9"/>
-        <w:numPr>
-          <w:ilvl w:val="0"/>
-          <w:numId w:val="50"/>
-        </w:numPr>
-        <w:rPr>
-          <w:rFonts w:ascii="Times New Roman" w:eastAsia="宋体" w:hAnsi="Times New Roman" w:cs="Times New Roman"/>
-        </w:rPr>
-      </w:pPr>
-      <w:r>
-        <w:rPr>
-          <w:rFonts w:ascii="Times New Roman" w:eastAsia="宋体" w:hAnsi="Times New Roman" w:cs="Times New Roman" w:hint="eastAsia"/>
-        </w:rPr>
-        <w:t>为重载地图增加了确认对话框</w:t>
-      </w:r>
-    </w:p>
-    <w:p>
-      <w:pPr>
-        <w:pStyle w:val="a9"/>
-        <w:numPr>
-          <w:ilvl w:val="0"/>
-          <w:numId w:val="50"/>
-        </w:numPr>
-        <w:rPr>
-          <w:rFonts w:ascii="Times New Roman" w:eastAsia="宋体" w:hAnsi="Times New Roman" w:cs="Times New Roman"/>
-        </w:rPr>
-      </w:pPr>
-      <w:r>
-        <w:rPr>
-          <w:rFonts w:ascii="Times New Roman" w:eastAsia="宋体" w:hAnsi="Times New Roman" w:cs="Times New Roman" w:hint="eastAsia"/>
-        </w:rPr>
-        <w:t>可以调节多选模式选中单元格的染色透明度，详见</w:t>
-      </w:r>
-      <w:r>
-        <w:rPr>
-          <w:rFonts w:ascii="Times New Roman" w:eastAsia="宋体" w:hAnsi="Times New Roman" w:cs="Times New Roman" w:hint="eastAsia"/>
-        </w:rPr>
-        <w:t>MultiSelect.Opacity</w:t>
-      </w:r>
-    </w:p>
-    <w:p>
-      <w:pPr>
-        <w:pStyle w:val="a9"/>
-        <w:numPr>
-          <w:ilvl w:val="0"/>
-          <w:numId w:val="50"/>
-        </w:numPr>
-        <w:rPr>
-          <w:rFonts w:ascii="Times New Roman" w:eastAsia="宋体" w:hAnsi="Times New Roman" w:cs="Times New Roman"/>
-        </w:rPr>
-      </w:pPr>
-      <w:r>
-        <w:rPr>
-          <w:rFonts w:ascii="Times New Roman" w:eastAsia="宋体" w:hAnsi="Times New Roman" w:cs="Times New Roman" w:hint="eastAsia"/>
-        </w:rPr>
         <w:t>优化地形生成器随机地形的算法</w:t>
       </w:r>
     </w:p>
@@ -1963,7 +1990,6 @@
           <w:sz w:val="28"/>
           <w:szCs w:val="32"/>
         </w:rPr>
-        <w:lastRenderedPageBreak/>
         <w:t>1.4.4 (2026.06.</w:t>
       </w:r>
       <w:r>
@@ -3020,6 +3046,7 @@
         <w:rPr>
           <w:rFonts w:ascii="Times New Roman" w:eastAsia="宋体" w:hAnsi="Times New Roman" w:cs="Times New Roman" w:hint="eastAsia"/>
         </w:rPr>
+        <w:lastRenderedPageBreak/>
         <w:t>优化右键拖动流畅度，拖动时可以实时更新小地图</w:t>
       </w:r>
     </w:p>
@@ -3038,7 +3065,6 @@
         <w:rPr>
           <w:rFonts w:ascii="Times New Roman" w:eastAsia="宋体" w:hAnsi="Times New Roman" w:cs="Times New Roman" w:hint="eastAsia"/>
         </w:rPr>
-        <w:lastRenderedPageBreak/>
         <w:t>优化右键取消当前指令时物品浏览器不停向上切换的</w:t>
       </w:r>
       <w:r>
@@ -3870,7 +3896,14 @@
         <w:rPr>
           <w:rFonts w:ascii="Times New Roman" w:eastAsia="宋体" w:hAnsi="Times New Roman" w:cs="Times New Roman" w:hint="eastAsia"/>
         </w:rPr>
-        <w:t>优化路径点列表性能，各列表会在对应编辑器内新建、复制、删除对象时刷新</w:t>
+        <w:t>优化路径点列表性能，各列表会在对应编辑器内新建、复制、删除对象时刷</w:t>
+      </w:r>
+      <w:r>
+        <w:rPr>
+          <w:rFonts w:ascii="Times New Roman" w:eastAsia="宋体" w:hAnsi="Times New Roman" w:cs="Times New Roman" w:hint="eastAsia"/>
+        </w:rPr>
+        <w:lastRenderedPageBreak/>
+        <w:t>新</w:t>
       </w:r>
     </w:p>
     <w:p>
@@ -3888,7 +3921,6 @@
         <w:rPr>
           <w:rFonts w:ascii="Times New Roman" w:eastAsia="宋体" w:hAnsi="Times New Roman" w:cs="Times New Roman" w:hint="eastAsia"/>
         </w:rPr>
-        <w:lastRenderedPageBreak/>
         <w:t>可以在</w:t>
       </w:r>
       <w:r>
@@ -49198,7 +49230,7 @@
         <v:path o:extrusionok="f" gradientshapeok="t" o:connecttype="rect"/>
         <o:lock v:ext="edit" aspectratio="t"/>
       </v:shapetype>
-      <v:shape id="_x0000_i1031" type="#_x0000_t75" style="width:11.55pt;height:11.55pt" o:bullet="t">
+      <v:shape id="_x0000_i1027" type="#_x0000_t75" style="width:11.55pt;height:11.55pt" o:bullet="t">
         <v:imagedata r:id="rId1" o:title="mso9A9A"/>
       </v:shape>
     </w:pict>

</xml_diff>

<commit_message>
add lua class terrain_generator
</commit_message>
<xml_diff>
--- a/Supplementary/文档/FA2SP HDM Edition说明文档.docx
+++ b/Supplementary/文档/FA2SP HDM Edition说明文档.docx
@@ -167,7 +167,7 @@
           <w:rFonts w:ascii="宋体" w:eastAsia="宋体" w:hAnsi="宋体" w:hint="eastAsia"/>
           <w:sz w:val="24"/>
         </w:rPr>
-        <w:t>7</w:t>
+        <w:t>9</w:t>
       </w:r>
     </w:p>
     <w:p>
@@ -249,17 +249,7 @@
           <w:sz w:val="28"/>
           <w:szCs w:val="32"/>
         </w:rPr>
-        <w:t>0</w:t>
-      </w:r>
-      <w:r>
-        <w:rPr>
-          <w:rFonts w:ascii="Times New Roman" w:eastAsia="宋体" w:hAnsi="Times New Roman" w:cs="Times New Roman" w:hint="eastAsia"/>
-          <w:b/>
-          <w:bCs/>
-          <w:sz w:val="28"/>
-          <w:szCs w:val="32"/>
-        </w:rPr>
-        <w:t>7</w:t>
+        <w:t>09</w:t>
       </w:r>
       <w:r>
         <w:rPr>
@@ -676,6 +666,24 @@
         </w:rPr>
         <w:t>脚本</w:t>
       </w:r>
+      <w:r>
+        <w:rPr>
+          <w:rFonts w:ascii="Times New Roman" w:eastAsia="宋体" w:hAnsi="Times New Roman" w:cs="Times New Roman" w:hint="eastAsia"/>
+        </w:rPr>
+        <w:t>，新增</w:t>
+      </w:r>
+      <w:r>
+        <w:rPr>
+          <w:rFonts w:ascii="Times New Roman" w:eastAsia="宋体" w:hAnsi="Times New Roman" w:cs="Times New Roman" w:hint="eastAsia"/>
+        </w:rPr>
+        <w:t>terrain_generator lua</w:t>
+      </w:r>
+      <w:r>
+        <w:rPr>
+          <w:rFonts w:ascii="Times New Roman" w:eastAsia="宋体" w:hAnsi="Times New Roman" w:cs="Times New Roman" w:hint="eastAsia"/>
+        </w:rPr>
+        <w:t>类</w:t>
+      </w:r>
     </w:p>
     <w:p>
       <w:pPr>
@@ -721,7 +729,7 @@
           <w:numId w:val="11"/>
         </w:numPr>
         <w:rPr>
-          <w:rFonts w:ascii="Times New Roman" w:eastAsia="宋体" w:hAnsi="Times New Roman" w:cs="Times New Roman" w:hint="eastAsia"/>
+          <w:rFonts w:ascii="Times New Roman" w:eastAsia="宋体" w:hAnsi="Times New Roman" w:cs="Times New Roman"/>
         </w:rPr>
       </w:pPr>
       <w:r>

</xml_diff>

<commit_message>
terrain generation no longer exceeds boundary
</commit_message>
<xml_diff>
--- a/Supplementary/文档/FA2SP HDM Edition说明文档.docx
+++ b/Supplementary/文档/FA2SP HDM Edition说明文档.docx
@@ -167,7 +167,7 @@
           <w:rFonts w:ascii="宋体" w:eastAsia="宋体" w:hAnsi="宋体" w:hint="eastAsia"/>
           <w:sz w:val="24"/>
         </w:rPr>
-        <w:t>9</w:t>
+        <w:t>11</w:t>
       </w:r>
     </w:p>
     <w:p>
@@ -249,7 +249,7 @@
           <w:sz w:val="28"/>
           <w:szCs w:val="32"/>
         </w:rPr>
-        <w:t>09</w:t>
+        <w:t>11</w:t>
       </w:r>
       <w:r>
         <w:rPr>
@@ -804,6 +804,24 @@
         <w:pStyle w:val="a9"/>
         <w:numPr>
           <w:ilvl w:val="0"/>
+          <w:numId w:val="11"/>
+        </w:numPr>
+        <w:rPr>
+          <w:rFonts w:ascii="Times New Roman" w:eastAsia="宋体" w:hAnsi="Times New Roman" w:cs="Times New Roman"/>
+        </w:rPr>
+      </w:pPr>
+      <w:r>
+        <w:rPr>
+          <w:rFonts w:ascii="Times New Roman" w:eastAsia="宋体" w:hAnsi="Times New Roman" w:cs="Times New Roman" w:hint="eastAsia"/>
+        </w:rPr>
+        <w:t>地形生成器放置的地形不会再超出选取范围</w:t>
+      </w:r>
+    </w:p>
+    <w:p>
+      <w:pPr>
+        <w:pStyle w:val="a9"/>
+        <w:numPr>
+          <w:ilvl w:val="0"/>
           <w:numId w:val="10"/>
         </w:numPr>
         <w:rPr>
@@ -1092,6 +1110,7 @@
         <w:rPr>
           <w:rFonts w:ascii="Times New Roman" w:eastAsia="宋体" w:hAnsi="Times New Roman" w:cs="Times New Roman" w:hint="eastAsia"/>
         </w:rPr>
+        <w:lastRenderedPageBreak/>
         <w:t>修复启用建筑筛选时无法隐藏阴影的</w:t>
       </w:r>
       <w:r>
@@ -1116,903 +1135,896 @@
         <w:rPr>
           <w:rFonts w:ascii="Times New Roman" w:eastAsia="宋体" w:hAnsi="Times New Roman" w:cs="Times New Roman" w:hint="eastAsia"/>
         </w:rPr>
+        <w:t>查找引用窗口增加</w:t>
+      </w:r>
+      <w:r>
+        <w:rPr>
+          <w:rFonts w:ascii="Times New Roman" w:eastAsia="宋体" w:hAnsi="Times New Roman" w:cs="Times New Roman" w:hint="eastAsia"/>
+        </w:rPr>
+        <w:t>跟随活动窗口</w:t>
+      </w:r>
+      <w:r>
+        <w:rPr>
+          <w:rFonts w:ascii="Times New Roman" w:eastAsia="宋体" w:hAnsi="Times New Roman" w:cs="Times New Roman" w:hint="eastAsia"/>
+        </w:rPr>
+        <w:t>选项，勾选后可以实时根据活动窗口切换内容</w:t>
+      </w:r>
+    </w:p>
+    <w:p>
+      <w:pPr>
+        <w:pStyle w:val="a9"/>
+        <w:numPr>
+          <w:ilvl w:val="0"/>
+          <w:numId w:val="50"/>
+        </w:numPr>
+        <w:rPr>
+          <w:rFonts w:ascii="Times New Roman" w:eastAsia="宋体" w:hAnsi="Times New Roman" w:cs="Times New Roman"/>
+        </w:rPr>
+      </w:pPr>
+      <w:r>
+        <w:rPr>
+          <w:rFonts w:ascii="Times New Roman" w:eastAsia="宋体" w:hAnsi="Times New Roman" w:cs="Times New Roman" w:hint="eastAsia"/>
+        </w:rPr>
+        <w:t>修复修改作战小队名称后，</w:t>
+      </w:r>
+      <w:r>
+        <w:rPr>
+          <w:rFonts w:ascii="Times New Roman" w:eastAsia="宋体" w:hAnsi="Times New Roman" w:cs="Times New Roman" w:hint="eastAsia"/>
+        </w:rPr>
+        <w:t>ai</w:t>
+      </w:r>
+      <w:r>
+        <w:rPr>
+          <w:rFonts w:ascii="Times New Roman" w:eastAsia="宋体" w:hAnsi="Times New Roman" w:cs="Times New Roman" w:hint="eastAsia"/>
+        </w:rPr>
+        <w:t>触发编辑器的小队</w:t>
+      </w:r>
+      <w:r>
+        <w:rPr>
+          <w:rFonts w:ascii="Times New Roman" w:eastAsia="宋体" w:hAnsi="Times New Roman" w:cs="Times New Roman" w:hint="eastAsia"/>
+        </w:rPr>
+        <w:t>#2</w:t>
+      </w:r>
+      <w:r>
+        <w:rPr>
+          <w:rFonts w:ascii="Times New Roman" w:eastAsia="宋体" w:hAnsi="Times New Roman" w:cs="Times New Roman" w:hint="eastAsia"/>
+        </w:rPr>
+        <w:t>显示错误的</w:t>
+      </w:r>
+      <w:r>
+        <w:rPr>
+          <w:rFonts w:ascii="Times New Roman" w:eastAsia="宋体" w:hAnsi="Times New Roman" w:cs="Times New Roman" w:hint="eastAsia"/>
+        </w:rPr>
+        <w:t>bug</w:t>
+      </w:r>
+    </w:p>
+    <w:p>
+      <w:pPr>
+        <w:pStyle w:val="a9"/>
+        <w:numPr>
+          <w:ilvl w:val="0"/>
+          <w:numId w:val="50"/>
+        </w:numPr>
+        <w:rPr>
+          <w:rFonts w:ascii="Times New Roman" w:eastAsia="宋体" w:hAnsi="Times New Roman" w:cs="Times New Roman"/>
+        </w:rPr>
+      </w:pPr>
+      <w:r>
+        <w:rPr>
+          <w:rFonts w:ascii="Times New Roman" w:eastAsia="宋体" w:hAnsi="Times New Roman" w:cs="Times New Roman" w:hint="eastAsia"/>
+        </w:rPr>
+        <w:t>触发、小队等编辑器支持为</w:t>
+      </w:r>
+      <w:r>
+        <w:rPr>
+          <w:rFonts w:ascii="Times New Roman" w:eastAsia="宋体" w:hAnsi="Times New Roman" w:cs="Times New Roman" w:hint="eastAsia"/>
+        </w:rPr>
+        <w:t>ID</w:t>
+      </w:r>
+      <w:r>
+        <w:rPr>
+          <w:rFonts w:ascii="Times New Roman" w:eastAsia="宋体" w:hAnsi="Times New Roman" w:cs="Times New Roman" w:hint="eastAsia"/>
+        </w:rPr>
+        <w:t>染色，双击拖拽小点即可设置颜色</w:t>
+      </w:r>
+    </w:p>
+    <w:p>
+      <w:pPr>
+        <w:pStyle w:val="a9"/>
+        <w:numPr>
+          <w:ilvl w:val="0"/>
+          <w:numId w:val="50"/>
+        </w:numPr>
+        <w:rPr>
+          <w:rFonts w:ascii="Times New Roman" w:eastAsia="宋体" w:hAnsi="Times New Roman" w:cs="Times New Roman"/>
+        </w:rPr>
+      </w:pPr>
+      <w:r>
+        <w:rPr>
+          <w:rFonts w:ascii="Times New Roman" w:eastAsia="宋体" w:hAnsi="Times New Roman" w:cs="Times New Roman" w:hint="eastAsia"/>
+        </w:rPr>
+        <w:t>单元标记支持笔刷大小放置</w:t>
+      </w:r>
+    </w:p>
+    <w:p>
+      <w:pPr>
+        <w:pStyle w:val="a9"/>
+        <w:numPr>
+          <w:ilvl w:val="0"/>
+          <w:numId w:val="50"/>
+        </w:numPr>
+        <w:rPr>
+          <w:rFonts w:ascii="Times New Roman" w:eastAsia="宋体" w:hAnsi="Times New Roman" w:cs="Times New Roman"/>
+        </w:rPr>
+      </w:pPr>
+      <w:r>
+        <w:rPr>
+          <w:rFonts w:ascii="Times New Roman" w:eastAsia="宋体" w:hAnsi="Times New Roman" w:cs="Times New Roman" w:hint="eastAsia"/>
+        </w:rPr>
+        <w:t>增加新的</w:t>
+      </w:r>
+      <w:r>
+        <w:rPr>
+          <w:rFonts w:ascii="Times New Roman" w:eastAsia="宋体" w:hAnsi="Times New Roman" w:cs="Times New Roman" w:hint="eastAsia"/>
+        </w:rPr>
+        <w:t>lua</w:t>
+      </w:r>
+      <w:r>
+        <w:rPr>
+          <w:rFonts w:ascii="Times New Roman" w:eastAsia="宋体" w:hAnsi="Times New Roman" w:cs="Times New Roman" w:hint="eastAsia"/>
+        </w:rPr>
+        <w:t>脚本，由</w:t>
+      </w:r>
+      <w:r>
+        <w:rPr>
+          <w:rFonts w:ascii="Times New Roman" w:eastAsia="宋体" w:hAnsi="Times New Roman" w:cs="Times New Roman" w:hint="eastAsia"/>
+        </w:rPr>
+        <w:t>AUY</w:t>
+      </w:r>
+      <w:r>
+        <w:rPr>
+          <w:rFonts w:ascii="Times New Roman" w:eastAsia="宋体" w:hAnsi="Times New Roman" w:cs="Times New Roman" w:hint="eastAsia"/>
+        </w:rPr>
+        <w:t>制作</w:t>
+      </w:r>
+    </w:p>
+    <w:p>
+      <w:pPr>
+        <w:pStyle w:val="a9"/>
+        <w:numPr>
+          <w:ilvl w:val="0"/>
+          <w:numId w:val="50"/>
+        </w:numPr>
+        <w:rPr>
+          <w:rFonts w:ascii="Times New Roman" w:eastAsia="宋体" w:hAnsi="Times New Roman" w:cs="Times New Roman"/>
+        </w:rPr>
+      </w:pPr>
+      <w:r>
+        <w:rPr>
+          <w:rFonts w:ascii="Times New Roman" w:eastAsia="宋体" w:hAnsi="Times New Roman" w:cs="Times New Roman" w:hint="eastAsia"/>
+        </w:rPr>
+        <w:t>修复跨地图类型粘贴时地形转换部分失效的</w:t>
+      </w:r>
+      <w:r>
+        <w:rPr>
+          <w:rFonts w:ascii="Times New Roman" w:eastAsia="宋体" w:hAnsi="Times New Roman" w:cs="Times New Roman" w:hint="eastAsia"/>
+        </w:rPr>
+        <w:t>bug</w:t>
+      </w:r>
+    </w:p>
+    <w:p>
+      <w:pPr>
+        <w:pStyle w:val="a9"/>
+        <w:numPr>
+          <w:ilvl w:val="0"/>
+          <w:numId w:val="50"/>
+        </w:numPr>
+        <w:rPr>
+          <w:rFonts w:ascii="Times New Roman" w:eastAsia="宋体" w:hAnsi="Times New Roman" w:cs="Times New Roman"/>
+        </w:rPr>
+      </w:pPr>
+      <w:r>
+        <w:rPr>
+          <w:rFonts w:ascii="Times New Roman" w:eastAsia="宋体" w:hAnsi="Times New Roman" w:cs="Times New Roman" w:hint="eastAsia"/>
+        </w:rPr>
+        <w:t>可以记录不同鼠标操作的笔刷大小，并在切换时自动还原，详见</w:t>
+      </w:r>
+      <w:r>
+        <w:rPr>
+          <w:rFonts w:ascii="Times New Roman" w:eastAsia="宋体" w:hAnsi="Times New Roman" w:cs="Times New Roman" w:hint="eastAsia"/>
+        </w:rPr>
+        <w:t>RecordBrushSizeHistory</w:t>
+      </w:r>
+    </w:p>
+    <w:p>
+      <w:pPr>
+        <w:pStyle w:val="a9"/>
+        <w:numPr>
+          <w:ilvl w:val="0"/>
+          <w:numId w:val="50"/>
+        </w:numPr>
+        <w:rPr>
+          <w:rFonts w:ascii="Times New Roman" w:eastAsia="宋体" w:hAnsi="Times New Roman" w:cs="Times New Roman"/>
+        </w:rPr>
+      </w:pPr>
+      <w:r>
+        <w:rPr>
+          <w:rFonts w:ascii="Times New Roman" w:eastAsia="宋体" w:hAnsi="Times New Roman" w:cs="Times New Roman" w:hint="eastAsia"/>
+        </w:rPr>
+        <w:t>增加</w:t>
+      </w:r>
+      <w:r>
+        <w:rPr>
+          <w:rFonts w:ascii="Times New Roman" w:eastAsia="宋体" w:hAnsi="Times New Roman" w:cs="Times New Roman" w:hint="eastAsia"/>
+        </w:rPr>
+        <w:t>/</w:t>
+      </w:r>
+      <w:r>
+        <w:rPr>
+          <w:rFonts w:ascii="Times New Roman" w:eastAsia="宋体" w:hAnsi="Times New Roman" w:cs="Times New Roman" w:hint="eastAsia"/>
+        </w:rPr>
+        <w:t>减少矿石支持调整笔刷大小</w:t>
+      </w:r>
+    </w:p>
+    <w:p>
+      <w:pPr>
+        <w:pStyle w:val="a9"/>
+        <w:numPr>
+          <w:ilvl w:val="0"/>
+          <w:numId w:val="50"/>
+        </w:numPr>
+        <w:rPr>
+          <w:rFonts w:ascii="Times New Roman" w:eastAsia="宋体" w:hAnsi="Times New Roman" w:cs="Times New Roman"/>
+        </w:rPr>
+      </w:pPr>
+      <w:r>
+        <w:rPr>
+          <w:rFonts w:ascii="Times New Roman" w:eastAsia="宋体" w:hAnsi="Times New Roman" w:cs="Times New Roman" w:hint="eastAsia"/>
+        </w:rPr>
+        <w:t>新增</w:t>
+      </w:r>
+      <w:r>
+        <w:rPr>
+          <w:rFonts w:ascii="Times New Roman" w:eastAsia="宋体" w:hAnsi="Times New Roman" w:cs="Times New Roman" w:hint="eastAsia"/>
+        </w:rPr>
+        <w:t>LuaDialog</w:t>
+      </w:r>
+      <w:r>
+        <w:rPr>
+          <w:rFonts w:ascii="Times New Roman" w:eastAsia="宋体" w:hAnsi="Times New Roman" w:cs="Times New Roman" w:hint="eastAsia"/>
+        </w:rPr>
+        <w:t>，可以在</w:t>
+      </w:r>
+      <w:r>
+        <w:rPr>
+          <w:rFonts w:ascii="Times New Roman" w:eastAsia="宋体" w:hAnsi="Times New Roman" w:cs="Times New Roman" w:hint="eastAsia"/>
+        </w:rPr>
+        <w:t>lua</w:t>
+      </w:r>
+      <w:r>
+        <w:rPr>
+          <w:rFonts w:ascii="Times New Roman" w:eastAsia="宋体" w:hAnsi="Times New Roman" w:cs="Times New Roman" w:hint="eastAsia"/>
+        </w:rPr>
+        <w:t>脚本内动态创建自定义窗口</w:t>
+      </w:r>
+    </w:p>
+    <w:p>
+      <w:pPr>
+        <w:pStyle w:val="a9"/>
+        <w:numPr>
+          <w:ilvl w:val="0"/>
+          <w:numId w:val="50"/>
+        </w:numPr>
+        <w:rPr>
+          <w:rFonts w:ascii="Times New Roman" w:eastAsia="宋体" w:hAnsi="Times New Roman" w:cs="Times New Roman"/>
+        </w:rPr>
+      </w:pPr>
+      <w:r>
+        <w:rPr>
+          <w:rFonts w:ascii="Times New Roman" w:eastAsia="宋体" w:hAnsi="Times New Roman" w:cs="Times New Roman" w:hint="eastAsia"/>
+        </w:rPr>
+        <w:t>修复改变地图大小后建筑灯光没有刷新的</w:t>
+      </w:r>
+      <w:r>
+        <w:rPr>
+          <w:rFonts w:ascii="Times New Roman" w:eastAsia="宋体" w:hAnsi="Times New Roman" w:cs="Times New Roman" w:hint="eastAsia"/>
+        </w:rPr>
+        <w:t>bug</w:t>
+      </w:r>
+    </w:p>
+    <w:p>
+      <w:pPr>
+        <w:pStyle w:val="a9"/>
+        <w:numPr>
+          <w:ilvl w:val="0"/>
+          <w:numId w:val="50"/>
+        </w:numPr>
+        <w:rPr>
+          <w:rFonts w:ascii="Times New Roman" w:eastAsia="宋体" w:hAnsi="Times New Roman" w:cs="Times New Roman"/>
+        </w:rPr>
+      </w:pPr>
+      <w:r>
+        <w:rPr>
+          <w:rFonts w:ascii="Times New Roman" w:eastAsia="宋体" w:hAnsi="Times New Roman" w:cs="Times New Roman" w:hint="eastAsia"/>
+        </w:rPr>
+        <w:t>多选模式可以显示不同矿石类型的价格</w:t>
+      </w:r>
+    </w:p>
+    <w:p>
+      <w:pPr>
+        <w:pStyle w:val="a9"/>
+        <w:numPr>
+          <w:ilvl w:val="0"/>
+          <w:numId w:val="50"/>
+        </w:numPr>
+        <w:rPr>
+          <w:rFonts w:ascii="Times New Roman" w:eastAsia="宋体" w:hAnsi="Times New Roman" w:cs="Times New Roman"/>
+        </w:rPr>
+      </w:pPr>
+      <w:r>
+        <w:rPr>
+          <w:rFonts w:ascii="Times New Roman" w:eastAsia="宋体" w:hAnsi="Times New Roman" w:cs="Times New Roman" w:hint="eastAsia"/>
+        </w:rPr>
+        <w:t>优化了绘图界面缩小时的渲染性能</w:t>
+      </w:r>
+    </w:p>
+    <w:p>
+      <w:pPr>
+        <w:pStyle w:val="a9"/>
+        <w:numPr>
+          <w:ilvl w:val="0"/>
+          <w:numId w:val="50"/>
+        </w:numPr>
+        <w:rPr>
+          <w:rFonts w:ascii="Times New Roman" w:eastAsia="宋体" w:hAnsi="Times New Roman" w:cs="Times New Roman"/>
+        </w:rPr>
+      </w:pPr>
+      <w:r>
+        <w:rPr>
+          <w:rFonts w:ascii="Times New Roman" w:eastAsia="宋体" w:hAnsi="Times New Roman" w:cs="Times New Roman" w:hint="eastAsia"/>
+        </w:rPr>
+        <w:t>修复使用触发编辑器拖拽小点为步兵关联标签时，已关联标记没有依据步兵子单元格显示的</w:t>
+      </w:r>
+      <w:r>
+        <w:rPr>
+          <w:rFonts w:ascii="Times New Roman" w:eastAsia="宋体" w:hAnsi="Times New Roman" w:cs="Times New Roman" w:hint="eastAsia"/>
+        </w:rPr>
+        <w:t>bug</w:t>
+      </w:r>
+    </w:p>
+    <w:p>
+      <w:pPr>
+        <w:pStyle w:val="a9"/>
+        <w:numPr>
+          <w:ilvl w:val="0"/>
+          <w:numId w:val="50"/>
+        </w:numPr>
+        <w:rPr>
+          <w:rFonts w:ascii="Times New Roman" w:eastAsia="宋体" w:hAnsi="Times New Roman" w:cs="Times New Roman"/>
+        </w:rPr>
+      </w:pPr>
+      <w:r>
+        <w:rPr>
+          <w:rFonts w:ascii="Times New Roman" w:eastAsia="宋体" w:hAnsi="Times New Roman" w:cs="Times New Roman" w:hint="eastAsia"/>
+        </w:rPr>
+        <w:t>Lua</w:t>
+      </w:r>
+      <w:r>
+        <w:rPr>
+          <w:rFonts w:ascii="Times New Roman" w:eastAsia="宋体" w:hAnsi="Times New Roman" w:cs="Times New Roman" w:hint="eastAsia"/>
+        </w:rPr>
+        <w:t>脚本终端可以开启</w:t>
+      </w:r>
+      <w:r>
+        <w:rPr>
+          <w:rFonts w:ascii="Times New Roman" w:eastAsia="宋体" w:hAnsi="Times New Roman" w:cs="Times New Roman" w:hint="eastAsia"/>
+        </w:rPr>
+        <w:t>MCP</w:t>
+      </w:r>
+      <w:r>
+        <w:rPr>
+          <w:rFonts w:ascii="Times New Roman" w:eastAsia="宋体" w:hAnsi="Times New Roman" w:cs="Times New Roman" w:hint="eastAsia"/>
+        </w:rPr>
+        <w:t>服务器，接入大语言模型调用</w:t>
+      </w:r>
+      <w:r>
+        <w:rPr>
+          <w:rFonts w:ascii="Times New Roman" w:eastAsia="宋体" w:hAnsi="Times New Roman" w:cs="Times New Roman" w:hint="eastAsia"/>
+        </w:rPr>
+        <w:t>lua</w:t>
+      </w:r>
+      <w:r>
+        <w:rPr>
+          <w:rFonts w:ascii="Times New Roman" w:eastAsia="宋体" w:hAnsi="Times New Roman" w:cs="Times New Roman" w:hint="eastAsia"/>
+        </w:rPr>
+        <w:t>脚本</w:t>
+      </w:r>
+      <w:r>
+        <w:rPr>
+          <w:rFonts w:ascii="Times New Roman" w:eastAsia="宋体" w:hAnsi="Times New Roman" w:cs="Times New Roman" w:hint="eastAsia"/>
+        </w:rPr>
+        <w:t>。详见</w:t>
+      </w:r>
+      <w:r>
+        <w:rPr>
+          <w:rFonts w:ascii="Times New Roman" w:eastAsia="宋体" w:hAnsi="Times New Roman" w:cs="Times New Roman" w:hint="eastAsia"/>
+        </w:rPr>
+        <w:t>MCP.Enable</w:t>
+      </w:r>
+    </w:p>
+    <w:p>
+      <w:pPr>
+        <w:pStyle w:val="a9"/>
+        <w:numPr>
+          <w:ilvl w:val="0"/>
+          <w:numId w:val="50"/>
+        </w:numPr>
+        <w:rPr>
+          <w:rFonts w:ascii="Times New Roman" w:eastAsia="宋体" w:hAnsi="Times New Roman" w:cs="Times New Roman"/>
+        </w:rPr>
+      </w:pPr>
+      <w:r>
+        <w:rPr>
+          <w:rFonts w:ascii="Times New Roman" w:eastAsia="宋体" w:hAnsi="Times New Roman" w:cs="Times New Roman" w:hint="eastAsia"/>
+        </w:rPr>
+        <w:t>修复渲染部分</w:t>
+      </w:r>
+      <w:r>
+        <w:rPr>
+          <w:rFonts w:ascii="Times New Roman" w:eastAsia="宋体" w:hAnsi="Times New Roman" w:cs="Times New Roman" w:hint="eastAsia"/>
+        </w:rPr>
+        <w:t>vxl</w:t>
+      </w:r>
+      <w:r>
+        <w:rPr>
+          <w:rFonts w:ascii="Times New Roman" w:eastAsia="宋体" w:hAnsi="Times New Roman" w:cs="Times New Roman" w:hint="eastAsia"/>
+        </w:rPr>
+        <w:t>时崩溃的</w:t>
+      </w:r>
+      <w:r>
+        <w:rPr>
+          <w:rFonts w:ascii="Times New Roman" w:eastAsia="宋体" w:hAnsi="Times New Roman" w:cs="Times New Roman" w:hint="eastAsia"/>
+        </w:rPr>
+        <w:t>bug</w:t>
+      </w:r>
+    </w:p>
+    <w:p>
+      <w:pPr>
+        <w:pStyle w:val="a9"/>
+        <w:numPr>
+          <w:ilvl w:val="0"/>
+          <w:numId w:val="50"/>
+        </w:numPr>
+        <w:rPr>
+          <w:rFonts w:ascii="Times New Roman" w:eastAsia="宋体" w:hAnsi="Times New Roman" w:cs="Times New Roman"/>
+        </w:rPr>
+      </w:pPr>
+      <w:r>
+        <w:rPr>
+          <w:rFonts w:ascii="Times New Roman" w:eastAsia="宋体" w:hAnsi="Times New Roman" w:cs="Times New Roman" w:hint="eastAsia"/>
+        </w:rPr>
+        <w:t>基本设置窗口增加背景音乐和载入界面背景音乐选项</w:t>
+      </w:r>
+    </w:p>
+    <w:p>
+      <w:pPr>
+        <w:pStyle w:val="a9"/>
+        <w:numPr>
+          <w:ilvl w:val="0"/>
+          <w:numId w:val="50"/>
+        </w:numPr>
+        <w:rPr>
+          <w:rFonts w:ascii="Times New Roman" w:eastAsia="宋体" w:hAnsi="Times New Roman" w:cs="Times New Roman"/>
+        </w:rPr>
+      </w:pPr>
+      <w:r>
+        <w:rPr>
+          <w:rFonts w:ascii="Times New Roman" w:eastAsia="宋体" w:hAnsi="Times New Roman" w:cs="Times New Roman" w:hint="eastAsia"/>
+        </w:rPr>
+        <w:t>单人任务设置</w:t>
+      </w:r>
+      <w:r>
+        <w:rPr>
+          <w:rFonts w:ascii="Times New Roman" w:eastAsia="宋体" w:hAnsi="Times New Roman" w:cs="Times New Roman" w:hint="eastAsia"/>
+        </w:rPr>
+        <w:t>-</w:t>
+      </w:r>
+      <w:r>
+        <w:rPr>
+          <w:rFonts w:ascii="Times New Roman" w:eastAsia="宋体" w:hAnsi="Times New Roman" w:cs="Times New Roman" w:hint="eastAsia"/>
+        </w:rPr>
+        <w:t>幻影伪装树木可以使用绘制随机树木窗口进行选择</w:t>
+      </w:r>
+    </w:p>
+    <w:p>
+      <w:pPr>
+        <w:pStyle w:val="a9"/>
+        <w:numPr>
+          <w:ilvl w:val="0"/>
+          <w:numId w:val="50"/>
+        </w:numPr>
+        <w:rPr>
+          <w:rFonts w:ascii="Times New Roman" w:eastAsia="宋体" w:hAnsi="Times New Roman" w:cs="Times New Roman"/>
+        </w:rPr>
+      </w:pPr>
+      <w:r>
+        <w:rPr>
+          <w:rFonts w:ascii="Times New Roman" w:eastAsia="宋体" w:hAnsi="Times New Roman" w:cs="Times New Roman" w:hint="eastAsia"/>
+        </w:rPr>
+        <w:t>放置高架桥头时，可以显示辅助参考线</w:t>
+      </w:r>
+    </w:p>
+    <w:p>
+      <w:pPr>
+        <w:pStyle w:val="a9"/>
+        <w:numPr>
+          <w:ilvl w:val="0"/>
+          <w:numId w:val="50"/>
+        </w:numPr>
+        <w:rPr>
+          <w:rFonts w:ascii="Times New Roman" w:eastAsia="宋体" w:hAnsi="Times New Roman" w:cs="Times New Roman"/>
+        </w:rPr>
+      </w:pPr>
+      <w:r>
+        <w:rPr>
+          <w:rFonts w:ascii="Times New Roman" w:eastAsia="宋体" w:hAnsi="Times New Roman" w:cs="Times New Roman" w:hint="eastAsia"/>
+        </w:rPr>
+        <w:t>为触发编辑器检查下级触发是否是自身添加开关，详见</w:t>
+      </w:r>
+      <w:r>
+        <w:rPr>
+          <w:rFonts w:ascii="Times New Roman" w:eastAsia="宋体" w:hAnsi="Times New Roman" w:cs="Times New Roman" w:hint="eastAsia"/>
+        </w:rPr>
+        <w:t>AttachedTriggerIsSelfCheck</w:t>
+      </w:r>
+    </w:p>
+    <w:p>
+      <w:pPr>
+        <w:pStyle w:val="a9"/>
+        <w:numPr>
+          <w:ilvl w:val="0"/>
+          <w:numId w:val="50"/>
+        </w:numPr>
+        <w:rPr>
+          <w:rFonts w:ascii="Times New Roman" w:eastAsia="宋体" w:hAnsi="Times New Roman" w:cs="Times New Roman"/>
+        </w:rPr>
+      </w:pPr>
+      <w:r>
+        <w:rPr>
+          <w:rFonts w:ascii="Times New Roman" w:eastAsia="宋体" w:hAnsi="Times New Roman" w:cs="Times New Roman" w:hint="eastAsia"/>
+        </w:rPr>
+        <w:t>修复遭遇战地图预览渲染时没有正确标记高架桥的</w:t>
+      </w:r>
+      <w:r>
+        <w:rPr>
+          <w:rFonts w:ascii="Times New Roman" w:eastAsia="宋体" w:hAnsi="Times New Roman" w:cs="Times New Roman" w:hint="eastAsia"/>
+        </w:rPr>
+        <w:t>bug</w:t>
+      </w:r>
+    </w:p>
+    <w:p>
+      <w:pPr>
+        <w:pStyle w:val="a9"/>
+        <w:numPr>
+          <w:ilvl w:val="0"/>
+          <w:numId w:val="50"/>
+        </w:numPr>
+        <w:rPr>
+          <w:rFonts w:ascii="Times New Roman" w:eastAsia="宋体" w:hAnsi="Times New Roman" w:cs="Times New Roman"/>
+        </w:rPr>
+      </w:pPr>
+      <w:r>
+        <w:rPr>
+          <w:rFonts w:ascii="Times New Roman" w:eastAsia="宋体" w:hAnsi="Times New Roman" w:cs="Times New Roman" w:hint="eastAsia"/>
+        </w:rPr>
+        <w:t>为</w:t>
+      </w:r>
+      <w:r>
+        <w:rPr>
+          <w:rFonts w:ascii="Times New Roman" w:eastAsia="宋体" w:hAnsi="Times New Roman" w:cs="Times New Roman" w:hint="eastAsia"/>
+        </w:rPr>
+        <w:t>Lua</w:t>
+      </w:r>
+      <w:r>
+        <w:rPr>
+          <w:rFonts w:ascii="Times New Roman" w:eastAsia="宋体" w:hAnsi="Times New Roman" w:cs="Times New Roman" w:hint="eastAsia"/>
+        </w:rPr>
+        <w:t>脚本终端添加安全检查，会在执行前静态检查高危操作，详见</w:t>
+      </w:r>
+      <w:r>
+        <w:rPr>
+          <w:rFonts w:ascii="Times New Roman" w:eastAsia="宋体" w:hAnsi="Times New Roman" w:cs="Times New Roman" w:hint="eastAsia"/>
+        </w:rPr>
+        <w:t>DisableLuaConsoleSafetyCheck</w:t>
+      </w:r>
+    </w:p>
+    <w:p>
+      <w:pPr>
+        <w:pStyle w:val="a9"/>
+        <w:numPr>
+          <w:ilvl w:val="0"/>
+          <w:numId w:val="50"/>
+        </w:numPr>
+        <w:rPr>
+          <w:rFonts w:ascii="Times New Roman" w:eastAsia="宋体" w:hAnsi="Times New Roman" w:cs="Times New Roman"/>
+        </w:rPr>
+      </w:pPr>
+      <w:r>
+        <w:rPr>
+          <w:rFonts w:ascii="Times New Roman" w:eastAsia="宋体" w:hAnsi="Times New Roman" w:cs="Times New Roman" w:hint="eastAsia"/>
+        </w:rPr>
+        <w:t>可以在地图视图内按方向键调节视角，同时按住</w:t>
+      </w:r>
+      <w:r>
+        <w:rPr>
+          <w:rFonts w:ascii="Times New Roman" w:eastAsia="宋体" w:hAnsi="Times New Roman" w:cs="Times New Roman" w:hint="eastAsia"/>
+        </w:rPr>
+        <w:t>ctrl</w:t>
+      </w:r>
+      <w:r>
+        <w:rPr>
+          <w:rFonts w:ascii="Times New Roman" w:eastAsia="宋体" w:hAnsi="Times New Roman" w:cs="Times New Roman" w:hint="eastAsia"/>
+        </w:rPr>
+        <w:t>键加速移动</w:t>
+      </w:r>
+    </w:p>
+    <w:p>
+      <w:pPr>
+        <w:pStyle w:val="a9"/>
+        <w:numPr>
+          <w:ilvl w:val="0"/>
+          <w:numId w:val="50"/>
+        </w:numPr>
+        <w:rPr>
+          <w:rFonts w:ascii="Times New Roman" w:eastAsia="宋体" w:hAnsi="Times New Roman" w:cs="Times New Roman"/>
+        </w:rPr>
+      </w:pPr>
+      <w:r>
+        <w:rPr>
+          <w:rFonts w:ascii="Times New Roman" w:eastAsia="宋体" w:hAnsi="Times New Roman" w:cs="Times New Roman" w:hint="eastAsia"/>
+        </w:rPr>
+        <w:t>修复部分遭遇战地图所属方选项重复的</w:t>
+      </w:r>
+      <w:r>
+        <w:rPr>
+          <w:rFonts w:ascii="Times New Roman" w:eastAsia="宋体" w:hAnsi="Times New Roman" w:cs="Times New Roman" w:hint="eastAsia"/>
+        </w:rPr>
+        <w:t>bug</w:t>
+      </w:r>
+    </w:p>
+    <w:p>
+      <w:pPr>
+        <w:pStyle w:val="a9"/>
+        <w:numPr>
+          <w:ilvl w:val="0"/>
+          <w:numId w:val="50"/>
+        </w:numPr>
+        <w:rPr>
+          <w:rFonts w:ascii="Times New Roman" w:eastAsia="宋体" w:hAnsi="Times New Roman" w:cs="Times New Roman"/>
+        </w:rPr>
+      </w:pPr>
+      <w:r>
+        <w:rPr>
+          <w:rFonts w:ascii="Times New Roman" w:eastAsia="宋体" w:hAnsi="Times New Roman" w:cs="Times New Roman" w:hint="eastAsia"/>
+        </w:rPr>
+        <w:t>重写单位属性对话框，标签支持搜索，所属方可以显示颜色</w:t>
+      </w:r>
+    </w:p>
+    <w:p>
+      <w:pPr>
+        <w:pStyle w:val="a9"/>
+        <w:numPr>
+          <w:ilvl w:val="0"/>
+          <w:numId w:val="50"/>
+        </w:numPr>
+        <w:rPr>
+          <w:rFonts w:ascii="Times New Roman" w:eastAsia="宋体" w:hAnsi="Times New Roman" w:cs="Times New Roman"/>
+        </w:rPr>
+      </w:pPr>
+      <w:r>
+        <w:rPr>
+          <w:rFonts w:ascii="Times New Roman" w:eastAsia="宋体" w:hAnsi="Times New Roman" w:cs="Times New Roman" w:hint="eastAsia"/>
+        </w:rPr>
+        <w:t>支持将</w:t>
+      </w:r>
+      <w:r>
+        <w:rPr>
+          <w:rFonts w:ascii="Times New Roman" w:eastAsia="宋体" w:hAnsi="Times New Roman" w:cs="Times New Roman" w:hint="eastAsia"/>
+        </w:rPr>
+        <w:t>物品浏览器和</w:t>
+      </w:r>
+      <w:r>
+        <w:rPr>
+          <w:rFonts w:ascii="Times New Roman" w:eastAsia="宋体" w:hAnsi="Times New Roman" w:cs="Times New Roman" w:hint="eastAsia"/>
+        </w:rPr>
+        <w:t>地形浏览器作为一个独立窗口显示</w:t>
+      </w:r>
+      <w:r>
+        <w:rPr>
+          <w:rFonts w:ascii="Times New Roman" w:eastAsia="宋体" w:hAnsi="Times New Roman" w:cs="Times New Roman" w:hint="eastAsia"/>
+        </w:rPr>
+        <w:t>，可以调节透明度</w:t>
+      </w:r>
+      <w:r>
+        <w:rPr>
+          <w:rFonts w:ascii="Times New Roman" w:eastAsia="宋体" w:hAnsi="Times New Roman" w:cs="Times New Roman" w:hint="eastAsia"/>
+        </w:rPr>
+        <w:t>，详见</w:t>
+      </w:r>
+      <w:r>
+        <w:rPr>
+          <w:rFonts w:ascii="Times New Roman" w:eastAsia="宋体" w:hAnsi="Times New Roman" w:cs="Times New Roman" w:hint="eastAsia"/>
+        </w:rPr>
+        <w:t>ViewObjectsFloating</w:t>
+      </w:r>
+      <w:r>
+        <w:rPr>
+          <w:rFonts w:ascii="Times New Roman" w:eastAsia="宋体" w:hAnsi="Times New Roman" w:cs="Times New Roman" w:hint="eastAsia"/>
+        </w:rPr>
+        <w:t>和</w:t>
+      </w:r>
+      <w:r>
+        <w:rPr>
+          <w:rFonts w:ascii="Times New Roman" w:eastAsia="宋体" w:hAnsi="Times New Roman" w:cs="Times New Roman" w:hint="eastAsia"/>
+        </w:rPr>
+        <w:t>TileSetBrowserFloating</w:t>
+      </w:r>
+    </w:p>
+    <w:p>
+      <w:pPr>
+        <w:pStyle w:val="a9"/>
+        <w:numPr>
+          <w:ilvl w:val="0"/>
+          <w:numId w:val="50"/>
+        </w:numPr>
+        <w:rPr>
+          <w:rFonts w:ascii="Times New Roman" w:eastAsia="宋体" w:hAnsi="Times New Roman" w:cs="Times New Roman"/>
+        </w:rPr>
+      </w:pPr>
+      <w:r>
+        <w:rPr>
+          <w:rFonts w:ascii="Times New Roman" w:eastAsia="宋体" w:hAnsi="Times New Roman" w:cs="Times New Roman" w:hint="eastAsia"/>
+        </w:rPr>
+        <w:t>绝大多数窗口可以调节透明度</w:t>
+      </w:r>
+    </w:p>
+    <w:p>
+      <w:pPr>
+        <w:pStyle w:val="a9"/>
+        <w:numPr>
+          <w:ilvl w:val="0"/>
+          <w:numId w:val="50"/>
+        </w:numPr>
+        <w:rPr>
+          <w:rFonts w:ascii="Times New Roman" w:eastAsia="宋体" w:hAnsi="Times New Roman" w:cs="Times New Roman"/>
+        </w:rPr>
+      </w:pPr>
+      <w:r>
+        <w:rPr>
+          <w:rFonts w:ascii="Times New Roman" w:eastAsia="宋体" w:hAnsi="Times New Roman" w:cs="Times New Roman" w:hint="eastAsia"/>
+        </w:rPr>
+        <w:t>修复部分情况下按工具栏擦除覆盖物等按钮不生效的</w:t>
+      </w:r>
+      <w:r>
+        <w:rPr>
+          <w:rFonts w:ascii="Times New Roman" w:eastAsia="宋体" w:hAnsi="Times New Roman" w:cs="Times New Roman" w:hint="eastAsia"/>
+        </w:rPr>
+        <w:t>bug</w:t>
+      </w:r>
+    </w:p>
+    <w:p>
+      <w:pPr>
+        <w:pStyle w:val="a9"/>
+        <w:numPr>
+          <w:ilvl w:val="0"/>
+          <w:numId w:val="50"/>
+        </w:numPr>
+        <w:rPr>
+          <w:rFonts w:ascii="Times New Roman" w:eastAsia="宋体" w:hAnsi="Times New Roman" w:cs="Times New Roman"/>
+        </w:rPr>
+      </w:pPr>
+      <w:r>
+        <w:rPr>
+          <w:rFonts w:ascii="Times New Roman" w:eastAsia="宋体" w:hAnsi="Times New Roman" w:cs="Times New Roman" w:hint="eastAsia"/>
+        </w:rPr>
+        <w:t>修复暗色模式下非主程序菜单的背景色被错误填充的</w:t>
+      </w:r>
+      <w:r>
+        <w:rPr>
+          <w:rFonts w:ascii="Times New Roman" w:eastAsia="宋体" w:hAnsi="Times New Roman" w:cs="Times New Roman" w:hint="eastAsia"/>
+        </w:rPr>
+        <w:t>bug</w:t>
+      </w:r>
+    </w:p>
+    <w:p>
+      <w:pPr>
+        <w:pStyle w:val="a9"/>
+        <w:numPr>
+          <w:ilvl w:val="0"/>
+          <w:numId w:val="50"/>
+        </w:numPr>
+        <w:rPr>
+          <w:rFonts w:ascii="Times New Roman" w:eastAsia="宋体" w:hAnsi="Times New Roman" w:cs="Times New Roman"/>
+        </w:rPr>
+      </w:pPr>
+      <w:r>
+        <w:rPr>
+          <w:rFonts w:ascii="Times New Roman" w:eastAsia="宋体" w:hAnsi="Times New Roman" w:cs="Times New Roman" w:hint="eastAsia"/>
+        </w:rPr>
+        <w:t>为触发编辑器、</w:t>
+      </w:r>
+      <w:r>
+        <w:rPr>
+          <w:rFonts w:ascii="Times New Roman" w:eastAsia="宋体" w:hAnsi="Times New Roman" w:cs="Times New Roman" w:hint="eastAsia"/>
+        </w:rPr>
+        <w:t>AI</w:t>
+      </w:r>
+      <w:r>
+        <w:rPr>
+          <w:rFonts w:ascii="Times New Roman" w:eastAsia="宋体" w:hAnsi="Times New Roman" w:cs="Times New Roman" w:hint="eastAsia"/>
+        </w:rPr>
+        <w:t>触发编辑器增加跳转按钮，可以跳转到参数对应的路径点、小队等位置</w:t>
+      </w:r>
+    </w:p>
+    <w:p>
+      <w:pPr>
+        <w:pStyle w:val="a9"/>
+        <w:numPr>
+          <w:ilvl w:val="0"/>
+          <w:numId w:val="50"/>
+        </w:numPr>
+        <w:rPr>
+          <w:rFonts w:ascii="Times New Roman" w:eastAsia="宋体" w:hAnsi="Times New Roman" w:cs="Times New Roman"/>
+        </w:rPr>
+      </w:pPr>
+      <w:r>
+        <w:rPr>
+          <w:rFonts w:ascii="Times New Roman" w:eastAsia="宋体" w:hAnsi="Times New Roman" w:cs="Times New Roman" w:hint="eastAsia"/>
+        </w:rPr>
+        <w:t>受损火焰能正确被其他单位遮挡</w:t>
+      </w:r>
+      <w:r>
+        <w:rPr>
+          <w:rFonts w:ascii="Times New Roman" w:eastAsia="宋体" w:hAnsi="Times New Roman" w:cs="Times New Roman" w:hint="eastAsia"/>
+        </w:rPr>
+        <w:t>，可以读取</w:t>
+      </w:r>
+      <w:r>
+        <w:rPr>
+          <w:rFonts w:ascii="Times New Roman" w:eastAsia="宋体" w:hAnsi="Times New Roman" w:cs="Times New Roman" w:hint="eastAsia"/>
+        </w:rPr>
+        <w:t>Next=</w:t>
+      </w:r>
+      <w:r>
+        <w:rPr>
+          <w:rFonts w:ascii="Times New Roman" w:eastAsia="宋体" w:hAnsi="Times New Roman" w:cs="Times New Roman" w:hint="eastAsia"/>
+        </w:rPr>
+        <w:t>最终的</w:t>
+      </w:r>
+      <w:r>
+        <w:rPr>
+          <w:rFonts w:ascii="Times New Roman" w:eastAsia="宋体" w:hAnsi="Times New Roman" w:cs="Times New Roman" w:hint="eastAsia"/>
+        </w:rPr>
+        <w:t>图像</w:t>
+      </w:r>
+    </w:p>
+    <w:p>
+      <w:pPr>
+        <w:pStyle w:val="a9"/>
+        <w:numPr>
+          <w:ilvl w:val="0"/>
+          <w:numId w:val="50"/>
+        </w:numPr>
+        <w:rPr>
+          <w:rFonts w:ascii="Times New Roman" w:eastAsia="宋体" w:hAnsi="Times New Roman" w:cs="Times New Roman"/>
+        </w:rPr>
+      </w:pPr>
+      <w:r>
+        <w:rPr>
+          <w:rFonts w:ascii="Times New Roman" w:eastAsia="宋体" w:hAnsi="Times New Roman" w:cs="Times New Roman" w:hint="eastAsia"/>
+        </w:rPr>
         <w:lastRenderedPageBreak/>
-        <w:t>查找引用窗口增加</w:t>
-      </w:r>
-      <w:r>
-        <w:rPr>
-          <w:rFonts w:ascii="Times New Roman" w:eastAsia="宋体" w:hAnsi="Times New Roman" w:cs="Times New Roman" w:hint="eastAsia"/>
-        </w:rPr>
-        <w:t>跟随活动窗口</w:t>
-      </w:r>
-      <w:r>
-        <w:rPr>
-          <w:rFonts w:ascii="Times New Roman" w:eastAsia="宋体" w:hAnsi="Times New Roman" w:cs="Times New Roman" w:hint="eastAsia"/>
-        </w:rPr>
-        <w:t>选项，勾选后可以实时根据活动窗口切换内容</w:t>
-      </w:r>
-    </w:p>
-    <w:p>
-      <w:pPr>
-        <w:pStyle w:val="a9"/>
-        <w:numPr>
-          <w:ilvl w:val="0"/>
-          <w:numId w:val="50"/>
-        </w:numPr>
-        <w:rPr>
-          <w:rFonts w:ascii="Times New Roman" w:eastAsia="宋体" w:hAnsi="Times New Roman" w:cs="Times New Roman"/>
-        </w:rPr>
-      </w:pPr>
-      <w:r>
-        <w:rPr>
-          <w:rFonts w:ascii="Times New Roman" w:eastAsia="宋体" w:hAnsi="Times New Roman" w:cs="Times New Roman" w:hint="eastAsia"/>
-        </w:rPr>
-        <w:t>修复修改作战小队名称后，</w:t>
-      </w:r>
-      <w:r>
-        <w:rPr>
-          <w:rFonts w:ascii="Times New Roman" w:eastAsia="宋体" w:hAnsi="Times New Roman" w:cs="Times New Roman" w:hint="eastAsia"/>
-        </w:rPr>
-        <w:t>ai</w:t>
-      </w:r>
-      <w:r>
-        <w:rPr>
-          <w:rFonts w:ascii="Times New Roman" w:eastAsia="宋体" w:hAnsi="Times New Roman" w:cs="Times New Roman" w:hint="eastAsia"/>
-        </w:rPr>
-        <w:t>触发编辑器的小队</w:t>
-      </w:r>
-      <w:r>
-        <w:rPr>
-          <w:rFonts w:ascii="Times New Roman" w:eastAsia="宋体" w:hAnsi="Times New Roman" w:cs="Times New Roman" w:hint="eastAsia"/>
-        </w:rPr>
-        <w:t>#2</w:t>
-      </w:r>
-      <w:r>
-        <w:rPr>
-          <w:rFonts w:ascii="Times New Roman" w:eastAsia="宋体" w:hAnsi="Times New Roman" w:cs="Times New Roman" w:hint="eastAsia"/>
-        </w:rPr>
-        <w:t>显示错误的</w:t>
-      </w:r>
-      <w:r>
-        <w:rPr>
-          <w:rFonts w:ascii="Times New Roman" w:eastAsia="宋体" w:hAnsi="Times New Roman" w:cs="Times New Roman" w:hint="eastAsia"/>
-        </w:rPr>
-        <w:t>bug</w:t>
-      </w:r>
-    </w:p>
-    <w:p>
-      <w:pPr>
-        <w:pStyle w:val="a9"/>
-        <w:numPr>
-          <w:ilvl w:val="0"/>
-          <w:numId w:val="50"/>
-        </w:numPr>
-        <w:rPr>
-          <w:rFonts w:ascii="Times New Roman" w:eastAsia="宋体" w:hAnsi="Times New Roman" w:cs="Times New Roman"/>
-        </w:rPr>
-      </w:pPr>
-      <w:r>
-        <w:rPr>
-          <w:rFonts w:ascii="Times New Roman" w:eastAsia="宋体" w:hAnsi="Times New Roman" w:cs="Times New Roman" w:hint="eastAsia"/>
-        </w:rPr>
-        <w:t>触发、小队等编辑器支持为</w:t>
-      </w:r>
-      <w:r>
-        <w:rPr>
-          <w:rFonts w:ascii="Times New Roman" w:eastAsia="宋体" w:hAnsi="Times New Roman" w:cs="Times New Roman" w:hint="eastAsia"/>
-        </w:rPr>
-        <w:t>ID</w:t>
-      </w:r>
-      <w:r>
-        <w:rPr>
-          <w:rFonts w:ascii="Times New Roman" w:eastAsia="宋体" w:hAnsi="Times New Roman" w:cs="Times New Roman" w:hint="eastAsia"/>
-        </w:rPr>
-        <w:t>染色，双击拖拽小点即可设置颜色</w:t>
-      </w:r>
-    </w:p>
-    <w:p>
-      <w:pPr>
-        <w:pStyle w:val="a9"/>
-        <w:numPr>
-          <w:ilvl w:val="0"/>
-          <w:numId w:val="50"/>
-        </w:numPr>
-        <w:rPr>
-          <w:rFonts w:ascii="Times New Roman" w:eastAsia="宋体" w:hAnsi="Times New Roman" w:cs="Times New Roman"/>
-        </w:rPr>
-      </w:pPr>
-      <w:r>
-        <w:rPr>
-          <w:rFonts w:ascii="Times New Roman" w:eastAsia="宋体" w:hAnsi="Times New Roman" w:cs="Times New Roman" w:hint="eastAsia"/>
-        </w:rPr>
-        <w:t>单元标记支持笔刷大小放置</w:t>
-      </w:r>
-    </w:p>
-    <w:p>
-      <w:pPr>
-        <w:pStyle w:val="a9"/>
-        <w:numPr>
-          <w:ilvl w:val="0"/>
-          <w:numId w:val="50"/>
-        </w:numPr>
-        <w:rPr>
-          <w:rFonts w:ascii="Times New Roman" w:eastAsia="宋体" w:hAnsi="Times New Roman" w:cs="Times New Roman"/>
-        </w:rPr>
-      </w:pPr>
-      <w:r>
-        <w:rPr>
-          <w:rFonts w:ascii="Times New Roman" w:eastAsia="宋体" w:hAnsi="Times New Roman" w:cs="Times New Roman" w:hint="eastAsia"/>
-        </w:rPr>
-        <w:t>增加新的</w:t>
-      </w:r>
-      <w:r>
-        <w:rPr>
-          <w:rFonts w:ascii="Times New Roman" w:eastAsia="宋体" w:hAnsi="Times New Roman" w:cs="Times New Roman" w:hint="eastAsia"/>
-        </w:rPr>
-        <w:t>lua</w:t>
-      </w:r>
-      <w:r>
-        <w:rPr>
-          <w:rFonts w:ascii="Times New Roman" w:eastAsia="宋体" w:hAnsi="Times New Roman" w:cs="Times New Roman" w:hint="eastAsia"/>
-        </w:rPr>
-        <w:t>脚本，由</w:t>
-      </w:r>
-      <w:r>
-        <w:rPr>
-          <w:rFonts w:ascii="Times New Roman" w:eastAsia="宋体" w:hAnsi="Times New Roman" w:cs="Times New Roman" w:hint="eastAsia"/>
-        </w:rPr>
-        <w:t>AUY</w:t>
-      </w:r>
-      <w:r>
-        <w:rPr>
-          <w:rFonts w:ascii="Times New Roman" w:eastAsia="宋体" w:hAnsi="Times New Roman" w:cs="Times New Roman" w:hint="eastAsia"/>
-        </w:rPr>
-        <w:t>制作</w:t>
-      </w:r>
-    </w:p>
-    <w:p>
-      <w:pPr>
-        <w:pStyle w:val="a9"/>
-        <w:numPr>
-          <w:ilvl w:val="0"/>
-          <w:numId w:val="50"/>
-        </w:numPr>
-        <w:rPr>
-          <w:rFonts w:ascii="Times New Roman" w:eastAsia="宋体" w:hAnsi="Times New Roman" w:cs="Times New Roman"/>
-        </w:rPr>
-      </w:pPr>
-      <w:r>
-        <w:rPr>
-          <w:rFonts w:ascii="Times New Roman" w:eastAsia="宋体" w:hAnsi="Times New Roman" w:cs="Times New Roman" w:hint="eastAsia"/>
-        </w:rPr>
-        <w:t>修复跨地图类型粘贴时地形转换部分失效的</w:t>
-      </w:r>
-      <w:r>
-        <w:rPr>
-          <w:rFonts w:ascii="Times New Roman" w:eastAsia="宋体" w:hAnsi="Times New Roman" w:cs="Times New Roman" w:hint="eastAsia"/>
-        </w:rPr>
-        <w:t>bug</w:t>
-      </w:r>
-    </w:p>
-    <w:p>
-      <w:pPr>
-        <w:pStyle w:val="a9"/>
-        <w:numPr>
-          <w:ilvl w:val="0"/>
-          <w:numId w:val="50"/>
-        </w:numPr>
-        <w:rPr>
-          <w:rFonts w:ascii="Times New Roman" w:eastAsia="宋体" w:hAnsi="Times New Roman" w:cs="Times New Roman"/>
-        </w:rPr>
-      </w:pPr>
-      <w:r>
-        <w:rPr>
-          <w:rFonts w:ascii="Times New Roman" w:eastAsia="宋体" w:hAnsi="Times New Roman" w:cs="Times New Roman" w:hint="eastAsia"/>
-        </w:rPr>
-        <w:t>可以记录不同鼠标操作的笔刷大小，并在切换时自动还原，详见</w:t>
-      </w:r>
-      <w:r>
-        <w:rPr>
-          <w:rFonts w:ascii="Times New Roman" w:eastAsia="宋体" w:hAnsi="Times New Roman" w:cs="Times New Roman" w:hint="eastAsia"/>
-        </w:rPr>
-        <w:t>RecordBrushSizeHistory</w:t>
-      </w:r>
-    </w:p>
-    <w:p>
-      <w:pPr>
-        <w:pStyle w:val="a9"/>
-        <w:numPr>
-          <w:ilvl w:val="0"/>
-          <w:numId w:val="50"/>
-        </w:numPr>
-        <w:rPr>
-          <w:rFonts w:ascii="Times New Roman" w:eastAsia="宋体" w:hAnsi="Times New Roman" w:cs="Times New Roman"/>
-        </w:rPr>
-      </w:pPr>
-      <w:r>
-        <w:rPr>
-          <w:rFonts w:ascii="Times New Roman" w:eastAsia="宋体" w:hAnsi="Times New Roman" w:cs="Times New Roman" w:hint="eastAsia"/>
-        </w:rPr>
-        <w:t>增加</w:t>
-      </w:r>
-      <w:r>
-        <w:rPr>
-          <w:rFonts w:ascii="Times New Roman" w:eastAsia="宋体" w:hAnsi="Times New Roman" w:cs="Times New Roman" w:hint="eastAsia"/>
-        </w:rPr>
-        <w:t>/</w:t>
-      </w:r>
-      <w:r>
-        <w:rPr>
-          <w:rFonts w:ascii="Times New Roman" w:eastAsia="宋体" w:hAnsi="Times New Roman" w:cs="Times New Roman" w:hint="eastAsia"/>
-        </w:rPr>
-        <w:t>减少矿石支持调整笔刷大小</w:t>
-      </w:r>
-    </w:p>
-    <w:p>
-      <w:pPr>
-        <w:pStyle w:val="a9"/>
-        <w:numPr>
-          <w:ilvl w:val="0"/>
-          <w:numId w:val="50"/>
-        </w:numPr>
-        <w:rPr>
-          <w:rFonts w:ascii="Times New Roman" w:eastAsia="宋体" w:hAnsi="Times New Roman" w:cs="Times New Roman"/>
-        </w:rPr>
-      </w:pPr>
-      <w:r>
-        <w:rPr>
-          <w:rFonts w:ascii="Times New Roman" w:eastAsia="宋体" w:hAnsi="Times New Roman" w:cs="Times New Roman" w:hint="eastAsia"/>
-        </w:rPr>
-        <w:t>新增</w:t>
-      </w:r>
-      <w:r>
-        <w:rPr>
-          <w:rFonts w:ascii="Times New Roman" w:eastAsia="宋体" w:hAnsi="Times New Roman" w:cs="Times New Roman" w:hint="eastAsia"/>
-        </w:rPr>
-        <w:t>LuaDialog</w:t>
-      </w:r>
-      <w:r>
-        <w:rPr>
-          <w:rFonts w:ascii="Times New Roman" w:eastAsia="宋体" w:hAnsi="Times New Roman" w:cs="Times New Roman" w:hint="eastAsia"/>
-        </w:rPr>
-        <w:t>，可以在</w:t>
-      </w:r>
-      <w:r>
-        <w:rPr>
-          <w:rFonts w:ascii="Times New Roman" w:eastAsia="宋体" w:hAnsi="Times New Roman" w:cs="Times New Roman" w:hint="eastAsia"/>
-        </w:rPr>
-        <w:t>lua</w:t>
-      </w:r>
-      <w:r>
-        <w:rPr>
-          <w:rFonts w:ascii="Times New Roman" w:eastAsia="宋体" w:hAnsi="Times New Roman" w:cs="Times New Roman" w:hint="eastAsia"/>
-        </w:rPr>
-        <w:t>脚本内动态创建自定义窗口</w:t>
-      </w:r>
-    </w:p>
-    <w:p>
-      <w:pPr>
-        <w:pStyle w:val="a9"/>
-        <w:numPr>
-          <w:ilvl w:val="0"/>
-          <w:numId w:val="50"/>
-        </w:numPr>
-        <w:rPr>
-          <w:rFonts w:ascii="Times New Roman" w:eastAsia="宋体" w:hAnsi="Times New Roman" w:cs="Times New Roman"/>
-        </w:rPr>
-      </w:pPr>
-      <w:r>
-        <w:rPr>
-          <w:rFonts w:ascii="Times New Roman" w:eastAsia="宋体" w:hAnsi="Times New Roman" w:cs="Times New Roman" w:hint="eastAsia"/>
-        </w:rPr>
-        <w:t>修复改变地图大小后建筑灯光没有刷新的</w:t>
-      </w:r>
-      <w:r>
-        <w:rPr>
-          <w:rFonts w:ascii="Times New Roman" w:eastAsia="宋体" w:hAnsi="Times New Roman" w:cs="Times New Roman" w:hint="eastAsia"/>
-        </w:rPr>
-        <w:t>bug</w:t>
-      </w:r>
-    </w:p>
-    <w:p>
-      <w:pPr>
-        <w:pStyle w:val="a9"/>
-        <w:numPr>
-          <w:ilvl w:val="0"/>
-          <w:numId w:val="50"/>
-        </w:numPr>
-        <w:rPr>
-          <w:rFonts w:ascii="Times New Roman" w:eastAsia="宋体" w:hAnsi="Times New Roman" w:cs="Times New Roman"/>
-        </w:rPr>
-      </w:pPr>
-      <w:r>
-        <w:rPr>
-          <w:rFonts w:ascii="Times New Roman" w:eastAsia="宋体" w:hAnsi="Times New Roman" w:cs="Times New Roman" w:hint="eastAsia"/>
-        </w:rPr>
-        <w:t>多选模式可以显示不同矿石类型的价格</w:t>
-      </w:r>
-    </w:p>
-    <w:p>
-      <w:pPr>
-        <w:pStyle w:val="a9"/>
-        <w:numPr>
-          <w:ilvl w:val="0"/>
-          <w:numId w:val="50"/>
-        </w:numPr>
-        <w:rPr>
-          <w:rFonts w:ascii="Times New Roman" w:eastAsia="宋体" w:hAnsi="Times New Roman" w:cs="Times New Roman"/>
-        </w:rPr>
-      </w:pPr>
-      <w:r>
-        <w:rPr>
-          <w:rFonts w:ascii="Times New Roman" w:eastAsia="宋体" w:hAnsi="Times New Roman" w:cs="Times New Roman" w:hint="eastAsia"/>
-        </w:rPr>
-        <w:t>优化了绘图界面缩小时的渲染性能</w:t>
-      </w:r>
-    </w:p>
-    <w:p>
-      <w:pPr>
-        <w:pStyle w:val="a9"/>
-        <w:numPr>
-          <w:ilvl w:val="0"/>
-          <w:numId w:val="50"/>
-        </w:numPr>
-        <w:rPr>
-          <w:rFonts w:ascii="Times New Roman" w:eastAsia="宋体" w:hAnsi="Times New Roman" w:cs="Times New Roman"/>
-        </w:rPr>
-      </w:pPr>
-      <w:r>
-        <w:rPr>
-          <w:rFonts w:ascii="Times New Roman" w:eastAsia="宋体" w:hAnsi="Times New Roman" w:cs="Times New Roman" w:hint="eastAsia"/>
-        </w:rPr>
-        <w:t>修复使用触发编辑器拖拽小点为步兵关联标签时，已关联标记没有依据步兵子单元格显示的</w:t>
-      </w:r>
-      <w:r>
-        <w:rPr>
-          <w:rFonts w:ascii="Times New Roman" w:eastAsia="宋体" w:hAnsi="Times New Roman" w:cs="Times New Roman" w:hint="eastAsia"/>
-        </w:rPr>
-        <w:t>bug</w:t>
-      </w:r>
-    </w:p>
-    <w:p>
-      <w:pPr>
-        <w:pStyle w:val="a9"/>
-        <w:numPr>
-          <w:ilvl w:val="0"/>
-          <w:numId w:val="50"/>
-        </w:numPr>
-        <w:rPr>
-          <w:rFonts w:ascii="Times New Roman" w:eastAsia="宋体" w:hAnsi="Times New Roman" w:cs="Times New Roman"/>
-        </w:rPr>
-      </w:pPr>
-      <w:r>
-        <w:rPr>
-          <w:rFonts w:ascii="Times New Roman" w:eastAsia="宋体" w:hAnsi="Times New Roman" w:cs="Times New Roman" w:hint="eastAsia"/>
-        </w:rPr>
-        <w:t>Lua</w:t>
-      </w:r>
-      <w:r>
-        <w:rPr>
-          <w:rFonts w:ascii="Times New Roman" w:eastAsia="宋体" w:hAnsi="Times New Roman" w:cs="Times New Roman" w:hint="eastAsia"/>
-        </w:rPr>
-        <w:t>脚本终端可以开启</w:t>
-      </w:r>
-      <w:r>
-        <w:rPr>
-          <w:rFonts w:ascii="Times New Roman" w:eastAsia="宋体" w:hAnsi="Times New Roman" w:cs="Times New Roman" w:hint="eastAsia"/>
-        </w:rPr>
-        <w:t>MCP</w:t>
-      </w:r>
-      <w:r>
-        <w:rPr>
-          <w:rFonts w:ascii="Times New Roman" w:eastAsia="宋体" w:hAnsi="Times New Roman" w:cs="Times New Roman" w:hint="eastAsia"/>
-        </w:rPr>
-        <w:t>服务器，接入大语言模型调用</w:t>
-      </w:r>
-      <w:r>
-        <w:rPr>
-          <w:rFonts w:ascii="Times New Roman" w:eastAsia="宋体" w:hAnsi="Times New Roman" w:cs="Times New Roman" w:hint="eastAsia"/>
-        </w:rPr>
-        <w:t>lua</w:t>
-      </w:r>
-      <w:r>
-        <w:rPr>
-          <w:rFonts w:ascii="Times New Roman" w:eastAsia="宋体" w:hAnsi="Times New Roman" w:cs="Times New Roman" w:hint="eastAsia"/>
-        </w:rPr>
-        <w:t>脚本</w:t>
-      </w:r>
-      <w:r>
-        <w:rPr>
-          <w:rFonts w:ascii="Times New Roman" w:eastAsia="宋体" w:hAnsi="Times New Roman" w:cs="Times New Roman" w:hint="eastAsia"/>
-        </w:rPr>
-        <w:t>。详见</w:t>
-      </w:r>
-      <w:r>
-        <w:rPr>
-          <w:rFonts w:ascii="Times New Roman" w:eastAsia="宋体" w:hAnsi="Times New Roman" w:cs="Times New Roman" w:hint="eastAsia"/>
-        </w:rPr>
-        <w:t>MCP.Enable</w:t>
-      </w:r>
-    </w:p>
-    <w:p>
-      <w:pPr>
-        <w:pStyle w:val="a9"/>
-        <w:numPr>
-          <w:ilvl w:val="0"/>
-          <w:numId w:val="50"/>
-        </w:numPr>
-        <w:rPr>
-          <w:rFonts w:ascii="Times New Roman" w:eastAsia="宋体" w:hAnsi="Times New Roman" w:cs="Times New Roman"/>
-        </w:rPr>
-      </w:pPr>
-      <w:r>
-        <w:rPr>
-          <w:rFonts w:ascii="Times New Roman" w:eastAsia="宋体" w:hAnsi="Times New Roman" w:cs="Times New Roman" w:hint="eastAsia"/>
-        </w:rPr>
-        <w:t>修复渲染部分</w:t>
-      </w:r>
-      <w:r>
-        <w:rPr>
-          <w:rFonts w:ascii="Times New Roman" w:eastAsia="宋体" w:hAnsi="Times New Roman" w:cs="Times New Roman" w:hint="eastAsia"/>
-        </w:rPr>
-        <w:t>vxl</w:t>
-      </w:r>
-      <w:r>
-        <w:rPr>
-          <w:rFonts w:ascii="Times New Roman" w:eastAsia="宋体" w:hAnsi="Times New Roman" w:cs="Times New Roman" w:hint="eastAsia"/>
-        </w:rPr>
-        <w:t>时崩溃的</w:t>
-      </w:r>
-      <w:r>
-        <w:rPr>
-          <w:rFonts w:ascii="Times New Roman" w:eastAsia="宋体" w:hAnsi="Times New Roman" w:cs="Times New Roman" w:hint="eastAsia"/>
-        </w:rPr>
-        <w:t>bug</w:t>
-      </w:r>
-    </w:p>
-    <w:p>
-      <w:pPr>
-        <w:pStyle w:val="a9"/>
-        <w:numPr>
-          <w:ilvl w:val="0"/>
-          <w:numId w:val="50"/>
-        </w:numPr>
-        <w:rPr>
-          <w:rFonts w:ascii="Times New Roman" w:eastAsia="宋体" w:hAnsi="Times New Roman" w:cs="Times New Roman"/>
-        </w:rPr>
-      </w:pPr>
-      <w:r>
-        <w:rPr>
-          <w:rFonts w:ascii="Times New Roman" w:eastAsia="宋体" w:hAnsi="Times New Roman" w:cs="Times New Roman" w:hint="eastAsia"/>
-        </w:rPr>
-        <w:t>基本设置窗口增加背景音乐和载入界面背景音乐选项</w:t>
-      </w:r>
-    </w:p>
-    <w:p>
-      <w:pPr>
-        <w:pStyle w:val="a9"/>
-        <w:numPr>
-          <w:ilvl w:val="0"/>
-          <w:numId w:val="50"/>
-        </w:numPr>
-        <w:rPr>
-          <w:rFonts w:ascii="Times New Roman" w:eastAsia="宋体" w:hAnsi="Times New Roman" w:cs="Times New Roman"/>
-        </w:rPr>
-      </w:pPr>
-      <w:r>
-        <w:rPr>
-          <w:rFonts w:ascii="Times New Roman" w:eastAsia="宋体" w:hAnsi="Times New Roman" w:cs="Times New Roman" w:hint="eastAsia"/>
-        </w:rPr>
-        <w:t>单人任务设置</w:t>
-      </w:r>
-      <w:r>
-        <w:rPr>
-          <w:rFonts w:ascii="Times New Roman" w:eastAsia="宋体" w:hAnsi="Times New Roman" w:cs="Times New Roman" w:hint="eastAsia"/>
-        </w:rPr>
-        <w:t>-</w:t>
-      </w:r>
-      <w:r>
-        <w:rPr>
-          <w:rFonts w:ascii="Times New Roman" w:eastAsia="宋体" w:hAnsi="Times New Roman" w:cs="Times New Roman" w:hint="eastAsia"/>
-        </w:rPr>
-        <w:t>幻影伪装树木可以使用绘制随机树木窗口进行选择</w:t>
-      </w:r>
-    </w:p>
-    <w:p>
-      <w:pPr>
-        <w:pStyle w:val="a9"/>
-        <w:numPr>
-          <w:ilvl w:val="0"/>
-          <w:numId w:val="50"/>
-        </w:numPr>
-        <w:rPr>
-          <w:rFonts w:ascii="Times New Roman" w:eastAsia="宋体" w:hAnsi="Times New Roman" w:cs="Times New Roman"/>
-        </w:rPr>
-      </w:pPr>
-      <w:r>
-        <w:rPr>
-          <w:rFonts w:ascii="Times New Roman" w:eastAsia="宋体" w:hAnsi="Times New Roman" w:cs="Times New Roman" w:hint="eastAsia"/>
-        </w:rPr>
-        <w:t>放置高架桥头时，可以显示辅助参考线</w:t>
-      </w:r>
-    </w:p>
-    <w:p>
-      <w:pPr>
-        <w:pStyle w:val="a9"/>
-        <w:numPr>
-          <w:ilvl w:val="0"/>
-          <w:numId w:val="50"/>
-        </w:numPr>
-        <w:rPr>
-          <w:rFonts w:ascii="Times New Roman" w:eastAsia="宋体" w:hAnsi="Times New Roman" w:cs="Times New Roman"/>
-        </w:rPr>
-      </w:pPr>
-      <w:r>
-        <w:rPr>
-          <w:rFonts w:ascii="Times New Roman" w:eastAsia="宋体" w:hAnsi="Times New Roman" w:cs="Times New Roman" w:hint="eastAsia"/>
-        </w:rPr>
-        <w:t>为触发编辑器检查下级触发是否是自身添加开关，详见</w:t>
-      </w:r>
-      <w:r>
-        <w:rPr>
-          <w:rFonts w:ascii="Times New Roman" w:eastAsia="宋体" w:hAnsi="Times New Roman" w:cs="Times New Roman" w:hint="eastAsia"/>
-        </w:rPr>
-        <w:t>AttachedTriggerIsSelfCheck</w:t>
-      </w:r>
-    </w:p>
-    <w:p>
-      <w:pPr>
-        <w:pStyle w:val="a9"/>
-        <w:numPr>
-          <w:ilvl w:val="0"/>
-          <w:numId w:val="50"/>
-        </w:numPr>
-        <w:rPr>
-          <w:rFonts w:ascii="Times New Roman" w:eastAsia="宋体" w:hAnsi="Times New Roman" w:cs="Times New Roman"/>
-        </w:rPr>
-      </w:pPr>
-      <w:r>
-        <w:rPr>
-          <w:rFonts w:ascii="Times New Roman" w:eastAsia="宋体" w:hAnsi="Times New Roman" w:cs="Times New Roman" w:hint="eastAsia"/>
-        </w:rPr>
-        <w:t>修复遭遇战地图预览渲染时没有正确标记高架桥的</w:t>
-      </w:r>
-      <w:r>
-        <w:rPr>
-          <w:rFonts w:ascii="Times New Roman" w:eastAsia="宋体" w:hAnsi="Times New Roman" w:cs="Times New Roman" w:hint="eastAsia"/>
-        </w:rPr>
-        <w:t>bug</w:t>
-      </w:r>
-    </w:p>
-    <w:p>
-      <w:pPr>
-        <w:pStyle w:val="a9"/>
-        <w:numPr>
-          <w:ilvl w:val="0"/>
-          <w:numId w:val="50"/>
-        </w:numPr>
-        <w:rPr>
-          <w:rFonts w:ascii="Times New Roman" w:eastAsia="宋体" w:hAnsi="Times New Roman" w:cs="Times New Roman"/>
-        </w:rPr>
-      </w:pPr>
-      <w:r>
-        <w:rPr>
-          <w:rFonts w:ascii="Times New Roman" w:eastAsia="宋体" w:hAnsi="Times New Roman" w:cs="Times New Roman" w:hint="eastAsia"/>
-        </w:rPr>
-        <w:t>为</w:t>
-      </w:r>
-      <w:r>
-        <w:rPr>
-          <w:rFonts w:ascii="Times New Roman" w:eastAsia="宋体" w:hAnsi="Times New Roman" w:cs="Times New Roman" w:hint="eastAsia"/>
-        </w:rPr>
-        <w:t>Lua</w:t>
-      </w:r>
-      <w:r>
-        <w:rPr>
-          <w:rFonts w:ascii="Times New Roman" w:eastAsia="宋体" w:hAnsi="Times New Roman" w:cs="Times New Roman" w:hint="eastAsia"/>
-        </w:rPr>
-        <w:t>脚本终端添加安全检查，会在执行前静态检查高危操作，详见</w:t>
-      </w:r>
-      <w:r>
-        <w:rPr>
-          <w:rFonts w:ascii="Times New Roman" w:eastAsia="宋体" w:hAnsi="Times New Roman" w:cs="Times New Roman" w:hint="eastAsia"/>
-        </w:rPr>
-        <w:t>DisableLuaConsoleSafetyCheck</w:t>
-      </w:r>
-    </w:p>
-    <w:p>
-      <w:pPr>
-        <w:pStyle w:val="a9"/>
-        <w:numPr>
-          <w:ilvl w:val="0"/>
-          <w:numId w:val="50"/>
-        </w:numPr>
-        <w:rPr>
-          <w:rFonts w:ascii="Times New Roman" w:eastAsia="宋体" w:hAnsi="Times New Roman" w:cs="Times New Roman"/>
-        </w:rPr>
-      </w:pPr>
-      <w:r>
-        <w:rPr>
-          <w:rFonts w:ascii="Times New Roman" w:eastAsia="宋体" w:hAnsi="Times New Roman" w:cs="Times New Roman" w:hint="eastAsia"/>
-        </w:rPr>
-        <w:t>可以在地图视图内按方向键调节视角，同时按住</w:t>
-      </w:r>
-      <w:r>
-        <w:rPr>
-          <w:rFonts w:ascii="Times New Roman" w:eastAsia="宋体" w:hAnsi="Times New Roman" w:cs="Times New Roman" w:hint="eastAsia"/>
-        </w:rPr>
-        <w:t>ctrl</w:t>
-      </w:r>
-      <w:r>
-        <w:rPr>
-          <w:rFonts w:ascii="Times New Roman" w:eastAsia="宋体" w:hAnsi="Times New Roman" w:cs="Times New Roman" w:hint="eastAsia"/>
-        </w:rPr>
-        <w:t>键加速移动</w:t>
-      </w:r>
-    </w:p>
-    <w:p>
-      <w:pPr>
-        <w:pStyle w:val="a9"/>
-        <w:numPr>
-          <w:ilvl w:val="0"/>
-          <w:numId w:val="50"/>
-        </w:numPr>
-        <w:rPr>
-          <w:rFonts w:ascii="Times New Roman" w:eastAsia="宋体" w:hAnsi="Times New Roman" w:cs="Times New Roman"/>
-        </w:rPr>
-      </w:pPr>
-      <w:r>
-        <w:rPr>
-          <w:rFonts w:ascii="Times New Roman" w:eastAsia="宋体" w:hAnsi="Times New Roman" w:cs="Times New Roman" w:hint="eastAsia"/>
-        </w:rPr>
-        <w:t>修复部分遭遇战地图所属方选项重复的</w:t>
-      </w:r>
-      <w:r>
-        <w:rPr>
-          <w:rFonts w:ascii="Times New Roman" w:eastAsia="宋体" w:hAnsi="Times New Roman" w:cs="Times New Roman" w:hint="eastAsia"/>
-        </w:rPr>
-        <w:t>bug</w:t>
-      </w:r>
-    </w:p>
-    <w:p>
-      <w:pPr>
-        <w:pStyle w:val="a9"/>
-        <w:numPr>
-          <w:ilvl w:val="0"/>
-          <w:numId w:val="50"/>
-        </w:numPr>
-        <w:rPr>
-          <w:rFonts w:ascii="Times New Roman" w:eastAsia="宋体" w:hAnsi="Times New Roman" w:cs="Times New Roman"/>
-        </w:rPr>
-      </w:pPr>
-      <w:r>
-        <w:rPr>
-          <w:rFonts w:ascii="Times New Roman" w:eastAsia="宋体" w:hAnsi="Times New Roman" w:cs="Times New Roman" w:hint="eastAsia"/>
-        </w:rPr>
-        <w:t>重写单位属性对话框，标签支持搜索，所属方可以显示颜色</w:t>
-      </w:r>
-    </w:p>
-    <w:p>
-      <w:pPr>
-        <w:pStyle w:val="a9"/>
-        <w:numPr>
-          <w:ilvl w:val="0"/>
-          <w:numId w:val="50"/>
-        </w:numPr>
-        <w:rPr>
-          <w:rFonts w:ascii="Times New Roman" w:eastAsia="宋体" w:hAnsi="Times New Roman" w:cs="Times New Roman"/>
-        </w:rPr>
-      </w:pPr>
-      <w:r>
-        <w:rPr>
-          <w:rFonts w:ascii="Times New Roman" w:eastAsia="宋体" w:hAnsi="Times New Roman" w:cs="Times New Roman" w:hint="eastAsia"/>
-        </w:rPr>
-        <w:t>支持将</w:t>
-      </w:r>
-      <w:r>
-        <w:rPr>
-          <w:rFonts w:ascii="Times New Roman" w:eastAsia="宋体" w:hAnsi="Times New Roman" w:cs="Times New Roman" w:hint="eastAsia"/>
-        </w:rPr>
-        <w:t>物品浏览器和</w:t>
-      </w:r>
-      <w:r>
-        <w:rPr>
-          <w:rFonts w:ascii="Times New Roman" w:eastAsia="宋体" w:hAnsi="Times New Roman" w:cs="Times New Roman" w:hint="eastAsia"/>
-        </w:rPr>
-        <w:t>地形浏览器作为一个独立窗口显示</w:t>
-      </w:r>
-      <w:r>
-        <w:rPr>
-          <w:rFonts w:ascii="Times New Roman" w:eastAsia="宋体" w:hAnsi="Times New Roman" w:cs="Times New Roman" w:hint="eastAsia"/>
-        </w:rPr>
-        <w:t>，可以调节透明度</w:t>
-      </w:r>
-      <w:r>
-        <w:rPr>
-          <w:rFonts w:ascii="Times New Roman" w:eastAsia="宋体" w:hAnsi="Times New Roman" w:cs="Times New Roman" w:hint="eastAsia"/>
-        </w:rPr>
-        <w:t>，详见</w:t>
-      </w:r>
-      <w:r>
-        <w:rPr>
-          <w:rFonts w:ascii="Times New Roman" w:eastAsia="宋体" w:hAnsi="Times New Roman" w:cs="Times New Roman" w:hint="eastAsia"/>
-        </w:rPr>
-        <w:t>ViewObjectsFloating</w:t>
-      </w:r>
-      <w:r>
-        <w:rPr>
-          <w:rFonts w:ascii="Times New Roman" w:eastAsia="宋体" w:hAnsi="Times New Roman" w:cs="Times New Roman" w:hint="eastAsia"/>
-        </w:rPr>
-        <w:t>和</w:t>
-      </w:r>
-      <w:r>
-        <w:rPr>
-          <w:rFonts w:ascii="Times New Roman" w:eastAsia="宋体" w:hAnsi="Times New Roman" w:cs="Times New Roman" w:hint="eastAsia"/>
-        </w:rPr>
-        <w:t>TileSetBrowserFloating</w:t>
-      </w:r>
-    </w:p>
-    <w:p>
-      <w:pPr>
-        <w:pStyle w:val="a9"/>
-        <w:numPr>
-          <w:ilvl w:val="0"/>
-          <w:numId w:val="50"/>
-        </w:numPr>
-        <w:rPr>
-          <w:rFonts w:ascii="Times New Roman" w:eastAsia="宋体" w:hAnsi="Times New Roman" w:cs="Times New Roman"/>
-        </w:rPr>
-      </w:pPr>
-      <w:r>
-        <w:rPr>
-          <w:rFonts w:ascii="Times New Roman" w:eastAsia="宋体" w:hAnsi="Times New Roman" w:cs="Times New Roman" w:hint="eastAsia"/>
-        </w:rPr>
-        <w:t>绝大多数窗口可以调节透明度</w:t>
-      </w:r>
-    </w:p>
-    <w:p>
-      <w:pPr>
-        <w:pStyle w:val="a9"/>
-        <w:numPr>
-          <w:ilvl w:val="0"/>
-          <w:numId w:val="50"/>
-        </w:numPr>
-        <w:rPr>
-          <w:rFonts w:ascii="Times New Roman" w:eastAsia="宋体" w:hAnsi="Times New Roman" w:cs="Times New Roman"/>
-        </w:rPr>
-      </w:pPr>
-      <w:r>
-        <w:rPr>
-          <w:rFonts w:ascii="Times New Roman" w:eastAsia="宋体" w:hAnsi="Times New Roman" w:cs="Times New Roman" w:hint="eastAsia"/>
-        </w:rPr>
-        <w:t>修复部分情况下按工具栏擦除覆盖物等按钮不生效的</w:t>
-      </w:r>
-      <w:r>
-        <w:rPr>
-          <w:rFonts w:ascii="Times New Roman" w:eastAsia="宋体" w:hAnsi="Times New Roman" w:cs="Times New Roman" w:hint="eastAsia"/>
-        </w:rPr>
-        <w:t>bug</w:t>
-      </w:r>
-    </w:p>
-    <w:p>
-      <w:pPr>
-        <w:pStyle w:val="a9"/>
-        <w:numPr>
-          <w:ilvl w:val="0"/>
-          <w:numId w:val="50"/>
-        </w:numPr>
-        <w:rPr>
-          <w:rFonts w:ascii="Times New Roman" w:eastAsia="宋体" w:hAnsi="Times New Roman" w:cs="Times New Roman"/>
-        </w:rPr>
-      </w:pPr>
-      <w:r>
-        <w:rPr>
-          <w:rFonts w:ascii="Times New Roman" w:eastAsia="宋体" w:hAnsi="Times New Roman" w:cs="Times New Roman" w:hint="eastAsia"/>
-        </w:rPr>
-        <w:t>修复暗色模式下非主程序菜单的背景色被错误填充的</w:t>
-      </w:r>
-      <w:r>
-        <w:rPr>
-          <w:rFonts w:ascii="Times New Roman" w:eastAsia="宋体" w:hAnsi="Times New Roman" w:cs="Times New Roman" w:hint="eastAsia"/>
-        </w:rPr>
-        <w:t>bug</w:t>
-      </w:r>
-    </w:p>
-    <w:p>
-      <w:pPr>
-        <w:pStyle w:val="a9"/>
-        <w:numPr>
-          <w:ilvl w:val="0"/>
-          <w:numId w:val="50"/>
-        </w:numPr>
-        <w:rPr>
-          <w:rFonts w:ascii="Times New Roman" w:eastAsia="宋体" w:hAnsi="Times New Roman" w:cs="Times New Roman"/>
-        </w:rPr>
-      </w:pPr>
-      <w:r>
-        <w:rPr>
-          <w:rFonts w:ascii="Times New Roman" w:eastAsia="宋体" w:hAnsi="Times New Roman" w:cs="Times New Roman" w:hint="eastAsia"/>
-        </w:rPr>
-        <w:t>为触发编辑器、</w:t>
-      </w:r>
-      <w:r>
-        <w:rPr>
-          <w:rFonts w:ascii="Times New Roman" w:eastAsia="宋体" w:hAnsi="Times New Roman" w:cs="Times New Roman" w:hint="eastAsia"/>
-        </w:rPr>
-        <w:t>AI</w:t>
-      </w:r>
-      <w:r>
-        <w:rPr>
-          <w:rFonts w:ascii="Times New Roman" w:eastAsia="宋体" w:hAnsi="Times New Roman" w:cs="Times New Roman" w:hint="eastAsia"/>
-        </w:rPr>
-        <w:t>触发编辑器增加跳转按钮，可以跳转到参数对应的路径点、小队等位置</w:t>
-      </w:r>
-    </w:p>
-    <w:p>
-      <w:pPr>
-        <w:pStyle w:val="a9"/>
-        <w:numPr>
-          <w:ilvl w:val="0"/>
-          <w:numId w:val="50"/>
-        </w:numPr>
-        <w:rPr>
-          <w:rFonts w:ascii="Times New Roman" w:eastAsia="宋体" w:hAnsi="Times New Roman" w:cs="Times New Roman"/>
-        </w:rPr>
-      </w:pPr>
-      <w:r>
-        <w:rPr>
-          <w:rFonts w:ascii="Times New Roman" w:eastAsia="宋体" w:hAnsi="Times New Roman" w:cs="Times New Roman" w:hint="eastAsia"/>
-        </w:rPr>
-        <w:t>受损火焰能正确被其他单位遮挡</w:t>
-      </w:r>
-      <w:r>
-        <w:rPr>
-          <w:rFonts w:ascii="Times New Roman" w:eastAsia="宋体" w:hAnsi="Times New Roman" w:cs="Times New Roman" w:hint="eastAsia"/>
-        </w:rPr>
-        <w:t>，可以读取</w:t>
-      </w:r>
-      <w:r>
-        <w:rPr>
-          <w:rFonts w:ascii="Times New Roman" w:eastAsia="宋体" w:hAnsi="Times New Roman" w:cs="Times New Roman" w:hint="eastAsia"/>
-        </w:rPr>
-        <w:t>Next=</w:t>
-      </w:r>
-      <w:r>
-        <w:rPr>
-          <w:rFonts w:ascii="Times New Roman" w:eastAsia="宋体" w:hAnsi="Times New Roman" w:cs="Times New Roman" w:hint="eastAsia"/>
-        </w:rPr>
-        <w:t>最终的</w:t>
-      </w:r>
-      <w:r>
-        <w:rPr>
-          <w:rFonts w:ascii="Times New Roman" w:eastAsia="宋体" w:hAnsi="Times New Roman" w:cs="Times New Roman" w:hint="eastAsia"/>
-        </w:rPr>
-        <w:t>图像</w:t>
-      </w:r>
-    </w:p>
-    <w:p>
-      <w:pPr>
-        <w:pStyle w:val="a9"/>
-        <w:numPr>
-          <w:ilvl w:val="0"/>
-          <w:numId w:val="50"/>
-        </w:numPr>
-        <w:rPr>
-          <w:rFonts w:ascii="Times New Roman" w:eastAsia="宋体" w:hAnsi="Times New Roman" w:cs="Times New Roman"/>
-        </w:rPr>
-      </w:pPr>
-      <w:r>
-        <w:rPr>
-          <w:rFonts w:ascii="Times New Roman" w:eastAsia="宋体" w:hAnsi="Times New Roman" w:cs="Times New Roman" w:hint="eastAsia"/>
-        </w:rPr>
-        <w:t>抬升、降低、平坦地表工具增加顶点模式，切换后可以直接修改顶点高度，</w:t>
-      </w:r>
-      <w:r>
-        <w:rPr>
-          <w:rFonts w:ascii="Times New Roman" w:eastAsia="宋体" w:hAnsi="Times New Roman" w:cs="Times New Roman" w:hint="eastAsia"/>
-        </w:rPr>
-        <w:lastRenderedPageBreak/>
-        <w:t>生成更精细的斜坡</w:t>
+        <w:t>抬升、降低、平坦地表工具增加顶点模式，切换后可以直接修改顶点高度，生成更精细的斜坡</w:t>
       </w:r>
     </w:p>
     <w:p>
@@ -3058,6 +3070,7 @@
         <w:rPr>
           <w:rFonts w:ascii="Times New Roman" w:eastAsia="宋体" w:hAnsi="Times New Roman" w:cs="Times New Roman" w:hint="eastAsia"/>
         </w:rPr>
+        <w:lastRenderedPageBreak/>
         <w:t>修复在老系统上展开下拉菜单使用滚轮时，会错误触发文本框选择切换的</w:t>
       </w:r>
       <w:r>
@@ -3082,7 +3095,6 @@
         <w:rPr>
           <w:rFonts w:ascii="Times New Roman" w:eastAsia="宋体" w:hAnsi="Times New Roman" w:cs="Times New Roman" w:hint="eastAsia"/>
         </w:rPr>
-        <w:lastRenderedPageBreak/>
         <w:t>修复</w:t>
       </w:r>
       <w:r>
@@ -3974,6 +3986,7 @@
         <w:rPr>
           <w:rFonts w:ascii="Times New Roman" w:eastAsia="宋体" w:hAnsi="Times New Roman" w:cs="Times New Roman" w:hint="eastAsia"/>
         </w:rPr>
+        <w:lastRenderedPageBreak/>
         <w:t>可以记忆地形浏览器的大小</w:t>
       </w:r>
     </w:p>
@@ -3992,7 +4005,6 @@
         <w:rPr>
           <w:rFonts w:ascii="Times New Roman" w:eastAsia="宋体" w:hAnsi="Times New Roman" w:cs="Times New Roman" w:hint="eastAsia"/>
         </w:rPr>
-        <w:lastRenderedPageBreak/>
         <w:t>地形浏览器、覆盖物浏览器、对象查看器可以按住</w:t>
       </w:r>
       <w:r>
@@ -4901,6 +4913,7 @@
         <w:rPr>
           <w:rFonts w:ascii="Times New Roman" w:eastAsia="宋体" w:hAnsi="Times New Roman" w:cs="Times New Roman" w:hint="eastAsia"/>
         </w:rPr>
+        <w:lastRenderedPageBreak/>
         <w:t>AI</w:t>
       </w:r>
       <w:r>
@@ -4931,7 +4944,6 @@
         <w:rPr>
           <w:rFonts w:ascii="Times New Roman" w:eastAsia="宋体" w:hAnsi="Times New Roman" w:cs="Times New Roman" w:hint="eastAsia"/>
         </w:rPr>
-        <w:lastRenderedPageBreak/>
         <w:t>修复通用格式刷同时应用于多种不同对象时，</w:t>
       </w:r>
       <w:r>
@@ -5786,6 +5798,7 @@
         <w:rPr>
           <w:rFonts w:ascii="Times New Roman" w:eastAsia="宋体" w:hAnsi="Times New Roman" w:cs="Times New Roman" w:hint="eastAsia"/>
         </w:rPr>
+        <w:lastRenderedPageBreak/>
         <w:t>修复导入已存在的地图对话框中三个导入选项不正常的</w:t>
       </w:r>
       <w:r>
@@ -5810,7 +5823,6 @@
         <w:rPr>
           <w:rFonts w:ascii="Times New Roman" w:eastAsia="宋体" w:hAnsi="Times New Roman" w:cs="Times New Roman" w:hint="eastAsia"/>
         </w:rPr>
-        <w:lastRenderedPageBreak/>
         <w:t>地图工具</w:t>
       </w:r>
       <w:r>
@@ -6864,6 +6876,7 @@
         <w:rPr>
           <w:rFonts w:ascii="Times New Roman" w:eastAsia="宋体" w:hAnsi="Times New Roman" w:cs="Times New Roman" w:hint="eastAsia"/>
         </w:rPr>
+        <w:lastRenderedPageBreak/>
         <w:t>支持自定义气候类型的</w:t>
       </w:r>
       <w:r>
@@ -6904,7 +6917,6 @@
           <w:kern w:val="0"/>
           <w14:ligatures w14:val="none"/>
         </w:rPr>
-        <w:lastRenderedPageBreak/>
         <w:t>科技类型、</w:t>
       </w:r>
       <w:r>
@@ -8047,6 +8059,7 @@
         <w:rPr>
           <w:rFonts w:ascii="Times New Roman" w:eastAsia="宋体" w:hAnsi="Times New Roman" w:cs="Times New Roman" w:hint="eastAsia"/>
         </w:rPr>
+        <w:lastRenderedPageBreak/>
         <w:t>修复当显示缺省图像开启时，对没有影子帧的单位显示缺省阴影的</w:t>
       </w:r>
       <w:r>
@@ -8071,7 +8084,6 @@
         <w:rPr>
           <w:rFonts w:ascii="Times New Roman" w:eastAsia="宋体" w:hAnsi="Times New Roman" w:cs="Times New Roman" w:hint="eastAsia"/>
         </w:rPr>
-        <w:lastRenderedPageBreak/>
         <w:t>支持读取</w:t>
       </w:r>
       <w:r>
@@ -9068,6 +9080,7 @@
         <w:rPr>
           <w:rFonts w:ascii="Times New Roman" w:eastAsia="宋体" w:hAnsi="Times New Roman" w:cs="Times New Roman" w:hint="eastAsia"/>
         </w:rPr>
+        <w:lastRenderedPageBreak/>
         <w:t>支持车辆单位的额外炮塔和额外炮管</w:t>
       </w:r>
     </w:p>
@@ -9086,7 +9099,6 @@
         <w:rPr>
           <w:rFonts w:ascii="Times New Roman" w:eastAsia="宋体" w:hAnsi="Times New Roman" w:cs="Times New Roman"/>
         </w:rPr>
-        <w:lastRenderedPageBreak/>
         <w:t>I</w:t>
       </w:r>
       <w:r>
@@ -49440,7 +49452,7 @@
         <v:path o:extrusionok="f" gradientshapeok="t" o:connecttype="rect"/>
         <o:lock v:ext="edit" aspectratio="t"/>
       </v:shapetype>
-      <v:shape id="_x0000_i1028" type="#_x0000_t75" style="width:11.55pt;height:11.55pt" o:bullet="t">
+      <v:shape id="_x0000_i1030" type="#_x0000_t75" style="width:11.55pt;height:11.55pt" o:bullet="t">
         <v:imagedata r:id="rId1" o:title="mso9A9A"/>
       </v:shape>
     </w:pict>

</xml_diff>

<commit_message>
support TheaterPalette for tile anims, change phobos version
</commit_message>
<xml_diff>
--- a/Supplementary/文档/FA2SP HDM Edition说明文档.docx
+++ b/Supplementary/文档/FA2SP HDM Edition说明文档.docx
@@ -1001,6 +1001,43 @@
         <w:pStyle w:val="a9"/>
         <w:numPr>
           <w:ilvl w:val="0"/>
+          <w:numId w:val="11"/>
+        </w:numPr>
+        <w:rPr>
+          <w:rFonts w:ascii="Times New Roman" w:eastAsia="宋体" w:hAnsi="Times New Roman" w:cs="Times New Roman"/>
+        </w:rPr>
+      </w:pPr>
+      <w:r>
+        <w:rPr>
+          <w:rFonts w:ascii="Times New Roman" w:eastAsia="宋体" w:hAnsi="Times New Roman" w:cs="Times New Roman" w:hint="eastAsia"/>
+        </w:rPr>
+        <w:lastRenderedPageBreak/>
+        <w:t>支持</w:t>
+      </w:r>
+      <w:r>
+        <w:rPr>
+          <w:rFonts w:ascii="Times New Roman" w:eastAsia="宋体" w:hAnsi="Times New Roman" w:cs="Times New Roman" w:hint="eastAsia"/>
+        </w:rPr>
+        <w:t>Phobos v0.5-alpha</w:t>
+      </w:r>
+      <w:r>
+        <w:rPr>
+          <w:rFonts w:ascii="Times New Roman" w:eastAsia="宋体" w:hAnsi="Times New Roman" w:cs="Times New Roman" w:hint="eastAsia"/>
+        </w:rPr>
+        <w:t>的地形动画</w:t>
+      </w:r>
+      <w:r>
+        <w:rPr>
+          <w:rFonts w:ascii="Times New Roman" w:eastAsia="宋体" w:hAnsi="Times New Roman" w:cs="Times New Roman" w:hint="eastAsia"/>
+        </w:rPr>
+        <w:t>TheaterPalette</w:t>
+      </w:r>
+    </w:p>
+    <w:p>
+      <w:pPr>
+        <w:pStyle w:val="a9"/>
+        <w:numPr>
+          <w:ilvl w:val="0"/>
           <w:numId w:val="10"/>
         </w:numPr>
         <w:rPr>
@@ -1019,7 +1056,6 @@
           <w:sz w:val="28"/>
           <w:szCs w:val="32"/>
         </w:rPr>
-        <w:lastRenderedPageBreak/>
         <w:t>1.</w:t>
       </w:r>
       <w:r>
@@ -2028,7 +2064,14 @@
         <w:rPr>
           <w:rFonts w:ascii="Times New Roman" w:eastAsia="宋体" w:hAnsi="Times New Roman" w:cs="Times New Roman" w:hint="eastAsia"/>
         </w:rPr>
-        <w:t>，详见</w:t>
+        <w:t>，</w:t>
+      </w:r>
+      <w:r>
+        <w:rPr>
+          <w:rFonts w:ascii="Times New Roman" w:eastAsia="宋体" w:hAnsi="Times New Roman" w:cs="Times New Roman" w:hint="eastAsia"/>
+        </w:rPr>
+        <w:lastRenderedPageBreak/>
+        <w:t>详见</w:t>
       </w:r>
       <w:r>
         <w:rPr>
@@ -2064,7 +2107,6 @@
         <w:rPr>
           <w:rFonts w:ascii="Times New Roman" w:eastAsia="宋体" w:hAnsi="Times New Roman" w:cs="Times New Roman" w:hint="eastAsia"/>
         </w:rPr>
-        <w:lastRenderedPageBreak/>
         <w:t>绝大多数窗口可以调节透明度</w:t>
       </w:r>
     </w:p>
@@ -3003,7 +3045,14 @@
         <w:rPr>
           <w:rFonts w:ascii="Times New Roman" w:eastAsia="宋体" w:hAnsi="Times New Roman" w:cs="Times New Roman" w:hint="eastAsia"/>
         </w:rPr>
-        <w:t>，可以让地形浏览器的图像排列更加紧凑</w:t>
+        <w:t>，可以让地形浏览器的图像排列更加</w:t>
+      </w:r>
+      <w:r>
+        <w:rPr>
+          <w:rFonts w:ascii="Times New Roman" w:eastAsia="宋体" w:hAnsi="Times New Roman" w:cs="Times New Roman" w:hint="eastAsia"/>
+        </w:rPr>
+        <w:lastRenderedPageBreak/>
+        <w:t>紧凑</w:t>
       </w:r>
     </w:p>
     <w:p>
@@ -3021,7 +3070,6 @@
         <w:rPr>
           <w:rFonts w:ascii="Times New Roman" w:eastAsia="宋体" w:hAnsi="Times New Roman" w:cs="Times New Roman" w:hint="eastAsia"/>
         </w:rPr>
-        <w:lastRenderedPageBreak/>
         <w:t>修复对象查看器无法按名称搜索覆盖物的</w:t>
       </w:r>
       <w:r>
@@ -3988,6 +4036,7 @@
         <w:rPr>
           <w:rFonts w:ascii="Times New Roman" w:eastAsia="宋体" w:hAnsi="Times New Roman" w:cs="Times New Roman" w:hint="eastAsia"/>
         </w:rPr>
+        <w:lastRenderedPageBreak/>
         <w:t>地图注释新增放置线段、箭头、圆功能，可以保存在地图内</w:t>
       </w:r>
     </w:p>
@@ -4006,7 +4055,6 @@
         <w:rPr>
           <w:rFonts w:ascii="Times New Roman" w:eastAsia="宋体" w:hAnsi="Times New Roman" w:cs="Times New Roman" w:hint="eastAsia"/>
         </w:rPr>
-        <w:lastRenderedPageBreak/>
         <w:t>修复触发编辑器在修改触发名称时可能会导致触发列表产生重复的</w:t>
       </w:r>
       <w:r>
@@ -4924,6 +4972,7 @@
         <w:rPr>
           <w:rFonts w:ascii="Times New Roman" w:eastAsia="宋体" w:hAnsi="Times New Roman" w:cs="Times New Roman" w:hint="eastAsia"/>
         </w:rPr>
+        <w:lastRenderedPageBreak/>
         <w:t>修复部分情况下随机放置对象不显示图标的</w:t>
       </w:r>
       <w:r>
@@ -4948,7 +4997,6 @@
         <w:rPr>
           <w:rFonts w:ascii="Times New Roman" w:eastAsia="宋体" w:hAnsi="Times New Roman" w:cs="Times New Roman" w:hint="eastAsia"/>
         </w:rPr>
-        <w:lastRenderedPageBreak/>
         <w:t>为所属方窗口补充缺失的翻译</w:t>
       </w:r>
     </w:p>
@@ -49756,7 +49804,7 @@
         <v:path o:extrusionok="f" gradientshapeok="t" o:connecttype="rect"/>
         <o:lock v:ext="edit" aspectratio="t"/>
       </v:shapetype>
-      <v:shape id="_x0000_i1031" type="#_x0000_t75" style="width:11.55pt;height:11.55pt" o:bullet="t">
+      <v:shape id="_x0000_i1033" type="#_x0000_t75" style="width:11.55pt;height:11.55pt" o:bullet="t">
         <v:imagedata r:id="rId1" o:title="mso9A9A"/>
       </v:shape>
     </w:pict>

</xml_diff>

<commit_message>
add phobos v0.5-alpha actions & scripts
</commit_message>
<xml_diff>
--- a/Supplementary/文档/FA2SP HDM Edition说明文档.docx
+++ b/Supplementary/文档/FA2SP HDM Edition说明文档.docx
@@ -1032,6 +1032,42 @@
         </w:rPr>
         <w:t>TheaterPalette</w:t>
       </w:r>
+      <w:r>
+        <w:rPr>
+          <w:rFonts w:ascii="Times New Roman" w:eastAsia="宋体" w:hAnsi="Times New Roman" w:cs="Times New Roman" w:hint="eastAsia"/>
+        </w:rPr>
+        <w:t>、触发行为</w:t>
+      </w:r>
+      <w:r>
+        <w:rPr>
+          <w:rFonts w:ascii="Times New Roman" w:eastAsia="宋体" w:hAnsi="Times New Roman" w:cs="Times New Roman" w:hint="eastAsia"/>
+        </w:rPr>
+        <w:t>600</w:t>
+      </w:r>
+      <w:r>
+        <w:rPr>
+          <w:rFonts w:ascii="Times New Roman" w:eastAsia="宋体" w:hAnsi="Times New Roman" w:cs="Times New Roman" w:hint="eastAsia"/>
+        </w:rPr>
+        <w:t>、触发行为</w:t>
+      </w:r>
+      <w:r>
+        <w:rPr>
+          <w:rFonts w:ascii="Times New Roman" w:eastAsia="宋体" w:hAnsi="Times New Roman" w:cs="Times New Roman" w:hint="eastAsia"/>
+        </w:rPr>
+        <w:t>611</w:t>
+      </w:r>
+      <w:r>
+        <w:rPr>
+          <w:rFonts w:ascii="Times New Roman" w:eastAsia="宋体" w:hAnsi="Times New Roman" w:cs="Times New Roman" w:hint="eastAsia"/>
+        </w:rPr>
+        <w:t>、动作脚本</w:t>
+      </w:r>
+      <w:r>
+        <w:rPr>
+          <w:rFonts w:ascii="Times New Roman" w:eastAsia="宋体" w:hAnsi="Times New Roman" w:cs="Times New Roman" w:hint="eastAsia"/>
+        </w:rPr>
+        <w:t>24</w:t>
+      </w:r>
     </w:p>
     <w:p>
       <w:pPr>
@@ -2040,6 +2076,7 @@
         <w:rPr>
           <w:rFonts w:ascii="Times New Roman" w:eastAsia="宋体" w:hAnsi="Times New Roman" w:cs="Times New Roman" w:hint="eastAsia"/>
         </w:rPr>
+        <w:lastRenderedPageBreak/>
         <w:t>支持将</w:t>
       </w:r>
       <w:r>
@@ -2064,14 +2101,7 @@
         <w:rPr>
           <w:rFonts w:ascii="Times New Roman" w:eastAsia="宋体" w:hAnsi="Times New Roman" w:cs="Times New Roman" w:hint="eastAsia"/>
         </w:rPr>
-        <w:t>，</w:t>
-      </w:r>
-      <w:r>
-        <w:rPr>
-          <w:rFonts w:ascii="Times New Roman" w:eastAsia="宋体" w:hAnsi="Times New Roman" w:cs="Times New Roman" w:hint="eastAsia"/>
-        </w:rPr>
-        <w:lastRenderedPageBreak/>
-        <w:t>详见</w:t>
+        <w:t>，详见</w:t>
       </w:r>
       <w:r>
         <w:rPr>
@@ -3033,6 +3063,7 @@
         <w:rPr>
           <w:rFonts w:ascii="Times New Roman" w:eastAsia="宋体" w:hAnsi="Times New Roman" w:cs="Times New Roman" w:hint="eastAsia"/>
         </w:rPr>
+        <w:lastRenderedPageBreak/>
         <w:t>新增</w:t>
       </w:r>
       <w:r>
@@ -3045,14 +3076,7 @@
         <w:rPr>
           <w:rFonts w:ascii="Times New Roman" w:eastAsia="宋体" w:hAnsi="Times New Roman" w:cs="Times New Roman" w:hint="eastAsia"/>
         </w:rPr>
-        <w:t>，可以让地形浏览器的图像排列更加</w:t>
-      </w:r>
-      <w:r>
-        <w:rPr>
-          <w:rFonts w:ascii="Times New Roman" w:eastAsia="宋体" w:hAnsi="Times New Roman" w:cs="Times New Roman" w:hint="eastAsia"/>
-        </w:rPr>
-        <w:lastRenderedPageBreak/>
-        <w:t>紧凑</w:t>
+        <w:t>，可以让地形浏览器的图像排列更加紧凑</w:t>
       </w:r>
     </w:p>
     <w:p>
@@ -4018,6 +4042,7 @@
         <w:rPr>
           <w:rFonts w:ascii="Times New Roman" w:eastAsia="宋体" w:hAnsi="Times New Roman" w:cs="Times New Roman" w:hint="eastAsia"/>
         </w:rPr>
+        <w:lastRenderedPageBreak/>
         <w:t>距离工具箱新增放置自由圆，可以自定义半径</w:t>
       </w:r>
     </w:p>
@@ -4036,7 +4061,6 @@
         <w:rPr>
           <w:rFonts w:ascii="Times New Roman" w:eastAsia="宋体" w:hAnsi="Times New Roman" w:cs="Times New Roman" w:hint="eastAsia"/>
         </w:rPr>
-        <w:lastRenderedPageBreak/>
         <w:t>地图注释新增放置线段、箭头、圆功能，可以保存在地图内</w:t>
       </w:r>
     </w:p>
@@ -4954,6 +4978,7 @@
         <w:rPr>
           <w:rFonts w:ascii="Times New Roman" w:eastAsia="宋体" w:hAnsi="Times New Roman" w:cs="Times New Roman" w:hint="eastAsia"/>
         </w:rPr>
+        <w:lastRenderedPageBreak/>
         <w:t>优化覆盖物加载策略，即使素材文件内部标记有误，也会加载前一半图像</w:t>
       </w:r>
     </w:p>
@@ -4972,7 +4997,6 @@
         <w:rPr>
           <w:rFonts w:ascii="Times New Roman" w:eastAsia="宋体" w:hAnsi="Times New Roman" w:cs="Times New Roman" w:hint="eastAsia"/>
         </w:rPr>
-        <w:lastRenderedPageBreak/>
         <w:t>修复部分情况下随机放置对象不显示图标的</w:t>
       </w:r>
       <w:r>
@@ -5827,6 +5851,7 @@
         <w:rPr>
           <w:rFonts w:ascii="Times New Roman" w:eastAsia="宋体" w:hAnsi="Times New Roman" w:cs="Times New Roman" w:hint="eastAsia"/>
         </w:rPr>
+        <w:lastRenderedPageBreak/>
         <w:t>修复部分情况下启动地形生成器时崩溃的</w:t>
       </w:r>
       <w:r>
@@ -5859,7 +5884,6 @@
           <w:sz w:val="28"/>
           <w:szCs w:val="32"/>
         </w:rPr>
-        <w:lastRenderedPageBreak/>
         <w:t>1.</w:t>
       </w:r>
       <w:r>
@@ -6935,6 +6959,7 @@
         <w:rPr>
           <w:rFonts w:ascii="Times New Roman" w:eastAsia="宋体" w:hAnsi="Times New Roman" w:cs="Times New Roman" w:hint="eastAsia"/>
         </w:rPr>
+        <w:lastRenderedPageBreak/>
         <w:t>在</w:t>
       </w:r>
       <w:r>
@@ -6977,7 +7002,6 @@
         <w:rPr>
           <w:rFonts w:ascii="Times New Roman" w:eastAsia="宋体" w:hAnsi="Times New Roman" w:cs="Times New Roman" w:hint="eastAsia"/>
         </w:rPr>
-        <w:lastRenderedPageBreak/>
         <w:t>新增</w:t>
       </w:r>
       <w:r>
@@ -8160,6 +8184,7 @@
         <w:rPr>
           <w:rFonts w:ascii="Times New Roman" w:eastAsia="宋体" w:hAnsi="Times New Roman" w:cs="Times New Roman" w:hint="eastAsia"/>
         </w:rPr>
+        <w:lastRenderedPageBreak/>
         <w:t>修复设置路径点颜色失效的</w:t>
       </w:r>
       <w:r>
@@ -8184,7 +8209,6 @@
         <w:rPr>
           <w:rFonts w:ascii="Times New Roman" w:eastAsia="宋体" w:hAnsi="Times New Roman" w:cs="Times New Roman" w:hint="eastAsia"/>
         </w:rPr>
-        <w:lastRenderedPageBreak/>
         <w:t>支持为存在</w:t>
       </w:r>
       <w:r>
@@ -9199,6 +9223,7 @@
         <w:rPr>
           <w:rFonts w:ascii="Times New Roman" w:eastAsia="宋体" w:hAnsi="Times New Roman" w:cs="Times New Roman" w:hint="eastAsia"/>
         </w:rPr>
+        <w:lastRenderedPageBreak/>
         <w:t>作战小队、特遣部队、动作脚本编辑器支持通过拖拽</w:t>
       </w:r>
       <w:r>
@@ -9229,7 +9254,6 @@
         <w:rPr>
           <w:rFonts w:ascii="Times New Roman" w:eastAsia="宋体" w:hAnsi="Times New Roman" w:cs="Times New Roman" w:hint="eastAsia"/>
         </w:rPr>
-        <w:lastRenderedPageBreak/>
         <w:t>修复当地形浏览器位于覆盖物视图时，切换框架模式会导致视图切换至地形的</w:t>
       </w:r>
       <w:r>
@@ -10232,6 +10256,7 @@
         <w:rPr>
           <w:rFonts w:ascii="Times New Roman" w:eastAsia="宋体" w:hAnsi="Times New Roman" w:cs="Times New Roman" w:hint="eastAsia"/>
         </w:rPr>
+        <w:lastRenderedPageBreak/>
         <w:t>放置铁路时，仅在物品浏览器</w:t>
       </w:r>
       <w:r>
@@ -10256,14 +10281,7 @@
         <w:rPr>
           <w:rFonts w:ascii="Times New Roman" w:eastAsia="宋体" w:hAnsi="Times New Roman" w:cs="Times New Roman" w:hint="eastAsia"/>
         </w:rPr>
-        <w:t>铁路下启用铁路逻辑，也就是可以放</w:t>
-      </w:r>
-      <w:r>
-        <w:rPr>
-          <w:rFonts w:ascii="Times New Roman" w:eastAsia="宋体" w:hAnsi="Times New Roman" w:cs="Times New Roman" w:hint="eastAsia"/>
-        </w:rPr>
-        <w:lastRenderedPageBreak/>
-        <w:t>置特定类型的铁路而不会被铁路逻辑纠正了</w:t>
+        <w:t>铁路下启用铁路逻辑，也就是可以放置特定类型的铁路而不会被铁路逻辑纠正了</w:t>
       </w:r>
     </w:p>
     <w:p>
@@ -11311,6 +11329,7 @@
         <w:rPr>
           <w:rFonts w:ascii="Times New Roman" w:eastAsia="宋体" w:hAnsi="Times New Roman" w:cs="Times New Roman" w:hint="eastAsia"/>
         </w:rPr>
+        <w:lastRenderedPageBreak/>
         <w:t>Urb2UbnTileRules</w:t>
       </w:r>
       <w:r>
@@ -11353,14 +11372,7 @@
         <w:rPr>
           <w:rFonts w:ascii="Times New Roman" w:eastAsia="宋体" w:hAnsi="Times New Roman" w:cs="Times New Roman" w:hint="eastAsia"/>
         </w:rPr>
-        <w:t>城市时</w:t>
-      </w:r>
-      <w:r>
-        <w:rPr>
-          <w:rFonts w:ascii="Times New Roman" w:eastAsia="宋体" w:hAnsi="Times New Roman" w:cs="Times New Roman" w:hint="eastAsia"/>
-        </w:rPr>
-        <w:lastRenderedPageBreak/>
-        <w:t>会读取前者的设置</w:t>
+        <w:t>城市时会读取前者的设置</w:t>
       </w:r>
     </w:p>
     <w:p>
@@ -12420,6 +12432,7 @@
         <w:rPr>
           <w:rFonts w:ascii="Times New Roman" w:eastAsia="宋体" w:hAnsi="Times New Roman" w:cs="Times New Roman" w:hint="eastAsia"/>
         </w:rPr>
+        <w:lastRenderedPageBreak/>
         <w:t>支持在</w:t>
       </w:r>
       <w:r>
@@ -12450,7 +12463,6 @@
         <w:rPr>
           <w:rFonts w:ascii="Times New Roman" w:eastAsia="宋体" w:hAnsi="Times New Roman" w:cs="Times New Roman" w:hint="eastAsia"/>
         </w:rPr>
-        <w:lastRenderedPageBreak/>
         <w:t>当编辑已经重叠的建筑时，不再弹出提示窗</w:t>
       </w:r>
     </w:p>
@@ -13467,6 +13479,7 @@
           <w:sz w:val="28"/>
           <w:szCs w:val="32"/>
         </w:rPr>
+        <w:lastRenderedPageBreak/>
         <w:t>1.2.3 (2025.1</w:t>
       </w:r>
       <w:r>
@@ -13525,7 +13538,6 @@
         <w:rPr>
           <w:rFonts w:ascii="Times New Roman" w:eastAsia="宋体" w:hAnsi="Times New Roman" w:cs="Times New Roman" w:hint="eastAsia"/>
         </w:rPr>
-        <w:lastRenderedPageBreak/>
         <w:t>修复加载物不显示阴影的</w:t>
       </w:r>
       <w:r>
@@ -14631,6 +14643,7 @@
           <w:sz w:val="28"/>
           <w:szCs w:val="32"/>
         </w:rPr>
+        <w:lastRenderedPageBreak/>
         <w:t>1.2.</w:t>
       </w:r>
       <w:r>
@@ -14719,7 +14732,6 @@
         <w:rPr>
           <w:rFonts w:ascii="Times New Roman" w:eastAsia="宋体" w:hAnsi="Times New Roman" w:cs="Times New Roman" w:hint="eastAsia"/>
         </w:rPr>
-        <w:lastRenderedPageBreak/>
         <w:t>支持</w:t>
       </w:r>
       <w:r>
@@ -15716,6 +15728,7 @@
         <w:rPr>
           <w:rFonts w:ascii="Times New Roman" w:eastAsia="宋体" w:hAnsi="Times New Roman" w:cs="Times New Roman" w:hint="eastAsia"/>
         </w:rPr>
+        <w:lastRenderedPageBreak/>
         <w:t>修复</w:t>
       </w:r>
       <w:r>
@@ -15760,7 +15773,6 @@
           <w:sz w:val="28"/>
           <w:szCs w:val="32"/>
         </w:rPr>
-        <w:lastRenderedPageBreak/>
         <w:t>1.1.9 (2025.0</w:t>
       </w:r>
       <w:r>
@@ -16819,6 +16831,7 @@
         <w:rPr>
           <w:rFonts w:ascii="Times New Roman" w:eastAsia="宋体" w:hAnsi="Times New Roman" w:cs="Times New Roman" w:hint="eastAsia"/>
         </w:rPr>
+        <w:lastRenderedPageBreak/>
         <w:t>优化绘图性能</w:t>
       </w:r>
     </w:p>
@@ -16837,7 +16850,6 @@
         <w:rPr>
           <w:rFonts w:ascii="Times New Roman" w:eastAsia="宋体" w:hAnsi="Times New Roman" w:cs="Times New Roman" w:hint="eastAsia"/>
         </w:rPr>
-        <w:lastRenderedPageBreak/>
         <w:t>重写</w:t>
       </w:r>
       <w:r>
@@ -17894,6 +17906,7 @@
         <w:rPr>
           <w:rFonts w:ascii="Times New Roman" w:eastAsia="宋体" w:hAnsi="Times New Roman" w:cs="Times New Roman" w:hint="eastAsia"/>
         </w:rPr>
+        <w:lastRenderedPageBreak/>
         <w:t>开启</w:t>
       </w:r>
       <w:r>
@@ -17924,7 +17937,6 @@
         <w:rPr>
           <w:rFonts w:ascii="Times New Roman" w:eastAsia="宋体" w:hAnsi="Times New Roman" w:cs="Times New Roman" w:hint="eastAsia"/>
         </w:rPr>
-        <w:lastRenderedPageBreak/>
         <w:t>更改所属方支持笔刷操作</w:t>
       </w:r>
     </w:p>
@@ -18971,6 +18983,7 @@
         <w:rPr>
           <w:rFonts w:ascii="Times New Roman" w:eastAsia="宋体" w:hAnsi="Times New Roman" w:cs="Times New Roman" w:hint="eastAsia"/>
         </w:rPr>
+        <w:lastRenderedPageBreak/>
         <w:t>当</w:t>
       </w:r>
       <w:r>
@@ -19001,7 +19014,6 @@
         <w:rPr>
           <w:rFonts w:ascii="Times New Roman" w:eastAsia="宋体" w:hAnsi="Times New Roman" w:cs="Times New Roman" w:hint="eastAsia"/>
         </w:rPr>
-        <w:lastRenderedPageBreak/>
         <w:t>修复了当</w:t>
       </w:r>
       <w:r>
@@ -19974,6 +19986,7 @@
         <w:rPr>
           <w:rFonts w:ascii="Times New Roman" w:eastAsia="宋体" w:hAnsi="Times New Roman" w:cs="Times New Roman" w:hint="eastAsia"/>
         </w:rPr>
+        <w:lastRenderedPageBreak/>
         <w:t>支持绘图界面缩放</w:t>
       </w:r>
       <w:r>
@@ -20010,7 +20023,6 @@
         <w:rPr>
           <w:rFonts w:ascii="Times New Roman" w:eastAsia="宋体" w:hAnsi="Times New Roman" w:cs="Times New Roman"/>
         </w:rPr>
-        <w:lastRenderedPageBreak/>
         <w:t>C</w:t>
       </w:r>
       <w:r>
@@ -21053,6 +21065,7 @@
         <w:rPr>
           <w:rFonts w:ascii="Times New Roman" w:eastAsia="宋体" w:hAnsi="Times New Roman" w:cs="Times New Roman" w:hint="eastAsia"/>
         </w:rPr>
+        <w:lastRenderedPageBreak/>
         <w:t>修复高</w:t>
       </w:r>
       <w:r>
@@ -21089,7 +21102,6 @@
         <w:rPr>
           <w:rFonts w:ascii="Times New Roman" w:eastAsia="宋体" w:hAnsi="Times New Roman" w:cs="Times New Roman" w:hint="eastAsia"/>
         </w:rPr>
-        <w:lastRenderedPageBreak/>
         <w:t>支持自定义地图视图背景颜色</w:t>
       </w:r>
     </w:p>
@@ -49804,7 +49816,7 @@
         <v:path o:extrusionok="f" gradientshapeok="t" o:connecttype="rect"/>
         <o:lock v:ext="edit" aspectratio="t"/>
       </v:shapetype>
-      <v:shape id="_x0000_i1033" type="#_x0000_t75" style="width:11.55pt;height:11.55pt" o:bullet="t">
+      <v:shape id="_x0000_i1029" type="#_x0000_t75" style="width:11.55pt;height:11.55pt" o:bullet="t">
         <v:imagedata r:id="rId1" o:title="mso9A9A"/>
       </v:shape>
     </w:pict>

</xml_diff>